<commit_message>
update on 2025-06-22 21:08:41.530856
</commit_message>
<xml_diff>
--- a/py 空间几何.docx
+++ b/py 空间几何.docx
@@ -1193,6 +1193,7 @@
           <w:tcPr>
             <w:tcW w:w="0" w:type="auto"/>
             <w:vMerge w:val="continue"/>
+            <w:tcBorders/>
             <w:vAlign w:val="center"/>
           </w:tcPr>
           <w:p>
@@ -1297,6 +1298,7 @@
           <w:tcPr>
             <w:tcW w:w="0" w:type="auto"/>
             <w:vMerge w:val="continue"/>
+            <w:tcBorders/>
             <w:vAlign w:val="center"/>
           </w:tcPr>
           <w:p>
@@ -1380,6 +1382,7 @@
           <w:tcPr>
             <w:tcW w:w="0" w:type="auto"/>
             <w:vMerge w:val="continue"/>
+            <w:tcBorders/>
             <w:vAlign w:val="center"/>
           </w:tcPr>
           <w:p>
@@ -1438,6 +1441,90 @@
                 <w:lang w:val="en-US" w:eastAsia="zh-CN"/>
               </w:rPr>
               <w:t>调整法向量</w:t>
+            </w:r>
+          </w:p>
+        </w:tc>
+      </w:tr>
+      <w:tr>
+        <w:tblPrEx>
+          <w:tblBorders>
+            <w:top w:val="single" w:color="auto" w:sz="4" w:space="0"/>
+            <w:left w:val="single" w:color="auto" w:sz="4" w:space="0"/>
+            <w:bottom w:val="single" w:color="auto" w:sz="4" w:space="0"/>
+            <w:right w:val="single" w:color="auto" w:sz="4" w:space="0"/>
+            <w:insideH w:val="single" w:color="auto" w:sz="4" w:space="0"/>
+            <w:insideV w:val="single" w:color="auto" w:sz="4" w:space="0"/>
+          </w:tblBorders>
+          <w:tblCellMar>
+            <w:top w:w="0" w:type="dxa"/>
+            <w:left w:w="108" w:type="dxa"/>
+            <w:bottom w:w="0" w:type="dxa"/>
+            <w:right w:w="108" w:type="dxa"/>
+          </w:tblCellMar>
+        </w:tblPrEx>
+        <w:tc>
+          <w:tcPr>
+            <w:tcW w:w="0" w:type="auto"/>
+            <w:vMerge w:val="continue"/>
+            <w:tcBorders/>
+            <w:vAlign w:val="center"/>
+          </w:tcPr>
+          <w:p>
+            <w:pPr>
+              <w:bidi w:val="0"/>
+              <w:jc w:val="both"/>
+              <w:rPr>
+                <w:rFonts w:hint="eastAsia"/>
+                <w:lang w:val="en-US" w:eastAsia="zh-CN"/>
+              </w:rPr>
+            </w:pPr>
+          </w:p>
+        </w:tc>
+        <w:tc>
+          <w:tcPr>
+            <w:tcW w:w="0" w:type="auto"/>
+            <w:vAlign w:val="center"/>
+          </w:tcPr>
+          <w:p>
+            <w:pPr>
+              <w:pStyle w:val="12"/>
+              <w:bidi w:val="0"/>
+              <w:jc w:val="both"/>
+              <w:rPr>
+                <w:rFonts w:hint="default"/>
+                <w:lang w:val="en-US" w:eastAsia="zh-CN"/>
+              </w:rPr>
+            </w:pPr>
+            <w:r>
+              <w:rPr>
+                <w:rFonts w:hint="eastAsia"/>
+                <w:lang w:val="en-US" w:eastAsia="zh-CN"/>
+              </w:rPr>
+              <w:t>paint_uniform_color(rgb)</w:t>
+            </w:r>
+          </w:p>
+        </w:tc>
+        <w:tc>
+          <w:tcPr>
+            <w:tcW w:w="0" w:type="auto"/>
+            <w:vAlign w:val="center"/>
+          </w:tcPr>
+          <w:p>
+            <w:pPr>
+              <w:pStyle w:val="11"/>
+              <w:bidi w:val="0"/>
+              <w:jc w:val="both"/>
+              <w:rPr>
+                <w:rFonts w:hint="eastAsia"/>
+                <w:lang w:val="en-US" w:eastAsia="zh-CN"/>
+              </w:rPr>
+            </w:pPr>
+            <w:r>
+              <w:rPr>
+                <w:rFonts w:hint="eastAsia"/>
+                <w:lang w:val="en-US" w:eastAsia="zh-CN"/>
+              </w:rPr>
+              <w:t>染色</w:t>
             </w:r>
           </w:p>
         </w:tc>
@@ -3144,8 +3231,6 @@
               </w:rPr>
               <w:t>采样点云</w:t>
             </w:r>
-            <w:bookmarkStart w:id="0" w:name="_GoBack"/>
-            <w:bookmarkEnd w:id="0"/>
           </w:p>
         </w:tc>
       </w:tr>

</xml_diff>

<commit_message>
update on 2025-06-30 21:32:52.266607
</commit_message>
<xml_diff>
--- a/py 空间几何.docx
+++ b/py 空间几何.docx
@@ -738,6 +738,8 @@
           <w:lang w:val="en-US" w:eastAsia="zh-CN"/>
         </w:rPr>
       </w:pPr>
+      <w:bookmarkStart w:id="0" w:name="_GoBack"/>
+      <w:bookmarkEnd w:id="0"/>
     </w:p>
     <w:tbl>
       <w:tblPr>
@@ -1525,6 +1527,90 @@
                 <w:lang w:val="en-US" w:eastAsia="zh-CN"/>
               </w:rPr>
               <w:t>染色</w:t>
+            </w:r>
+          </w:p>
+        </w:tc>
+      </w:tr>
+      <w:tr>
+        <w:tblPrEx>
+          <w:tblBorders>
+            <w:top w:val="single" w:color="auto" w:sz="4" w:space="0"/>
+            <w:left w:val="single" w:color="auto" w:sz="4" w:space="0"/>
+            <w:bottom w:val="single" w:color="auto" w:sz="4" w:space="0"/>
+            <w:right w:val="single" w:color="auto" w:sz="4" w:space="0"/>
+            <w:insideH w:val="single" w:color="auto" w:sz="4" w:space="0"/>
+            <w:insideV w:val="single" w:color="auto" w:sz="4" w:space="0"/>
+          </w:tblBorders>
+          <w:tblCellMar>
+            <w:top w:w="0" w:type="dxa"/>
+            <w:left w:w="108" w:type="dxa"/>
+            <w:bottom w:w="0" w:type="dxa"/>
+            <w:right w:w="108" w:type="dxa"/>
+          </w:tblCellMar>
+        </w:tblPrEx>
+        <w:tc>
+          <w:tcPr>
+            <w:tcW w:w="0" w:type="auto"/>
+            <w:vMerge w:val="continue"/>
+            <w:tcBorders/>
+            <w:vAlign w:val="center"/>
+          </w:tcPr>
+          <w:p>
+            <w:pPr>
+              <w:bidi w:val="0"/>
+              <w:jc w:val="both"/>
+              <w:rPr>
+                <w:rFonts w:hint="eastAsia"/>
+                <w:lang w:val="en-US" w:eastAsia="zh-CN"/>
+              </w:rPr>
+            </w:pPr>
+          </w:p>
+        </w:tc>
+        <w:tc>
+          <w:tcPr>
+            <w:tcW w:w="0" w:type="auto"/>
+            <w:vAlign w:val="center"/>
+          </w:tcPr>
+          <w:p>
+            <w:pPr>
+              <w:pStyle w:val="12"/>
+              <w:bidi w:val="0"/>
+              <w:jc w:val="both"/>
+              <w:rPr>
+                <w:rFonts w:hint="default"/>
+                <w:lang w:val="en-US" w:eastAsia="zh-CN"/>
+              </w:rPr>
+            </w:pPr>
+            <w:r>
+              <w:rPr>
+                <w:rFonts w:hint="eastAsia"/>
+                <w:lang w:val="en-US" w:eastAsia="zh-CN"/>
+              </w:rPr>
+              <w:t>compute_convex_hull()</w:t>
+            </w:r>
+          </w:p>
+        </w:tc>
+        <w:tc>
+          <w:tcPr>
+            <w:tcW w:w="0" w:type="auto"/>
+            <w:vAlign w:val="center"/>
+          </w:tcPr>
+          <w:p>
+            <w:pPr>
+              <w:pStyle w:val="11"/>
+              <w:bidi w:val="0"/>
+              <w:jc w:val="both"/>
+              <w:rPr>
+                <w:rFonts w:hint="default"/>
+                <w:lang w:val="en-US" w:eastAsia="zh-CN"/>
+              </w:rPr>
+            </w:pPr>
+            <w:r>
+              <w:rPr>
+                <w:rFonts w:hint="eastAsia"/>
+                <w:lang w:val="en-US" w:eastAsia="zh-CN"/>
+              </w:rPr>
+              <w:t>计算凸包</w:t>
             </w:r>
           </w:p>
         </w:tc>

</xml_diff>

<commit_message>
update on 2025-09-07 16:59:54.186621
</commit_message>
<xml_diff>
--- a/py 空间几何.docx
+++ b/py 空间几何.docx
@@ -314,6 +314,837 @@
       </w:tblPr>
       <w:tblGrid>
         <w:gridCol w:w="1057"/>
+        <w:gridCol w:w="3933"/>
+        <w:gridCol w:w="1478"/>
+      </w:tblGrid>
+      <w:tr>
+        <w:tblPrEx>
+          <w:tblBorders>
+            <w:top w:val="single" w:color="auto" w:sz="4" w:space="0"/>
+            <w:left w:val="single" w:color="auto" w:sz="4" w:space="0"/>
+            <w:bottom w:val="single" w:color="auto" w:sz="4" w:space="0"/>
+            <w:right w:val="single" w:color="auto" w:sz="4" w:space="0"/>
+            <w:insideH w:val="single" w:color="auto" w:sz="4" w:space="0"/>
+            <w:insideV w:val="single" w:color="auto" w:sz="4" w:space="0"/>
+          </w:tblBorders>
+          <w:tblCellMar>
+            <w:top w:w="0" w:type="dxa"/>
+            <w:left w:w="108" w:type="dxa"/>
+            <w:bottom w:w="0" w:type="dxa"/>
+            <w:right w:w="108" w:type="dxa"/>
+          </w:tblCellMar>
+        </w:tblPrEx>
+        <w:tc>
+          <w:tcPr>
+            <w:tcW w:w="0" w:type="auto"/>
+            <w:gridSpan w:val="2"/>
+            <w:vAlign w:val="center"/>
+          </w:tcPr>
+          <w:p>
+            <w:pPr>
+              <w:pStyle w:val="12"/>
+              <w:bidi w:val="0"/>
+              <w:jc w:val="both"/>
+              <w:rPr>
+                <w:rFonts w:hint="default"/>
+                <w:lang w:val="en-US" w:eastAsia="zh-CN"/>
+              </w:rPr>
+            </w:pPr>
+            <w:r>
+              <w:rPr>
+                <w:rFonts w:hint="eastAsia"/>
+                <w:lang w:val="en-US" w:eastAsia="zh-CN"/>
+              </w:rPr>
+              <w:t>Geometry3D</w:t>
+            </w:r>
+          </w:p>
+        </w:tc>
+        <w:tc>
+          <w:tcPr>
+            <w:tcW w:w="0" w:type="auto"/>
+            <w:vAlign w:val="center"/>
+          </w:tcPr>
+          <w:p>
+            <w:pPr>
+              <w:pStyle w:val="11"/>
+              <w:bidi w:val="0"/>
+              <w:jc w:val="both"/>
+              <w:rPr>
+                <w:rFonts w:hint="default"/>
+                <w:vertAlign w:val="baseline"/>
+                <w:lang w:val="en-US" w:eastAsia="zh-CN"/>
+              </w:rPr>
+            </w:pPr>
+            <w:r>
+              <w:rPr>
+                <w:rFonts w:hint="eastAsia"/>
+                <w:lang w:val="en-US" w:eastAsia="zh-CN"/>
+              </w:rPr>
+              <w:t>立体</w:t>
+            </w:r>
+          </w:p>
+        </w:tc>
+      </w:tr>
+      <w:tr>
+        <w:tblPrEx>
+          <w:tblBorders>
+            <w:top w:val="single" w:color="auto" w:sz="4" w:space="0"/>
+            <w:left w:val="single" w:color="auto" w:sz="4" w:space="0"/>
+            <w:bottom w:val="single" w:color="auto" w:sz="4" w:space="0"/>
+            <w:right w:val="single" w:color="auto" w:sz="4" w:space="0"/>
+            <w:insideH w:val="single" w:color="auto" w:sz="4" w:space="0"/>
+            <w:insideV w:val="single" w:color="auto" w:sz="4" w:space="0"/>
+          </w:tblBorders>
+          <w:tblCellMar>
+            <w:top w:w="0" w:type="dxa"/>
+            <w:left w:w="108" w:type="dxa"/>
+            <w:bottom w:w="0" w:type="dxa"/>
+            <w:right w:w="108" w:type="dxa"/>
+          </w:tblCellMar>
+        </w:tblPrEx>
+        <w:tc>
+          <w:tcPr>
+            <w:tcW w:w="0" w:type="auto"/>
+            <w:vMerge w:val="restart"/>
+            <w:vAlign w:val="center"/>
+          </w:tcPr>
+          <w:p>
+            <w:pPr>
+              <w:pStyle w:val="12"/>
+              <w:bidi w:val="0"/>
+              <w:jc w:val="both"/>
+              <w:rPr>
+                <w:rFonts w:hint="eastAsia"/>
+                <w:lang w:val="en-US" w:eastAsia="zh-CN"/>
+              </w:rPr>
+            </w:pPr>
+            <w:r>
+              <w:rPr>
+                <w:rFonts w:hint="eastAsia" w:ascii="华文中宋" w:hAnsi="华文中宋" w:eastAsia="华文中宋" w:cs="华文中宋"/>
+                <w:b/>
+                <w:bCs/>
+                <w:color w:val="ED7D31"/>
+                <w:kern w:val="2"/>
+                <w:sz w:val="21"/>
+                <w:szCs w:val="21"/>
+                <w:lang w:val="en-US" w:eastAsia="zh-CN" w:bidi="ar-SA"/>
+              </w:rPr>
+              <w:t>实例属性</w:t>
+            </w:r>
+          </w:p>
+        </w:tc>
+        <w:tc>
+          <w:tcPr>
+            <w:tcW w:w="0" w:type="auto"/>
+            <w:shd w:val="clear"/>
+            <w:vAlign w:val="center"/>
+          </w:tcPr>
+          <w:p>
+            <w:pPr>
+              <w:pStyle w:val="12"/>
+              <w:bidi w:val="0"/>
+              <w:jc w:val="both"/>
+              <w:rPr>
+                <w:rFonts w:hint="eastAsia" w:ascii="华文中宋" w:hAnsi="华文中宋" w:eastAsia="华文中宋" w:cs="华文中宋"/>
+                <w:b/>
+                <w:bCs/>
+                <w:color w:val="FF0000"/>
+                <w:kern w:val="2"/>
+                <w:sz w:val="21"/>
+                <w:szCs w:val="21"/>
+                <w:lang w:val="en-US" w:eastAsia="zh-CN" w:bidi="ar-SA"/>
+              </w:rPr>
+            </w:pPr>
+            <w:r>
+              <w:rPr>
+                <w:rFonts w:hint="eastAsia"/>
+                <w:lang w:val="en-US" w:eastAsia="zh-CN"/>
+              </w:rPr>
+              <w:t>get_center()</w:t>
+            </w:r>
+          </w:p>
+        </w:tc>
+        <w:tc>
+          <w:tcPr>
+            <w:tcW w:w="0" w:type="auto"/>
+            <w:shd w:val="clear"/>
+            <w:vAlign w:val="center"/>
+          </w:tcPr>
+          <w:p>
+            <w:pPr>
+              <w:pStyle w:val="11"/>
+              <w:bidi w:val="0"/>
+              <w:jc w:val="both"/>
+              <w:rPr>
+                <w:rFonts w:hint="eastAsia" w:ascii="华文中宋" w:hAnsi="华文中宋" w:eastAsia="华文中宋" w:cs="华文中宋"/>
+                <w:b/>
+                <w:bCs/>
+                <w:color w:val="EA82E5"/>
+                <w:kern w:val="2"/>
+                <w:sz w:val="21"/>
+                <w:szCs w:val="21"/>
+                <w:lang w:val="en-US" w:eastAsia="zh-CN" w:bidi="ar-SA"/>
+              </w:rPr>
+            </w:pPr>
+            <w:r>
+              <w:rPr>
+                <w:rFonts w:hint="eastAsia"/>
+                <w:lang w:val="en-US" w:eastAsia="zh-CN"/>
+              </w:rPr>
+              <w:t>中心</w:t>
+            </w:r>
+          </w:p>
+        </w:tc>
+      </w:tr>
+      <w:tr>
+        <w:tblPrEx>
+          <w:tblBorders>
+            <w:top w:val="single" w:color="auto" w:sz="4" w:space="0"/>
+            <w:left w:val="single" w:color="auto" w:sz="4" w:space="0"/>
+            <w:bottom w:val="single" w:color="auto" w:sz="4" w:space="0"/>
+            <w:right w:val="single" w:color="auto" w:sz="4" w:space="0"/>
+            <w:insideH w:val="single" w:color="auto" w:sz="4" w:space="0"/>
+            <w:insideV w:val="single" w:color="auto" w:sz="4" w:space="0"/>
+          </w:tblBorders>
+          <w:tblCellMar>
+            <w:top w:w="0" w:type="dxa"/>
+            <w:left w:w="108" w:type="dxa"/>
+            <w:bottom w:w="0" w:type="dxa"/>
+            <w:right w:w="108" w:type="dxa"/>
+          </w:tblCellMar>
+        </w:tblPrEx>
+        <w:tc>
+          <w:tcPr>
+            <w:tcW w:w="0" w:type="auto"/>
+            <w:vMerge w:val="continue"/>
+            <w:tcBorders/>
+            <w:vAlign w:val="center"/>
+          </w:tcPr>
+          <w:p>
+            <w:pPr>
+              <w:pStyle w:val="12"/>
+              <w:bidi w:val="0"/>
+              <w:jc w:val="both"/>
+              <w:rPr>
+                <w:rFonts w:hint="eastAsia" w:ascii="华文中宋" w:hAnsi="华文中宋" w:eastAsia="华文中宋" w:cs="华文中宋"/>
+                <w:b/>
+                <w:bCs/>
+                <w:color w:val="ED7D31"/>
+                <w:kern w:val="2"/>
+                <w:sz w:val="21"/>
+                <w:szCs w:val="21"/>
+                <w:lang w:val="en-US" w:eastAsia="zh-CN" w:bidi="ar-SA"/>
+              </w:rPr>
+            </w:pPr>
+          </w:p>
+        </w:tc>
+        <w:tc>
+          <w:tcPr>
+            <w:tcW w:w="0" w:type="auto"/>
+            <w:shd w:val="clear"/>
+            <w:vAlign w:val="center"/>
+          </w:tcPr>
+          <w:p>
+            <w:pPr>
+              <w:pStyle w:val="12"/>
+              <w:bidi w:val="0"/>
+              <w:jc w:val="both"/>
+              <w:rPr>
+                <w:rFonts w:hint="eastAsia" w:ascii="华文中宋" w:hAnsi="华文中宋" w:eastAsia="华文中宋" w:cs="华文中宋"/>
+                <w:b/>
+                <w:bCs/>
+                <w:color w:val="FF0000"/>
+                <w:kern w:val="2"/>
+                <w:sz w:val="21"/>
+                <w:szCs w:val="21"/>
+                <w:lang w:val="en-US" w:eastAsia="zh-CN" w:bidi="ar-SA"/>
+              </w:rPr>
+            </w:pPr>
+            <w:r>
+              <w:rPr>
+                <w:rFonts w:hint="eastAsia"/>
+                <w:lang w:val="en-US" w:eastAsia="zh-CN"/>
+              </w:rPr>
+              <w:t>get_min_bound / get_max_bound()</w:t>
+            </w:r>
+          </w:p>
+        </w:tc>
+        <w:tc>
+          <w:tcPr>
+            <w:tcW w:w="0" w:type="auto"/>
+            <w:shd w:val="clear"/>
+            <w:vAlign w:val="center"/>
+          </w:tcPr>
+          <w:p>
+            <w:pPr>
+              <w:pStyle w:val="11"/>
+              <w:bidi w:val="0"/>
+              <w:jc w:val="both"/>
+              <w:rPr>
+                <w:rFonts w:hint="eastAsia" w:ascii="华文中宋" w:hAnsi="华文中宋" w:eastAsia="华文中宋" w:cs="华文中宋"/>
+                <w:b/>
+                <w:bCs/>
+                <w:color w:val="EA82E5"/>
+                <w:kern w:val="2"/>
+                <w:sz w:val="21"/>
+                <w:szCs w:val="21"/>
+                <w:lang w:val="en-US" w:eastAsia="zh-CN" w:bidi="ar-SA"/>
+              </w:rPr>
+            </w:pPr>
+            <w:r>
+              <w:rPr>
+                <w:rFonts w:hint="eastAsia"/>
+                <w:lang w:val="en-US" w:eastAsia="zh-CN"/>
+              </w:rPr>
+              <w:t>边界</w:t>
+            </w:r>
+          </w:p>
+        </w:tc>
+      </w:tr>
+      <w:tr>
+        <w:tblPrEx>
+          <w:tblBorders>
+            <w:top w:val="single" w:color="auto" w:sz="4" w:space="0"/>
+            <w:left w:val="single" w:color="auto" w:sz="4" w:space="0"/>
+            <w:bottom w:val="single" w:color="auto" w:sz="4" w:space="0"/>
+            <w:right w:val="single" w:color="auto" w:sz="4" w:space="0"/>
+            <w:insideH w:val="single" w:color="auto" w:sz="4" w:space="0"/>
+            <w:insideV w:val="single" w:color="auto" w:sz="4" w:space="0"/>
+          </w:tblBorders>
+          <w:tblCellMar>
+            <w:top w:w="0" w:type="dxa"/>
+            <w:left w:w="108" w:type="dxa"/>
+            <w:bottom w:w="0" w:type="dxa"/>
+            <w:right w:w="108" w:type="dxa"/>
+          </w:tblCellMar>
+        </w:tblPrEx>
+        <w:tc>
+          <w:tcPr>
+            <w:tcW w:w="0" w:type="auto"/>
+            <w:vMerge w:val="restart"/>
+            <w:vAlign w:val="center"/>
+          </w:tcPr>
+          <w:p>
+            <w:pPr>
+              <w:pStyle w:val="12"/>
+              <w:bidi w:val="0"/>
+              <w:jc w:val="both"/>
+              <w:rPr>
+                <w:rFonts w:hint="eastAsia" w:ascii="华文中宋" w:hAnsi="华文中宋" w:eastAsia="华文中宋" w:cs="华文中宋"/>
+                <w:b/>
+                <w:bCs/>
+                <w:color w:val="ED7D31"/>
+                <w:kern w:val="2"/>
+                <w:sz w:val="21"/>
+                <w:szCs w:val="21"/>
+                <w:lang w:val="en-US" w:eastAsia="zh-CN" w:bidi="ar-SA"/>
+              </w:rPr>
+            </w:pPr>
+            <w:r>
+              <w:rPr>
+                <w:rFonts w:hint="eastAsia" w:ascii="华文中宋" w:hAnsi="华文中宋" w:eastAsia="华文中宋" w:cs="华文中宋"/>
+                <w:b/>
+                <w:bCs/>
+                <w:color w:val="ED7D31"/>
+                <w:kern w:val="2"/>
+                <w:sz w:val="21"/>
+                <w:szCs w:val="21"/>
+                <w:lang w:val="en-US" w:eastAsia="zh-CN" w:bidi="ar-SA"/>
+              </w:rPr>
+              <w:t>实例</w:t>
+            </w:r>
+            <w:r>
+              <w:rPr>
+                <w:rFonts w:hint="eastAsia" w:cs="华文中宋"/>
+                <w:b/>
+                <w:bCs/>
+                <w:color w:val="ED7D31"/>
+                <w:kern w:val="2"/>
+                <w:sz w:val="21"/>
+                <w:szCs w:val="21"/>
+                <w:lang w:val="en-US" w:eastAsia="zh-CN" w:bidi="ar-SA"/>
+              </w:rPr>
+              <w:t>方法</w:t>
+            </w:r>
+          </w:p>
+        </w:tc>
+        <w:tc>
+          <w:tcPr>
+            <w:tcW w:w="0" w:type="auto"/>
+            <w:shd w:val="clear"/>
+            <w:vAlign w:val="center"/>
+          </w:tcPr>
+          <w:p>
+            <w:pPr>
+              <w:pStyle w:val="12"/>
+              <w:bidi w:val="0"/>
+              <w:jc w:val="both"/>
+              <w:rPr>
+                <w:rFonts w:hint="default"/>
+                <w:lang w:val="en-US" w:eastAsia="zh-CN"/>
+              </w:rPr>
+            </w:pPr>
+            <w:r>
+              <w:rPr>
+                <w:rFonts w:hint="eastAsia"/>
+                <w:lang w:val="en-US" w:eastAsia="zh-CN"/>
+              </w:rPr>
+              <w:t>rotate(R)</w:t>
+            </w:r>
+          </w:p>
+        </w:tc>
+        <w:tc>
+          <w:tcPr>
+            <w:tcW w:w="0" w:type="auto"/>
+            <w:shd w:val="clear"/>
+            <w:vAlign w:val="center"/>
+          </w:tcPr>
+          <w:p>
+            <w:pPr>
+              <w:pStyle w:val="11"/>
+              <w:bidi w:val="0"/>
+              <w:jc w:val="both"/>
+              <w:rPr>
+                <w:rFonts w:hint="default"/>
+                <w:lang w:val="en-US" w:eastAsia="zh-CN"/>
+              </w:rPr>
+            </w:pPr>
+            <w:r>
+              <w:rPr>
+                <w:rFonts w:hint="eastAsia"/>
+                <w:lang w:val="en-US" w:eastAsia="zh-CN"/>
+              </w:rPr>
+              <w:t>旋转</w:t>
+            </w:r>
+          </w:p>
+        </w:tc>
+      </w:tr>
+      <w:tr>
+        <w:tblPrEx>
+          <w:tblBorders>
+            <w:top w:val="single" w:color="auto" w:sz="4" w:space="0"/>
+            <w:left w:val="single" w:color="auto" w:sz="4" w:space="0"/>
+            <w:bottom w:val="single" w:color="auto" w:sz="4" w:space="0"/>
+            <w:right w:val="single" w:color="auto" w:sz="4" w:space="0"/>
+            <w:insideH w:val="single" w:color="auto" w:sz="4" w:space="0"/>
+            <w:insideV w:val="single" w:color="auto" w:sz="4" w:space="0"/>
+          </w:tblBorders>
+          <w:tblCellMar>
+            <w:top w:w="0" w:type="dxa"/>
+            <w:left w:w="108" w:type="dxa"/>
+            <w:bottom w:w="0" w:type="dxa"/>
+            <w:right w:w="108" w:type="dxa"/>
+          </w:tblCellMar>
+        </w:tblPrEx>
+        <w:tc>
+          <w:tcPr>
+            <w:tcW w:w="0" w:type="auto"/>
+            <w:vMerge w:val="continue"/>
+            <w:tcBorders/>
+            <w:vAlign w:val="center"/>
+          </w:tcPr>
+          <w:p>
+            <w:pPr>
+              <w:pStyle w:val="12"/>
+              <w:bidi w:val="0"/>
+              <w:jc w:val="both"/>
+              <w:rPr>
+                <w:rFonts w:hint="eastAsia" w:ascii="华文中宋" w:hAnsi="华文中宋" w:eastAsia="华文中宋" w:cs="华文中宋"/>
+                <w:b/>
+                <w:bCs/>
+                <w:color w:val="ED7D31"/>
+                <w:kern w:val="2"/>
+                <w:sz w:val="21"/>
+                <w:szCs w:val="21"/>
+                <w:lang w:val="en-US" w:eastAsia="zh-CN" w:bidi="ar-SA"/>
+              </w:rPr>
+            </w:pPr>
+          </w:p>
+        </w:tc>
+        <w:tc>
+          <w:tcPr>
+            <w:tcW w:w="0" w:type="auto"/>
+            <w:shd w:val="clear"/>
+            <w:vAlign w:val="center"/>
+          </w:tcPr>
+          <w:p>
+            <w:pPr>
+              <w:pStyle w:val="12"/>
+              <w:bidi w:val="0"/>
+              <w:jc w:val="both"/>
+              <w:rPr>
+                <w:rFonts w:hint="default"/>
+                <w:lang w:val="en-US" w:eastAsia="zh-CN"/>
+              </w:rPr>
+            </w:pPr>
+            <w:r>
+              <w:rPr>
+                <w:rFonts w:hint="eastAsia"/>
+                <w:lang w:val="en-US" w:eastAsia="zh-CN"/>
+              </w:rPr>
+              <w:t>scale(s, center)</w:t>
+            </w:r>
+          </w:p>
+        </w:tc>
+        <w:tc>
+          <w:tcPr>
+            <w:tcW w:w="0" w:type="auto"/>
+            <w:shd w:val="clear"/>
+            <w:vAlign w:val="center"/>
+          </w:tcPr>
+          <w:p>
+            <w:pPr>
+              <w:pStyle w:val="11"/>
+              <w:bidi w:val="0"/>
+              <w:jc w:val="both"/>
+              <w:rPr>
+                <w:rFonts w:hint="default"/>
+                <w:lang w:val="en-US" w:eastAsia="zh-CN"/>
+              </w:rPr>
+            </w:pPr>
+            <w:r>
+              <w:rPr>
+                <w:rFonts w:hint="eastAsia"/>
+                <w:lang w:val="en-US" w:eastAsia="zh-CN"/>
+              </w:rPr>
+              <w:t>缩放</w:t>
+            </w:r>
+          </w:p>
+        </w:tc>
+      </w:tr>
+      <w:tr>
+        <w:tblPrEx>
+          <w:tblBorders>
+            <w:top w:val="single" w:color="auto" w:sz="4" w:space="0"/>
+            <w:left w:val="single" w:color="auto" w:sz="4" w:space="0"/>
+            <w:bottom w:val="single" w:color="auto" w:sz="4" w:space="0"/>
+            <w:right w:val="single" w:color="auto" w:sz="4" w:space="0"/>
+            <w:insideH w:val="single" w:color="auto" w:sz="4" w:space="0"/>
+            <w:insideV w:val="single" w:color="auto" w:sz="4" w:space="0"/>
+          </w:tblBorders>
+          <w:tblCellMar>
+            <w:top w:w="0" w:type="dxa"/>
+            <w:left w:w="108" w:type="dxa"/>
+            <w:bottom w:w="0" w:type="dxa"/>
+            <w:right w:w="108" w:type="dxa"/>
+          </w:tblCellMar>
+        </w:tblPrEx>
+        <w:tc>
+          <w:tcPr>
+            <w:tcW w:w="0" w:type="auto"/>
+            <w:vMerge w:val="continue"/>
+            <w:tcBorders/>
+            <w:vAlign w:val="center"/>
+          </w:tcPr>
+          <w:p>
+            <w:pPr>
+              <w:pStyle w:val="12"/>
+              <w:bidi w:val="0"/>
+              <w:jc w:val="both"/>
+              <w:rPr>
+                <w:rFonts w:hint="eastAsia" w:ascii="华文中宋" w:hAnsi="华文中宋" w:eastAsia="华文中宋" w:cs="华文中宋"/>
+                <w:b/>
+                <w:bCs/>
+                <w:color w:val="ED7D31"/>
+                <w:kern w:val="2"/>
+                <w:sz w:val="21"/>
+                <w:szCs w:val="21"/>
+                <w:lang w:val="en-US" w:eastAsia="zh-CN" w:bidi="ar-SA"/>
+              </w:rPr>
+            </w:pPr>
+          </w:p>
+        </w:tc>
+        <w:tc>
+          <w:tcPr>
+            <w:tcW w:w="0" w:type="auto"/>
+            <w:shd w:val="clear"/>
+            <w:vAlign w:val="center"/>
+          </w:tcPr>
+          <w:p>
+            <w:pPr>
+              <w:pStyle w:val="12"/>
+              <w:bidi w:val="0"/>
+              <w:jc w:val="both"/>
+              <w:rPr>
+                <w:rFonts w:hint="default"/>
+                <w:lang w:val="en-US" w:eastAsia="zh-CN"/>
+              </w:rPr>
+            </w:pPr>
+            <w:r>
+              <w:rPr>
+                <w:rFonts w:hint="eastAsia"/>
+                <w:lang w:val="en-US" w:eastAsia="zh-CN"/>
+              </w:rPr>
+              <w:t>translate(vec, relative=True)</w:t>
+            </w:r>
+          </w:p>
+        </w:tc>
+        <w:tc>
+          <w:tcPr>
+            <w:tcW w:w="0" w:type="auto"/>
+            <w:shd w:val="clear"/>
+            <w:vAlign w:val="center"/>
+          </w:tcPr>
+          <w:p>
+            <w:pPr>
+              <w:pStyle w:val="11"/>
+              <w:bidi w:val="0"/>
+              <w:jc w:val="both"/>
+              <w:rPr>
+                <w:rFonts w:hint="default"/>
+                <w:lang w:val="en-US" w:eastAsia="zh-CN"/>
+              </w:rPr>
+            </w:pPr>
+            <w:r>
+              <w:rPr>
+                <w:rFonts w:hint="eastAsia"/>
+                <w:lang w:val="en-US" w:eastAsia="zh-CN"/>
+              </w:rPr>
+              <w:t>平移</w:t>
+            </w:r>
+          </w:p>
+        </w:tc>
+      </w:tr>
+      <w:tr>
+        <w:tblPrEx>
+          <w:tblBorders>
+            <w:top w:val="single" w:color="auto" w:sz="4" w:space="0"/>
+            <w:left w:val="single" w:color="auto" w:sz="4" w:space="0"/>
+            <w:bottom w:val="single" w:color="auto" w:sz="4" w:space="0"/>
+            <w:right w:val="single" w:color="auto" w:sz="4" w:space="0"/>
+            <w:insideH w:val="single" w:color="auto" w:sz="4" w:space="0"/>
+            <w:insideV w:val="single" w:color="auto" w:sz="4" w:space="0"/>
+          </w:tblBorders>
+          <w:tblCellMar>
+            <w:top w:w="0" w:type="dxa"/>
+            <w:left w:w="108" w:type="dxa"/>
+            <w:bottom w:w="0" w:type="dxa"/>
+            <w:right w:w="108" w:type="dxa"/>
+          </w:tblCellMar>
+        </w:tblPrEx>
+        <w:tc>
+          <w:tcPr>
+            <w:tcW w:w="0" w:type="auto"/>
+            <w:vMerge w:val="continue"/>
+            <w:tcBorders/>
+            <w:vAlign w:val="center"/>
+          </w:tcPr>
+          <w:p>
+            <w:pPr>
+              <w:pStyle w:val="12"/>
+              <w:bidi w:val="0"/>
+              <w:jc w:val="both"/>
+              <w:rPr>
+                <w:rFonts w:hint="eastAsia" w:ascii="华文中宋" w:hAnsi="华文中宋" w:eastAsia="华文中宋" w:cs="华文中宋"/>
+                <w:b/>
+                <w:bCs/>
+                <w:color w:val="ED7D31"/>
+                <w:kern w:val="2"/>
+                <w:sz w:val="21"/>
+                <w:szCs w:val="21"/>
+                <w:lang w:val="en-US" w:eastAsia="zh-CN" w:bidi="ar-SA"/>
+              </w:rPr>
+            </w:pPr>
+          </w:p>
+        </w:tc>
+        <w:tc>
+          <w:tcPr>
+            <w:tcW w:w="0" w:type="auto"/>
+            <w:shd w:val="clear"/>
+            <w:vAlign w:val="center"/>
+          </w:tcPr>
+          <w:p>
+            <w:pPr>
+              <w:pStyle w:val="12"/>
+              <w:bidi w:val="0"/>
+              <w:jc w:val="both"/>
+              <w:rPr>
+                <w:rFonts w:hint="default"/>
+                <w:lang w:val="en-US" w:eastAsia="zh-CN"/>
+              </w:rPr>
+            </w:pPr>
+            <w:r>
+              <w:rPr>
+                <w:rFonts w:hint="eastAsia"/>
+                <w:lang w:val="en-US" w:eastAsia="zh-CN"/>
+              </w:rPr>
+              <w:t>transform(T)</w:t>
+            </w:r>
+          </w:p>
+        </w:tc>
+        <w:tc>
+          <w:tcPr>
+            <w:tcW w:w="0" w:type="auto"/>
+            <w:shd w:val="clear"/>
+            <w:vAlign w:val="center"/>
+          </w:tcPr>
+          <w:p>
+            <w:pPr>
+              <w:pStyle w:val="11"/>
+              <w:bidi w:val="0"/>
+              <w:jc w:val="both"/>
+              <w:rPr>
+                <w:rFonts w:hint="default"/>
+                <w:lang w:val="en-US" w:eastAsia="zh-CN"/>
+              </w:rPr>
+            </w:pPr>
+            <w:r>
+              <w:rPr>
+                <w:rFonts w:hint="eastAsia"/>
+                <w:lang w:val="en-US" w:eastAsia="zh-CN"/>
+              </w:rPr>
+              <w:t>齐次变换</w:t>
+            </w:r>
+          </w:p>
+        </w:tc>
+      </w:tr>
+      <w:tr>
+        <w:tblPrEx>
+          <w:tblBorders>
+            <w:top w:val="single" w:color="auto" w:sz="4" w:space="0"/>
+            <w:left w:val="single" w:color="auto" w:sz="4" w:space="0"/>
+            <w:bottom w:val="single" w:color="auto" w:sz="4" w:space="0"/>
+            <w:right w:val="single" w:color="auto" w:sz="4" w:space="0"/>
+            <w:insideH w:val="single" w:color="auto" w:sz="4" w:space="0"/>
+            <w:insideV w:val="single" w:color="auto" w:sz="4" w:space="0"/>
+          </w:tblBorders>
+          <w:tblCellMar>
+            <w:top w:w="0" w:type="dxa"/>
+            <w:left w:w="108" w:type="dxa"/>
+            <w:bottom w:w="0" w:type="dxa"/>
+            <w:right w:w="108" w:type="dxa"/>
+          </w:tblCellMar>
+        </w:tblPrEx>
+        <w:tc>
+          <w:tcPr>
+            <w:tcW w:w="0" w:type="auto"/>
+            <w:vMerge w:val="continue"/>
+            <w:tcBorders/>
+            <w:vAlign w:val="center"/>
+          </w:tcPr>
+          <w:p>
+            <w:pPr>
+              <w:pStyle w:val="12"/>
+              <w:bidi w:val="0"/>
+              <w:jc w:val="both"/>
+              <w:rPr>
+                <w:rFonts w:hint="eastAsia" w:ascii="华文中宋" w:hAnsi="华文中宋" w:eastAsia="华文中宋" w:cs="华文中宋"/>
+                <w:b/>
+                <w:bCs/>
+                <w:color w:val="ED7D31"/>
+                <w:kern w:val="2"/>
+                <w:sz w:val="21"/>
+                <w:szCs w:val="21"/>
+                <w:lang w:val="en-US" w:eastAsia="zh-CN" w:bidi="ar-SA"/>
+              </w:rPr>
+            </w:pPr>
+          </w:p>
+        </w:tc>
+        <w:tc>
+          <w:tcPr>
+            <w:tcW w:w="0" w:type="auto"/>
+            <w:shd w:val="clear"/>
+            <w:vAlign w:val="center"/>
+          </w:tcPr>
+          <w:p>
+            <w:pPr>
+              <w:pStyle w:val="12"/>
+              <w:bidi w:val="0"/>
+              <w:jc w:val="both"/>
+              <w:rPr>
+                <w:rFonts w:hint="default"/>
+                <w:lang w:val="en-US" w:eastAsia="zh-CN"/>
+              </w:rPr>
+            </w:pPr>
+            <w:r>
+              <w:rPr>
+                <w:rFonts w:hint="eastAsia"/>
+                <w:lang w:val="en-US" w:eastAsia="zh-CN"/>
+              </w:rPr>
+              <w:t>get_rotation_matrix_from_*(rotation)</w:t>
+            </w:r>
+          </w:p>
+        </w:tc>
+        <w:tc>
+          <w:tcPr>
+            <w:tcW w:w="0" w:type="auto"/>
+            <w:shd w:val="clear"/>
+            <w:vAlign w:val="center"/>
+          </w:tcPr>
+          <w:p>
+            <w:pPr>
+              <w:pStyle w:val="11"/>
+              <w:bidi w:val="0"/>
+              <w:jc w:val="both"/>
+              <w:rPr>
+                <w:rFonts w:hint="default"/>
+                <w:lang w:val="en-US" w:eastAsia="zh-CN"/>
+              </w:rPr>
+            </w:pPr>
+            <w:r>
+              <w:rPr>
+                <w:rFonts w:hint="eastAsia" w:ascii="华文中宋" w:hAnsi="华文中宋" w:eastAsia="华文中宋" w:cs="华文中宋"/>
+                <w:b/>
+                <w:bCs/>
+                <w:color w:val="ED7D31"/>
+                <w:kern w:val="2"/>
+                <w:sz w:val="21"/>
+                <w:szCs w:val="21"/>
+                <w:vertAlign w:val="baseline"/>
+                <w:lang w:val="en-US" w:eastAsia="zh-CN" w:bidi="ar-SA"/>
+              </w:rPr>
+              <w:t>获取</w:t>
+            </w:r>
+            <w:r>
+              <w:rPr>
+                <w:rFonts w:hint="eastAsia"/>
+                <w:lang w:val="en-US" w:eastAsia="zh-CN"/>
+              </w:rPr>
+              <w:t>旋转矩阵</w:t>
+            </w:r>
+          </w:p>
+        </w:tc>
+      </w:tr>
+    </w:tbl>
+    <w:p>
+      <w:pPr>
+        <w:rPr>
+          <w:rFonts w:hint="eastAsia"/>
+          <w:lang w:val="en-US" w:eastAsia="zh-CN"/>
+        </w:rPr>
+      </w:pPr>
+    </w:p>
+    <w:p>
+      <w:pPr>
+        <w:rPr>
+          <w:rFonts w:hint="eastAsia"/>
+          <w:lang w:val="en-US" w:eastAsia="zh-CN"/>
+        </w:rPr>
+      </w:pPr>
+    </w:p>
+    <w:tbl>
+      <w:tblPr>
+        <w:tblStyle w:val="8"/>
+        <w:tblW w:w="0" w:type="auto"/>
+        <w:tblInd w:w="0" w:type="dxa"/>
+        <w:tblBorders>
+          <w:top w:val="single" w:color="auto" w:sz="4" w:space="0"/>
+          <w:left w:val="single" w:color="auto" w:sz="4" w:space="0"/>
+          <w:bottom w:val="single" w:color="auto" w:sz="4" w:space="0"/>
+          <w:right w:val="single" w:color="auto" w:sz="4" w:space="0"/>
+          <w:insideH w:val="single" w:color="auto" w:sz="4" w:space="0"/>
+          <w:insideV w:val="single" w:color="auto" w:sz="4" w:space="0"/>
+        </w:tblBorders>
+        <w:tblLayout w:type="autofit"/>
+        <w:tblCellMar>
+          <w:top w:w="0" w:type="dxa"/>
+          <w:left w:w="108" w:type="dxa"/>
+          <w:bottom w:w="0" w:type="dxa"/>
+          <w:right w:w="108" w:type="dxa"/>
+        </w:tblCellMar>
+      </w:tblPr>
+      <w:tblGrid>
+        <w:gridCol w:w="1057"/>
         <w:gridCol w:w="3239"/>
         <w:gridCol w:w="692"/>
       </w:tblGrid>
@@ -738,8 +1569,6 @@
           <w:lang w:val="en-US" w:eastAsia="zh-CN"/>
         </w:rPr>
       </w:pPr>
-      <w:bookmarkStart w:id="0" w:name="_GoBack"/>
-      <w:bookmarkEnd w:id="0"/>
     </w:p>
     <w:tbl>
       <w:tblPr>
@@ -1195,41 +2024,40 @@
           <w:tcPr>
             <w:tcW w:w="0" w:type="auto"/>
             <w:vMerge w:val="continue"/>
-            <w:tcBorders/>
-            <w:vAlign w:val="center"/>
-          </w:tcPr>
-          <w:p>
-            <w:pPr>
-              <w:bidi w:val="0"/>
-              <w:jc w:val="both"/>
-              <w:rPr>
-                <w:rFonts w:hint="eastAsia"/>
-                <w:lang w:val="en-US" w:eastAsia="zh-CN"/>
-              </w:rPr>
-            </w:pPr>
-          </w:p>
-        </w:tc>
-        <w:tc>
-          <w:tcPr>
-            <w:tcW w:w="0" w:type="auto"/>
-            <w:vAlign w:val="center"/>
-          </w:tcPr>
-          <w:p>
-            <w:pPr>
-              <w:pStyle w:val="12"/>
-              <w:bidi w:val="0"/>
-              <w:jc w:val="both"/>
-              <w:rPr>
-                <w:rFonts w:hint="default"/>
-                <w:lang w:val="en-US" w:eastAsia="zh-CN"/>
-              </w:rPr>
-            </w:pPr>
-            <w:r>
-              <w:rPr>
-                <w:rFonts w:hint="eastAsia"/>
-                <w:lang w:val="en-US" w:eastAsia="zh-CN"/>
-              </w:rPr>
-              <w:t>transform(T)</w:t>
+            <w:vAlign w:val="center"/>
+          </w:tcPr>
+          <w:p>
+            <w:pPr>
+              <w:bidi w:val="0"/>
+              <w:jc w:val="both"/>
+              <w:rPr>
+                <w:rFonts w:hint="eastAsia"/>
+                <w:lang w:val="en-US" w:eastAsia="zh-CN"/>
+              </w:rPr>
+            </w:pPr>
+          </w:p>
+        </w:tc>
+        <w:tc>
+          <w:tcPr>
+            <w:tcW w:w="0" w:type="auto"/>
+            <w:vAlign w:val="center"/>
+          </w:tcPr>
+          <w:p>
+            <w:pPr>
+              <w:pStyle w:val="12"/>
+              <w:bidi w:val="0"/>
+              <w:jc w:val="both"/>
+              <w:rPr>
+                <w:rFonts w:hint="default"/>
+                <w:lang w:val="en-US" w:eastAsia="zh-CN"/>
+              </w:rPr>
+            </w:pPr>
+            <w:r>
+              <w:rPr>
+                <w:rFonts w:hint="eastAsia"/>
+                <w:lang w:val="en-US" w:eastAsia="zh-CN"/>
+              </w:rPr>
+              <w:t>estimate_normals()</w:t>
             </w:r>
           </w:p>
         </w:tc>
@@ -1244,37 +2072,16 @@
               <w:bidi w:val="0"/>
               <w:jc w:val="both"/>
               <w:rPr>
-                <w:rFonts w:hint="default" w:ascii="华文中宋" w:hAnsi="华文中宋" w:eastAsia="华文中宋" w:cs="华文中宋"/>
-                <w:b/>
-                <w:bCs/>
-                <w:color w:val="ED7D31"/>
-                <w:kern w:val="2"/>
-                <w:sz w:val="21"/>
-                <w:szCs w:val="21"/>
-                <w:vertAlign w:val="baseline"/>
-                <w:lang w:val="en-US" w:eastAsia="zh-CN" w:bidi="ar-SA"/>
-              </w:rPr>
-            </w:pPr>
-            <w:r>
-              <w:rPr>
-                <w:rFonts w:hint="eastAsia" w:cs="华文中宋"/>
-                <w:b/>
-                <w:bCs/>
-                <w:color w:val="ED7D31"/>
-                <w:kern w:val="2"/>
-                <w:sz w:val="21"/>
-                <w:szCs w:val="21"/>
-                <w:vertAlign w:val="baseline"/>
-                <w:lang w:val="en-US" w:eastAsia="zh-CN" w:bidi="ar-SA"/>
-              </w:rPr>
-              <w:t>返回</w:t>
-            </w:r>
-            <w:r>
-              <w:rPr>
-                <w:rFonts w:hint="eastAsia"/>
-                <w:lang w:val="en-US" w:eastAsia="zh-CN"/>
-              </w:rPr>
-              <w:t>变换点云</w:t>
+                <w:rFonts w:hint="default"/>
+                <w:lang w:val="en-US" w:eastAsia="zh-CN"/>
+              </w:rPr>
+            </w:pPr>
+            <w:r>
+              <w:rPr>
+                <w:rFonts w:hint="eastAsia"/>
+                <w:lang w:val="en-US" w:eastAsia="zh-CN"/>
+              </w:rPr>
+              <w:t>估计法向量</w:t>
             </w:r>
           </w:p>
         </w:tc>
@@ -1300,41 +2107,40 @@
           <w:tcPr>
             <w:tcW w:w="0" w:type="auto"/>
             <w:vMerge w:val="continue"/>
-            <w:tcBorders/>
-            <w:vAlign w:val="center"/>
-          </w:tcPr>
-          <w:p>
-            <w:pPr>
-              <w:bidi w:val="0"/>
-              <w:jc w:val="both"/>
-              <w:rPr>
-                <w:rFonts w:hint="eastAsia"/>
-                <w:lang w:val="en-US" w:eastAsia="zh-CN"/>
-              </w:rPr>
-            </w:pPr>
-          </w:p>
-        </w:tc>
-        <w:tc>
-          <w:tcPr>
-            <w:tcW w:w="0" w:type="auto"/>
-            <w:vAlign w:val="center"/>
-          </w:tcPr>
-          <w:p>
-            <w:pPr>
-              <w:pStyle w:val="12"/>
-              <w:bidi w:val="0"/>
-              <w:jc w:val="both"/>
-              <w:rPr>
-                <w:rFonts w:hint="default"/>
-                <w:lang w:val="en-US" w:eastAsia="zh-CN"/>
-              </w:rPr>
-            </w:pPr>
-            <w:r>
-              <w:rPr>
-                <w:rFonts w:hint="eastAsia"/>
-                <w:lang w:val="en-US" w:eastAsia="zh-CN"/>
-              </w:rPr>
-              <w:t>estimate_normals()</w:t>
+            <w:vAlign w:val="center"/>
+          </w:tcPr>
+          <w:p>
+            <w:pPr>
+              <w:bidi w:val="0"/>
+              <w:jc w:val="both"/>
+              <w:rPr>
+                <w:rFonts w:hint="eastAsia"/>
+                <w:lang w:val="en-US" w:eastAsia="zh-CN"/>
+              </w:rPr>
+            </w:pPr>
+          </w:p>
+        </w:tc>
+        <w:tc>
+          <w:tcPr>
+            <w:tcW w:w="0" w:type="auto"/>
+            <w:vAlign w:val="center"/>
+          </w:tcPr>
+          <w:p>
+            <w:pPr>
+              <w:pStyle w:val="12"/>
+              <w:bidi w:val="0"/>
+              <w:jc w:val="both"/>
+              <w:rPr>
+                <w:rFonts w:hint="default"/>
+                <w:lang w:val="en-US" w:eastAsia="zh-CN"/>
+              </w:rPr>
+            </w:pPr>
+            <w:r>
+              <w:rPr>
+                <w:rFonts w:hint="eastAsia"/>
+                <w:lang w:val="en-US" w:eastAsia="zh-CN"/>
+              </w:rPr>
+              <w:t>orient_normals_towards_camera_location(loc)</w:t>
             </w:r>
           </w:p>
         </w:tc>
@@ -1358,7 +2164,7 @@
                 <w:rFonts w:hint="eastAsia"/>
                 <w:lang w:val="en-US" w:eastAsia="zh-CN"/>
               </w:rPr>
-              <w:t>估计法向量</w:t>
+              <w:t>调整法向量</w:t>
             </w:r>
           </w:p>
         </w:tc>
@@ -1384,41 +2190,40 @@
           <w:tcPr>
             <w:tcW w:w="0" w:type="auto"/>
             <w:vMerge w:val="continue"/>
-            <w:tcBorders/>
-            <w:vAlign w:val="center"/>
-          </w:tcPr>
-          <w:p>
-            <w:pPr>
-              <w:bidi w:val="0"/>
-              <w:jc w:val="both"/>
-              <w:rPr>
-                <w:rFonts w:hint="eastAsia"/>
-                <w:lang w:val="en-US" w:eastAsia="zh-CN"/>
-              </w:rPr>
-            </w:pPr>
-          </w:p>
-        </w:tc>
-        <w:tc>
-          <w:tcPr>
-            <w:tcW w:w="0" w:type="auto"/>
-            <w:vAlign w:val="center"/>
-          </w:tcPr>
-          <w:p>
-            <w:pPr>
-              <w:pStyle w:val="12"/>
-              <w:bidi w:val="0"/>
-              <w:jc w:val="both"/>
-              <w:rPr>
-                <w:rFonts w:hint="default"/>
-                <w:lang w:val="en-US" w:eastAsia="zh-CN"/>
-              </w:rPr>
-            </w:pPr>
-            <w:r>
-              <w:rPr>
-                <w:rFonts w:hint="eastAsia"/>
-                <w:lang w:val="en-US" w:eastAsia="zh-CN"/>
-              </w:rPr>
-              <w:t>orient_normals_towards_camera_location(loc)</w:t>
+            <w:vAlign w:val="center"/>
+          </w:tcPr>
+          <w:p>
+            <w:pPr>
+              <w:bidi w:val="0"/>
+              <w:jc w:val="both"/>
+              <w:rPr>
+                <w:rFonts w:hint="eastAsia"/>
+                <w:lang w:val="en-US" w:eastAsia="zh-CN"/>
+              </w:rPr>
+            </w:pPr>
+          </w:p>
+        </w:tc>
+        <w:tc>
+          <w:tcPr>
+            <w:tcW w:w="0" w:type="auto"/>
+            <w:vAlign w:val="center"/>
+          </w:tcPr>
+          <w:p>
+            <w:pPr>
+              <w:pStyle w:val="12"/>
+              <w:bidi w:val="0"/>
+              <w:jc w:val="both"/>
+              <w:rPr>
+                <w:rFonts w:hint="default"/>
+                <w:lang w:val="en-US" w:eastAsia="zh-CN"/>
+              </w:rPr>
+            </w:pPr>
+            <w:r>
+              <w:rPr>
+                <w:rFonts w:hint="eastAsia"/>
+                <w:lang w:val="en-US" w:eastAsia="zh-CN"/>
+              </w:rPr>
+              <w:t>paint_uniform_color(rgb)</w:t>
             </w:r>
           </w:p>
         </w:tc>
@@ -1433,16 +2238,16 @@
               <w:bidi w:val="0"/>
               <w:jc w:val="both"/>
               <w:rPr>
-                <w:rFonts w:hint="default"/>
-                <w:lang w:val="en-US" w:eastAsia="zh-CN"/>
-              </w:rPr>
-            </w:pPr>
-            <w:r>
-              <w:rPr>
-                <w:rFonts w:hint="eastAsia"/>
-                <w:lang w:val="en-US" w:eastAsia="zh-CN"/>
-              </w:rPr>
-              <w:t>调整法向量</w:t>
+                <w:rFonts w:hint="eastAsia"/>
+                <w:lang w:val="en-US" w:eastAsia="zh-CN"/>
+              </w:rPr>
+            </w:pPr>
+            <w:r>
+              <w:rPr>
+                <w:rFonts w:hint="eastAsia"/>
+                <w:lang w:val="en-US" w:eastAsia="zh-CN"/>
+              </w:rPr>
+              <w:t>染色</w:t>
             </w:r>
           </w:p>
         </w:tc>
@@ -1468,91 +2273,6 @@
           <w:tcPr>
             <w:tcW w:w="0" w:type="auto"/>
             <w:vMerge w:val="continue"/>
-            <w:tcBorders/>
-            <w:vAlign w:val="center"/>
-          </w:tcPr>
-          <w:p>
-            <w:pPr>
-              <w:bidi w:val="0"/>
-              <w:jc w:val="both"/>
-              <w:rPr>
-                <w:rFonts w:hint="eastAsia"/>
-                <w:lang w:val="en-US" w:eastAsia="zh-CN"/>
-              </w:rPr>
-            </w:pPr>
-          </w:p>
-        </w:tc>
-        <w:tc>
-          <w:tcPr>
-            <w:tcW w:w="0" w:type="auto"/>
-            <w:vAlign w:val="center"/>
-          </w:tcPr>
-          <w:p>
-            <w:pPr>
-              <w:pStyle w:val="12"/>
-              <w:bidi w:val="0"/>
-              <w:jc w:val="both"/>
-              <w:rPr>
-                <w:rFonts w:hint="default"/>
-                <w:lang w:val="en-US" w:eastAsia="zh-CN"/>
-              </w:rPr>
-            </w:pPr>
-            <w:r>
-              <w:rPr>
-                <w:rFonts w:hint="eastAsia"/>
-                <w:lang w:val="en-US" w:eastAsia="zh-CN"/>
-              </w:rPr>
-              <w:t>paint_uniform_color(rgb)</w:t>
-            </w:r>
-          </w:p>
-        </w:tc>
-        <w:tc>
-          <w:tcPr>
-            <w:tcW w:w="0" w:type="auto"/>
-            <w:vAlign w:val="center"/>
-          </w:tcPr>
-          <w:p>
-            <w:pPr>
-              <w:pStyle w:val="11"/>
-              <w:bidi w:val="0"/>
-              <w:jc w:val="both"/>
-              <w:rPr>
-                <w:rFonts w:hint="eastAsia"/>
-                <w:lang w:val="en-US" w:eastAsia="zh-CN"/>
-              </w:rPr>
-            </w:pPr>
-            <w:r>
-              <w:rPr>
-                <w:rFonts w:hint="eastAsia"/>
-                <w:lang w:val="en-US" w:eastAsia="zh-CN"/>
-              </w:rPr>
-              <w:t>染色</w:t>
-            </w:r>
-          </w:p>
-        </w:tc>
-      </w:tr>
-      <w:tr>
-        <w:tblPrEx>
-          <w:tblBorders>
-            <w:top w:val="single" w:color="auto" w:sz="4" w:space="0"/>
-            <w:left w:val="single" w:color="auto" w:sz="4" w:space="0"/>
-            <w:bottom w:val="single" w:color="auto" w:sz="4" w:space="0"/>
-            <w:right w:val="single" w:color="auto" w:sz="4" w:space="0"/>
-            <w:insideH w:val="single" w:color="auto" w:sz="4" w:space="0"/>
-            <w:insideV w:val="single" w:color="auto" w:sz="4" w:space="0"/>
-          </w:tblBorders>
-          <w:tblCellMar>
-            <w:top w:w="0" w:type="dxa"/>
-            <w:left w:w="108" w:type="dxa"/>
-            <w:bottom w:w="0" w:type="dxa"/>
-            <w:right w:w="108" w:type="dxa"/>
-          </w:tblCellMar>
-        </w:tblPrEx>
-        <w:tc>
-          <w:tcPr>
-            <w:tcW w:w="0" w:type="auto"/>
-            <w:vMerge w:val="continue"/>
-            <w:tcBorders/>
             <w:vAlign w:val="center"/>
           </w:tcPr>
           <w:p>
@@ -2186,7 +2906,7 @@
         </w:tblCellMar>
       </w:tblPr>
       <w:tblGrid>
-        <w:gridCol w:w="1057"/>
+        <w:gridCol w:w="847"/>
         <w:gridCol w:w="4362"/>
         <w:gridCol w:w="1268"/>
       </w:tblGrid>
@@ -2371,193 +3091,6 @@
                 <w:lang w:val="en-US" w:eastAsia="zh-CN" w:bidi="ar-SA"/>
               </w:rPr>
               <w:t>构建</w:t>
-            </w:r>
-          </w:p>
-        </w:tc>
-      </w:tr>
-      <w:tr>
-        <w:tblPrEx>
-          <w:tblBorders>
-            <w:top w:val="single" w:color="auto" w:sz="4" w:space="0"/>
-            <w:left w:val="single" w:color="auto" w:sz="4" w:space="0"/>
-            <w:bottom w:val="single" w:color="auto" w:sz="4" w:space="0"/>
-            <w:right w:val="single" w:color="auto" w:sz="4" w:space="0"/>
-            <w:insideH w:val="single" w:color="auto" w:sz="4" w:space="0"/>
-            <w:insideV w:val="single" w:color="auto" w:sz="4" w:space="0"/>
-          </w:tblBorders>
-          <w:tblCellMar>
-            <w:top w:w="0" w:type="dxa"/>
-            <w:left w:w="108" w:type="dxa"/>
-            <w:bottom w:w="0" w:type="dxa"/>
-            <w:right w:w="108" w:type="dxa"/>
-          </w:tblCellMar>
-        </w:tblPrEx>
-        <w:tc>
-          <w:tcPr>
-            <w:tcW w:w="0" w:type="auto"/>
-            <w:vMerge w:val="restart"/>
-            <w:vAlign w:val="center"/>
-          </w:tcPr>
-          <w:p>
-            <w:pPr>
-              <w:pStyle w:val="12"/>
-              <w:bidi w:val="0"/>
-              <w:jc w:val="both"/>
-              <w:rPr>
-                <w:rFonts w:hint="eastAsia" w:ascii="华文中宋" w:hAnsi="华文中宋" w:eastAsia="华文中宋" w:cs="华文中宋"/>
-                <w:b/>
-                <w:bCs/>
-                <w:color w:val="ED7D31"/>
-                <w:kern w:val="2"/>
-                <w:sz w:val="21"/>
-                <w:szCs w:val="21"/>
-                <w:lang w:val="en-US" w:eastAsia="zh-CN" w:bidi="ar-SA"/>
-              </w:rPr>
-            </w:pPr>
-            <w:r>
-              <w:rPr>
-                <w:rFonts w:hint="eastAsia" w:cs="华文中宋"/>
-                <w:b/>
-                <w:bCs/>
-                <w:color w:val="ED7D31"/>
-                <w:kern w:val="2"/>
-                <w:sz w:val="21"/>
-                <w:szCs w:val="21"/>
-                <w:lang w:val="en-US" w:eastAsia="zh-CN" w:bidi="ar-SA"/>
-              </w:rPr>
-              <w:t>实例属性</w:t>
-            </w:r>
-          </w:p>
-        </w:tc>
-        <w:tc>
-          <w:tcPr>
-            <w:tcW w:w="0" w:type="auto"/>
-            <w:vAlign w:val="center"/>
-          </w:tcPr>
-          <w:p>
-            <w:pPr>
-              <w:pStyle w:val="12"/>
-              <w:bidi w:val="0"/>
-              <w:jc w:val="both"/>
-              <w:rPr>
-                <w:rFonts w:hint="default"/>
-                <w:lang w:val="en-US" w:eastAsia="zh-CN"/>
-              </w:rPr>
-            </w:pPr>
-            <w:r>
-              <w:rPr>
-                <w:rFonts w:hint="eastAsia"/>
-                <w:lang w:val="en-US" w:eastAsia="zh-CN"/>
-              </w:rPr>
-              <w:t>get_center()</w:t>
-            </w:r>
-          </w:p>
-        </w:tc>
-        <w:tc>
-          <w:tcPr>
-            <w:tcW w:w="0" w:type="auto"/>
-            <w:vAlign w:val="center"/>
-          </w:tcPr>
-          <w:p>
-            <w:pPr>
-              <w:pStyle w:val="11"/>
-              <w:bidi w:val="0"/>
-              <w:jc w:val="both"/>
-              <w:rPr>
-                <w:rFonts w:hint="default"/>
-                <w:lang w:val="en-US" w:eastAsia="zh-CN"/>
-              </w:rPr>
-            </w:pPr>
-            <w:r>
-              <w:rPr>
-                <w:rFonts w:hint="eastAsia"/>
-                <w:lang w:val="en-US" w:eastAsia="zh-CN"/>
-              </w:rPr>
-              <w:t>中心</w:t>
-            </w:r>
-          </w:p>
-        </w:tc>
-      </w:tr>
-      <w:tr>
-        <w:tblPrEx>
-          <w:tblBorders>
-            <w:top w:val="single" w:color="auto" w:sz="4" w:space="0"/>
-            <w:left w:val="single" w:color="auto" w:sz="4" w:space="0"/>
-            <w:bottom w:val="single" w:color="auto" w:sz="4" w:space="0"/>
-            <w:right w:val="single" w:color="auto" w:sz="4" w:space="0"/>
-            <w:insideH w:val="single" w:color="auto" w:sz="4" w:space="0"/>
-            <w:insideV w:val="single" w:color="auto" w:sz="4" w:space="0"/>
-          </w:tblBorders>
-        </w:tblPrEx>
-        <w:tc>
-          <w:tcPr>
-            <w:tcW w:w="0" w:type="auto"/>
-            <w:vMerge w:val="continue"/>
-            <w:vAlign w:val="center"/>
-          </w:tcPr>
-          <w:p>
-            <w:pPr>
-              <w:pStyle w:val="12"/>
-              <w:bidi w:val="0"/>
-              <w:jc w:val="both"/>
-              <w:rPr>
-                <w:rFonts w:hint="eastAsia" w:ascii="华文中宋" w:hAnsi="华文中宋" w:eastAsia="华文中宋" w:cs="华文中宋"/>
-                <w:b/>
-                <w:bCs/>
-                <w:color w:val="ED7D31"/>
-                <w:kern w:val="2"/>
-                <w:sz w:val="21"/>
-                <w:szCs w:val="21"/>
-                <w:lang w:val="en-US" w:eastAsia="zh-CN" w:bidi="ar-SA"/>
-              </w:rPr>
-            </w:pPr>
-          </w:p>
-        </w:tc>
-        <w:tc>
-          <w:tcPr>
-            <w:tcW w:w="0" w:type="auto"/>
-            <w:vAlign w:val="center"/>
-          </w:tcPr>
-          <w:p>
-            <w:pPr>
-              <w:pStyle w:val="12"/>
-              <w:bidi w:val="0"/>
-              <w:jc w:val="both"/>
-              <w:rPr>
-                <w:rFonts w:hint="default"/>
-                <w:lang w:val="en-US" w:eastAsia="zh-CN"/>
-              </w:rPr>
-            </w:pPr>
-            <w:r>
-              <w:rPr>
-                <w:rFonts w:hint="eastAsia"/>
-                <w:lang w:val="en-US" w:eastAsia="zh-CN"/>
-              </w:rPr>
-              <w:t>get_min_bound / get_max_bound()</w:t>
-            </w:r>
-          </w:p>
-        </w:tc>
-        <w:tc>
-          <w:tcPr>
-            <w:tcW w:w="0" w:type="auto"/>
-            <w:vAlign w:val="center"/>
-          </w:tcPr>
-          <w:p>
-            <w:pPr>
-              <w:pStyle w:val="11"/>
-              <w:bidi w:val="0"/>
-              <w:jc w:val="both"/>
-              <w:rPr>
-                <w:rFonts w:hint="default"/>
-                <w:lang w:val="en-US" w:eastAsia="zh-CN"/>
-              </w:rPr>
-            </w:pPr>
-            <w:r>
-              <w:rPr>
-                <w:rFonts w:hint="eastAsia"/>
-                <w:lang w:val="en-US" w:eastAsia="zh-CN"/>
-              </w:rPr>
-              <w:t>边界</w:t>
             </w:r>
           </w:p>
         </w:tc>
@@ -3117,6 +3650,12 @@
             <w:insideH w:val="single" w:color="auto" w:sz="4" w:space="0"/>
             <w:insideV w:val="single" w:color="auto" w:sz="4" w:space="0"/>
           </w:tblBorders>
+          <w:tblCellMar>
+            <w:top w:w="0" w:type="dxa"/>
+            <w:left w:w="108" w:type="dxa"/>
+            <w:bottom w:w="0" w:type="dxa"/>
+            <w:right w:w="108" w:type="dxa"/>
+          </w:tblCellMar>
         </w:tblPrEx>
         <w:tc>
           <w:tcPr>
@@ -3763,6 +4302,12 @@
             <w:insideH w:val="single" w:color="auto" w:sz="4" w:space="0"/>
             <w:insideV w:val="single" w:color="auto" w:sz="4" w:space="0"/>
           </w:tblBorders>
+          <w:tblCellMar>
+            <w:top w:w="0" w:type="dxa"/>
+            <w:left w:w="108" w:type="dxa"/>
+            <w:bottom w:w="0" w:type="dxa"/>
+            <w:right w:w="108" w:type="dxa"/>
+          </w:tblCellMar>
         </w:tblPrEx>
         <w:tc>
           <w:tcPr>
@@ -4015,6 +4560,952 @@
                 <w:lang w:val="en-US" w:eastAsia="zh-CN"/>
               </w:rPr>
               <w:t>渲染</w:t>
+            </w:r>
+          </w:p>
+        </w:tc>
+      </w:tr>
+    </w:tbl>
+    <w:p>
+      <w:pPr>
+        <w:rPr>
+          <w:rFonts w:hint="default" w:ascii="华文中宋" w:hAnsi="华文中宋" w:eastAsia="华文中宋" w:cs="华文中宋"/>
+          <w:b/>
+          <w:bCs/>
+          <w:color w:val="FF0000"/>
+          <w:kern w:val="2"/>
+          <w:sz w:val="21"/>
+          <w:szCs w:val="21"/>
+          <w:lang w:val="en-US" w:eastAsia="zh-CN" w:bidi="ar-SA"/>
+        </w:rPr>
+      </w:pPr>
+    </w:p>
+    <w:p>
+      <w:pPr>
+        <w:rPr>
+          <w:rFonts w:hint="default" w:ascii="华文中宋" w:hAnsi="华文中宋" w:eastAsia="华文中宋" w:cs="华文中宋"/>
+          <w:b/>
+          <w:bCs/>
+          <w:color w:val="FF0000"/>
+          <w:kern w:val="2"/>
+          <w:sz w:val="21"/>
+          <w:szCs w:val="21"/>
+          <w:lang w:val="en-US" w:eastAsia="zh-CN" w:bidi="ar-SA"/>
+        </w:rPr>
+      </w:pPr>
+    </w:p>
+    <w:p>
+      <w:pPr>
+        <w:rPr>
+          <w:rFonts w:hint="default" w:ascii="华文中宋" w:hAnsi="华文中宋" w:eastAsia="华文中宋" w:cs="华文中宋"/>
+          <w:b/>
+          <w:bCs/>
+          <w:color w:val="FF0000"/>
+          <w:kern w:val="2"/>
+          <w:sz w:val="21"/>
+          <w:szCs w:val="21"/>
+          <w:lang w:val="en-US" w:eastAsia="zh-CN" w:bidi="ar-SA"/>
+        </w:rPr>
+      </w:pPr>
+    </w:p>
+    <w:p>
+      <w:pPr>
+        <w:pStyle w:val="2"/>
+        <w:bidi w:val="0"/>
+        <w:rPr>
+          <w:rFonts w:hint="default" w:ascii="华文中宋" w:hAnsi="华文中宋" w:eastAsia="华文中宋" w:cs="华文中宋"/>
+          <w:b/>
+          <w:bCs/>
+          <w:color w:val="FF0000"/>
+          <w:kern w:val="2"/>
+          <w:sz w:val="21"/>
+          <w:szCs w:val="21"/>
+          <w:lang w:val="en-US" w:eastAsia="zh-CN" w:bidi="ar-SA"/>
+        </w:rPr>
+      </w:pPr>
+      <w:r>
+        <w:rPr>
+          <w:rFonts w:hint="eastAsia"/>
+          <w:lang w:val="en-US" w:eastAsia="zh-CN"/>
+        </w:rPr>
+        <w:t>网格trimesh：</w:t>
+      </w:r>
+    </w:p>
+    <w:tbl>
+      <w:tblPr>
+        <w:tblStyle w:val="8"/>
+        <w:tblW w:w="0" w:type="auto"/>
+        <w:tblInd w:w="0" w:type="dxa"/>
+        <w:tblBorders>
+          <w:top w:val="single" w:color="auto" w:sz="4" w:space="0"/>
+          <w:left w:val="single" w:color="auto" w:sz="4" w:space="0"/>
+          <w:bottom w:val="single" w:color="auto" w:sz="4" w:space="0"/>
+          <w:right w:val="single" w:color="auto" w:sz="4" w:space="0"/>
+          <w:insideH w:val="single" w:color="auto" w:sz="4" w:space="0"/>
+          <w:insideV w:val="single" w:color="auto" w:sz="4" w:space="0"/>
+        </w:tblBorders>
+        <w:tblLayout w:type="autofit"/>
+        <w:tblCellMar>
+          <w:top w:w="0" w:type="dxa"/>
+          <w:left w:w="108" w:type="dxa"/>
+          <w:bottom w:w="0" w:type="dxa"/>
+          <w:right w:w="108" w:type="dxa"/>
+        </w:tblCellMar>
+      </w:tblPr>
+      <w:tblGrid>
+        <w:gridCol w:w="1080"/>
+        <w:gridCol w:w="637"/>
+      </w:tblGrid>
+      <w:tr>
+        <w:tblPrEx>
+          <w:tblBorders>
+            <w:top w:val="single" w:color="auto" w:sz="4" w:space="0"/>
+            <w:left w:val="single" w:color="auto" w:sz="4" w:space="0"/>
+            <w:bottom w:val="single" w:color="auto" w:sz="4" w:space="0"/>
+            <w:right w:val="single" w:color="auto" w:sz="4" w:space="0"/>
+            <w:insideH w:val="single" w:color="auto" w:sz="4" w:space="0"/>
+            <w:insideV w:val="single" w:color="auto" w:sz="4" w:space="0"/>
+          </w:tblBorders>
+          <w:tblCellMar>
+            <w:top w:w="0" w:type="dxa"/>
+            <w:left w:w="108" w:type="dxa"/>
+            <w:bottom w:w="0" w:type="dxa"/>
+            <w:right w:w="108" w:type="dxa"/>
+          </w:tblCellMar>
+        </w:tblPrEx>
+        <w:tc>
+          <w:tcPr>
+            <w:tcW w:w="0" w:type="auto"/>
+          </w:tcPr>
+          <w:p>
+            <w:pPr>
+              <w:pStyle w:val="12"/>
+              <w:bidi w:val="0"/>
+              <w:rPr>
+                <w:rFonts w:hint="default"/>
+                <w:lang w:val="en-US" w:eastAsia="zh-CN"/>
+              </w:rPr>
+            </w:pPr>
+            <w:r>
+              <w:rPr>
+                <w:rFonts w:hint="eastAsia"/>
+                <w:lang w:val="en-US" w:eastAsia="zh-CN"/>
+              </w:rPr>
+              <w:t>load(file)</w:t>
+            </w:r>
+          </w:p>
+        </w:tc>
+        <w:tc>
+          <w:tcPr>
+            <w:tcW w:w="0" w:type="auto"/>
+          </w:tcPr>
+          <w:p>
+            <w:pPr>
+              <w:pStyle w:val="11"/>
+              <w:bidi w:val="0"/>
+              <w:rPr>
+                <w:rFonts w:hint="default"/>
+                <w:lang w:val="en-US" w:eastAsia="zh-CN"/>
+              </w:rPr>
+            </w:pPr>
+            <w:r>
+              <w:rPr>
+                <w:rFonts w:hint="eastAsia"/>
+                <w:lang w:val="en-US" w:eastAsia="zh-CN"/>
+              </w:rPr>
+              <w:t>加载</w:t>
+            </w:r>
+          </w:p>
+        </w:tc>
+      </w:tr>
+    </w:tbl>
+    <w:p>
+      <w:pPr>
+        <w:rPr>
+          <w:rFonts w:hint="default" w:ascii="华文中宋" w:hAnsi="华文中宋" w:eastAsia="华文中宋" w:cs="华文中宋"/>
+          <w:b/>
+          <w:bCs/>
+          <w:color w:val="FF0000"/>
+          <w:kern w:val="2"/>
+          <w:sz w:val="21"/>
+          <w:szCs w:val="21"/>
+          <w:lang w:val="en-US" w:eastAsia="zh-CN" w:bidi="ar-SA"/>
+        </w:rPr>
+      </w:pPr>
+    </w:p>
+    <w:tbl>
+      <w:tblPr>
+        <w:tblStyle w:val="8"/>
+        <w:tblW w:w="0" w:type="auto"/>
+        <w:tblInd w:w="0" w:type="dxa"/>
+        <w:tblBorders>
+          <w:top w:val="single" w:color="auto" w:sz="4" w:space="0"/>
+          <w:left w:val="single" w:color="auto" w:sz="4" w:space="0"/>
+          <w:bottom w:val="single" w:color="auto" w:sz="4" w:space="0"/>
+          <w:right w:val="single" w:color="auto" w:sz="4" w:space="0"/>
+          <w:insideH w:val="single" w:color="auto" w:sz="4" w:space="0"/>
+          <w:insideV w:val="single" w:color="auto" w:sz="4" w:space="0"/>
+        </w:tblBorders>
+        <w:tblLayout w:type="autofit"/>
+        <w:tblCellMar>
+          <w:top w:w="0" w:type="dxa"/>
+          <w:left w:w="108" w:type="dxa"/>
+          <w:bottom w:w="0" w:type="dxa"/>
+          <w:right w:w="108" w:type="dxa"/>
+        </w:tblCellMar>
+      </w:tblPr>
+      <w:tblGrid>
+        <w:gridCol w:w="1057"/>
+        <w:gridCol w:w="2821"/>
+        <w:gridCol w:w="1057"/>
+      </w:tblGrid>
+      <w:tr>
+        <w:tblPrEx>
+          <w:tblBorders>
+            <w:top w:val="single" w:color="auto" w:sz="4" w:space="0"/>
+            <w:left w:val="single" w:color="auto" w:sz="4" w:space="0"/>
+            <w:bottom w:val="single" w:color="auto" w:sz="4" w:space="0"/>
+            <w:right w:val="single" w:color="auto" w:sz="4" w:space="0"/>
+            <w:insideH w:val="single" w:color="auto" w:sz="4" w:space="0"/>
+            <w:insideV w:val="single" w:color="auto" w:sz="4" w:space="0"/>
+          </w:tblBorders>
+          <w:tblCellMar>
+            <w:top w:w="0" w:type="dxa"/>
+            <w:left w:w="108" w:type="dxa"/>
+            <w:bottom w:w="0" w:type="dxa"/>
+            <w:right w:w="108" w:type="dxa"/>
+          </w:tblCellMar>
+        </w:tblPrEx>
+        <w:tc>
+          <w:tcPr>
+            <w:tcW w:w="0" w:type="auto"/>
+            <w:gridSpan w:val="2"/>
+            <w:vAlign w:val="center"/>
+          </w:tcPr>
+          <w:p>
+            <w:pPr>
+              <w:pStyle w:val="12"/>
+              <w:bidi w:val="0"/>
+              <w:jc w:val="both"/>
+              <w:rPr>
+                <w:rFonts w:hint="default"/>
+                <w:lang w:val="en-US" w:eastAsia="zh-CN"/>
+              </w:rPr>
+            </w:pPr>
+            <w:r>
+              <w:rPr>
+                <w:rFonts w:hint="eastAsia"/>
+                <w:lang w:val="en-US" w:eastAsia="zh-CN"/>
+              </w:rPr>
+              <w:t>Geometry</w:t>
+            </w:r>
+          </w:p>
+        </w:tc>
+        <w:tc>
+          <w:tcPr>
+            <w:tcW w:w="0" w:type="auto"/>
+            <w:vAlign w:val="center"/>
+          </w:tcPr>
+          <w:p>
+            <w:pPr>
+              <w:pStyle w:val="11"/>
+              <w:bidi w:val="0"/>
+              <w:jc w:val="both"/>
+              <w:rPr>
+                <w:rFonts w:hint="default"/>
+                <w:vertAlign w:val="baseline"/>
+                <w:lang w:val="en-US" w:eastAsia="zh-CN"/>
+              </w:rPr>
+            </w:pPr>
+            <w:r>
+              <w:rPr>
+                <w:rFonts w:hint="eastAsia"/>
+                <w:lang w:val="en-US" w:eastAsia="zh-CN"/>
+              </w:rPr>
+              <w:t>几何</w:t>
+            </w:r>
+          </w:p>
+        </w:tc>
+      </w:tr>
+      <w:tr>
+        <w:tblPrEx>
+          <w:tblBorders>
+            <w:top w:val="single" w:color="auto" w:sz="4" w:space="0"/>
+            <w:left w:val="single" w:color="auto" w:sz="4" w:space="0"/>
+            <w:bottom w:val="single" w:color="auto" w:sz="4" w:space="0"/>
+            <w:right w:val="single" w:color="auto" w:sz="4" w:space="0"/>
+            <w:insideH w:val="single" w:color="auto" w:sz="4" w:space="0"/>
+            <w:insideV w:val="single" w:color="auto" w:sz="4" w:space="0"/>
+          </w:tblBorders>
+          <w:tblCellMar>
+            <w:top w:w="0" w:type="dxa"/>
+            <w:left w:w="108" w:type="dxa"/>
+            <w:bottom w:w="0" w:type="dxa"/>
+            <w:right w:w="108" w:type="dxa"/>
+          </w:tblCellMar>
+        </w:tblPrEx>
+        <w:tc>
+          <w:tcPr>
+            <w:tcW w:w="0" w:type="auto"/>
+            <w:vMerge w:val="restart"/>
+            <w:vAlign w:val="center"/>
+          </w:tcPr>
+          <w:p>
+            <w:pPr>
+              <w:pStyle w:val="12"/>
+              <w:bidi w:val="0"/>
+              <w:jc w:val="both"/>
+              <w:rPr>
+                <w:rFonts w:hint="default"/>
+                <w:lang w:val="en-US" w:eastAsia="zh-CN"/>
+              </w:rPr>
+            </w:pPr>
+            <w:r>
+              <w:rPr>
+                <w:rFonts w:hint="eastAsia" w:ascii="华文中宋" w:hAnsi="华文中宋" w:eastAsia="华文中宋" w:cs="华文中宋"/>
+                <w:b/>
+                <w:bCs/>
+                <w:color w:val="ED7D31"/>
+                <w:kern w:val="2"/>
+                <w:sz w:val="21"/>
+                <w:szCs w:val="21"/>
+                <w:lang w:val="en-US" w:eastAsia="zh-CN" w:bidi="ar-SA"/>
+              </w:rPr>
+              <w:t>实例</w:t>
+            </w:r>
+            <w:r>
+              <w:rPr>
+                <w:rFonts w:hint="eastAsia" w:cs="华文中宋"/>
+                <w:b/>
+                <w:bCs/>
+                <w:color w:val="ED7D31"/>
+                <w:kern w:val="2"/>
+                <w:sz w:val="21"/>
+                <w:szCs w:val="21"/>
+                <w:lang w:val="en-US" w:eastAsia="zh-CN" w:bidi="ar-SA"/>
+              </w:rPr>
+              <w:t>属性</w:t>
+            </w:r>
+          </w:p>
+        </w:tc>
+        <w:tc>
+          <w:tcPr>
+            <w:tcW w:w="0" w:type="auto"/>
+            <w:vAlign w:val="center"/>
+          </w:tcPr>
+          <w:p>
+            <w:pPr>
+              <w:pStyle w:val="12"/>
+              <w:bidi w:val="0"/>
+              <w:jc w:val="both"/>
+              <w:rPr>
+                <w:rFonts w:hint="default"/>
+                <w:lang w:val="en-US" w:eastAsia="zh-CN"/>
+              </w:rPr>
+            </w:pPr>
+            <w:r>
+              <w:rPr>
+                <w:rFonts w:hint="eastAsia"/>
+                <w:lang w:val="en-US" w:eastAsia="zh-CN"/>
+              </w:rPr>
+              <w:t>source</w:t>
+            </w:r>
+          </w:p>
+        </w:tc>
+        <w:tc>
+          <w:tcPr>
+            <w:tcW w:w="0" w:type="auto"/>
+            <w:vAlign w:val="center"/>
+          </w:tcPr>
+          <w:p>
+            <w:pPr>
+              <w:pStyle w:val="11"/>
+              <w:bidi w:val="0"/>
+              <w:jc w:val="both"/>
+              <w:rPr>
+                <w:rFonts w:hint="default"/>
+                <w:lang w:val="en-US" w:eastAsia="zh-CN"/>
+              </w:rPr>
+            </w:pPr>
+            <w:r>
+              <w:rPr>
+                <w:rFonts w:hint="eastAsia"/>
+                <w:lang w:val="en-US" w:eastAsia="zh-CN"/>
+              </w:rPr>
+              <w:t>数据源</w:t>
+            </w:r>
+          </w:p>
+        </w:tc>
+      </w:tr>
+      <w:tr>
+        <w:tblPrEx>
+          <w:tblBorders>
+            <w:top w:val="single" w:color="auto" w:sz="4" w:space="0"/>
+            <w:left w:val="single" w:color="auto" w:sz="4" w:space="0"/>
+            <w:bottom w:val="single" w:color="auto" w:sz="4" w:space="0"/>
+            <w:right w:val="single" w:color="auto" w:sz="4" w:space="0"/>
+            <w:insideH w:val="single" w:color="auto" w:sz="4" w:space="0"/>
+            <w:insideV w:val="single" w:color="auto" w:sz="4" w:space="0"/>
+          </w:tblBorders>
+          <w:tblCellMar>
+            <w:top w:w="0" w:type="dxa"/>
+            <w:left w:w="108" w:type="dxa"/>
+            <w:bottom w:w="0" w:type="dxa"/>
+            <w:right w:w="108" w:type="dxa"/>
+          </w:tblCellMar>
+        </w:tblPrEx>
+        <w:tc>
+          <w:tcPr>
+            <w:tcW w:w="0" w:type="auto"/>
+            <w:vMerge w:val="continue"/>
+            <w:tcBorders/>
+            <w:vAlign w:val="center"/>
+          </w:tcPr>
+          <w:p>
+            <w:pPr>
+              <w:pStyle w:val="12"/>
+              <w:bidi w:val="0"/>
+              <w:jc w:val="both"/>
+              <w:rPr>
+                <w:rFonts w:hint="default"/>
+                <w:lang w:val="en-US" w:eastAsia="zh-CN"/>
+              </w:rPr>
+            </w:pPr>
+          </w:p>
+        </w:tc>
+        <w:tc>
+          <w:tcPr>
+            <w:tcW w:w="0" w:type="auto"/>
+            <w:vAlign w:val="center"/>
+          </w:tcPr>
+          <w:p>
+            <w:pPr>
+              <w:pStyle w:val="12"/>
+              <w:bidi w:val="0"/>
+              <w:jc w:val="both"/>
+              <w:rPr>
+                <w:rFonts w:hint="default"/>
+                <w:lang w:val="en-US" w:eastAsia="zh-CN"/>
+              </w:rPr>
+            </w:pPr>
+            <w:r>
+              <w:rPr>
+                <w:rFonts w:hint="eastAsia"/>
+                <w:lang w:val="en-US" w:eastAsia="zh-CN"/>
+              </w:rPr>
+              <w:t>bounds</w:t>
+            </w:r>
+          </w:p>
+        </w:tc>
+        <w:tc>
+          <w:tcPr>
+            <w:tcW w:w="0" w:type="auto"/>
+            <w:vAlign w:val="center"/>
+          </w:tcPr>
+          <w:p>
+            <w:pPr>
+              <w:pStyle w:val="11"/>
+              <w:bidi w:val="0"/>
+              <w:jc w:val="both"/>
+              <w:rPr>
+                <w:rFonts w:hint="default"/>
+                <w:lang w:val="en-US" w:eastAsia="zh-CN"/>
+              </w:rPr>
+            </w:pPr>
+            <w:r>
+              <w:rPr>
+                <w:rFonts w:hint="eastAsia"/>
+                <w:lang w:val="en-US" w:eastAsia="zh-CN"/>
+              </w:rPr>
+              <w:t>边界</w:t>
+            </w:r>
+          </w:p>
+        </w:tc>
+      </w:tr>
+      <w:tr>
+        <w:tblPrEx>
+          <w:tblBorders>
+            <w:top w:val="single" w:color="auto" w:sz="4" w:space="0"/>
+            <w:left w:val="single" w:color="auto" w:sz="4" w:space="0"/>
+            <w:bottom w:val="single" w:color="auto" w:sz="4" w:space="0"/>
+            <w:right w:val="single" w:color="auto" w:sz="4" w:space="0"/>
+            <w:insideH w:val="single" w:color="auto" w:sz="4" w:space="0"/>
+            <w:insideV w:val="single" w:color="auto" w:sz="4" w:space="0"/>
+          </w:tblBorders>
+          <w:tblCellMar>
+            <w:top w:w="0" w:type="dxa"/>
+            <w:left w:w="108" w:type="dxa"/>
+            <w:bottom w:w="0" w:type="dxa"/>
+            <w:right w:w="108" w:type="dxa"/>
+          </w:tblCellMar>
+        </w:tblPrEx>
+        <w:tc>
+          <w:tcPr>
+            <w:tcW w:w="0" w:type="auto"/>
+            <w:vMerge w:val="continue"/>
+            <w:tcBorders/>
+            <w:vAlign w:val="center"/>
+          </w:tcPr>
+          <w:p>
+            <w:pPr>
+              <w:pStyle w:val="12"/>
+              <w:bidi w:val="0"/>
+              <w:jc w:val="both"/>
+              <w:rPr>
+                <w:rFonts w:hint="eastAsia" w:ascii="华文中宋" w:hAnsi="华文中宋" w:eastAsia="华文中宋" w:cs="华文中宋"/>
+                <w:b/>
+                <w:bCs/>
+                <w:color w:val="ED7D31"/>
+                <w:kern w:val="2"/>
+                <w:sz w:val="21"/>
+                <w:szCs w:val="21"/>
+                <w:lang w:val="en-US" w:eastAsia="zh-CN" w:bidi="ar-SA"/>
+              </w:rPr>
+            </w:pPr>
+          </w:p>
+        </w:tc>
+        <w:tc>
+          <w:tcPr>
+            <w:tcW w:w="0" w:type="auto"/>
+            <w:vAlign w:val="center"/>
+          </w:tcPr>
+          <w:p>
+            <w:pPr>
+              <w:pStyle w:val="12"/>
+              <w:bidi w:val="0"/>
+              <w:jc w:val="both"/>
+              <w:rPr>
+                <w:rFonts w:hint="default"/>
+                <w:lang w:val="en-US" w:eastAsia="zh-CN"/>
+              </w:rPr>
+            </w:pPr>
+            <w:r>
+              <w:rPr>
+                <w:rFonts w:hint="eastAsia"/>
+                <w:lang w:val="en-US" w:eastAsia="zh-CN"/>
+              </w:rPr>
+              <w:t>extents</w:t>
+            </w:r>
+          </w:p>
+        </w:tc>
+        <w:tc>
+          <w:tcPr>
+            <w:tcW w:w="0" w:type="auto"/>
+            <w:vAlign w:val="center"/>
+          </w:tcPr>
+          <w:p>
+            <w:pPr>
+              <w:pStyle w:val="11"/>
+              <w:bidi w:val="0"/>
+              <w:jc w:val="both"/>
+              <w:rPr>
+                <w:rFonts w:hint="default"/>
+                <w:lang w:val="en-US" w:eastAsia="zh-CN"/>
+              </w:rPr>
+            </w:pPr>
+            <w:r>
+              <w:rPr>
+                <w:rFonts w:hint="eastAsia"/>
+                <w:lang w:val="en-US" w:eastAsia="zh-CN"/>
+              </w:rPr>
+              <w:t>尺度</w:t>
+            </w:r>
+          </w:p>
+        </w:tc>
+      </w:tr>
+      <w:tr>
+        <w:tblPrEx>
+          <w:tblBorders>
+            <w:top w:val="single" w:color="auto" w:sz="4" w:space="0"/>
+            <w:left w:val="single" w:color="auto" w:sz="4" w:space="0"/>
+            <w:bottom w:val="single" w:color="auto" w:sz="4" w:space="0"/>
+            <w:right w:val="single" w:color="auto" w:sz="4" w:space="0"/>
+            <w:insideH w:val="single" w:color="auto" w:sz="4" w:space="0"/>
+            <w:insideV w:val="single" w:color="auto" w:sz="4" w:space="0"/>
+          </w:tblBorders>
+          <w:tblCellMar>
+            <w:top w:w="0" w:type="dxa"/>
+            <w:left w:w="108" w:type="dxa"/>
+            <w:bottom w:w="0" w:type="dxa"/>
+            <w:right w:w="108" w:type="dxa"/>
+          </w:tblCellMar>
+        </w:tblPrEx>
+        <w:tc>
+          <w:tcPr>
+            <w:tcW w:w="0" w:type="auto"/>
+            <w:vMerge w:val="restart"/>
+            <w:vAlign w:val="center"/>
+          </w:tcPr>
+          <w:p>
+            <w:pPr>
+              <w:pStyle w:val="12"/>
+              <w:bidi w:val="0"/>
+              <w:jc w:val="both"/>
+              <w:rPr>
+                <w:rFonts w:hint="eastAsia" w:ascii="华文中宋" w:hAnsi="华文中宋" w:eastAsia="华文中宋" w:cs="华文中宋"/>
+                <w:b/>
+                <w:bCs/>
+                <w:color w:val="ED7D31"/>
+                <w:kern w:val="2"/>
+                <w:sz w:val="21"/>
+                <w:szCs w:val="21"/>
+                <w:lang w:val="en-US" w:eastAsia="zh-CN" w:bidi="ar-SA"/>
+              </w:rPr>
+            </w:pPr>
+            <w:r>
+              <w:rPr>
+                <w:rFonts w:hint="eastAsia" w:ascii="华文中宋" w:hAnsi="华文中宋" w:eastAsia="华文中宋" w:cs="华文中宋"/>
+                <w:b/>
+                <w:bCs/>
+                <w:color w:val="ED7D31"/>
+                <w:kern w:val="2"/>
+                <w:sz w:val="21"/>
+                <w:szCs w:val="21"/>
+                <w:lang w:val="en-US" w:eastAsia="zh-CN" w:bidi="ar-SA"/>
+              </w:rPr>
+              <w:t>实例</w:t>
+            </w:r>
+            <w:r>
+              <w:rPr>
+                <w:rFonts w:hint="eastAsia" w:cs="华文中宋"/>
+                <w:b/>
+                <w:bCs/>
+                <w:color w:val="ED7D31"/>
+                <w:kern w:val="2"/>
+                <w:sz w:val="21"/>
+                <w:szCs w:val="21"/>
+                <w:lang w:val="en-US" w:eastAsia="zh-CN" w:bidi="ar-SA"/>
+              </w:rPr>
+              <w:t>方法</w:t>
+            </w:r>
+          </w:p>
+        </w:tc>
+        <w:tc>
+          <w:tcPr>
+            <w:tcW w:w="0" w:type="auto"/>
+            <w:vAlign w:val="center"/>
+          </w:tcPr>
+          <w:p>
+            <w:pPr>
+              <w:pStyle w:val="12"/>
+              <w:bidi w:val="0"/>
+              <w:jc w:val="both"/>
+              <w:rPr>
+                <w:rFonts w:hint="default"/>
+                <w:lang w:val="en-US" w:eastAsia="zh-CN"/>
+              </w:rPr>
+            </w:pPr>
+            <w:r>
+              <w:rPr>
+                <w:rFonts w:hint="eastAsia"/>
+                <w:lang w:val="en-US" w:eastAsia="zh-CN"/>
+              </w:rPr>
+              <w:t>show(background={RGB}</w:t>
+            </w:r>
+            <w:bookmarkStart w:id="0" w:name="_GoBack"/>
+            <w:bookmarkEnd w:id="0"/>
+            <w:r>
+              <w:rPr>
+                <w:rFonts w:hint="eastAsia"/>
+                <w:lang w:val="en-US" w:eastAsia="zh-CN"/>
+              </w:rPr>
+              <w:t>)</w:t>
+            </w:r>
+          </w:p>
+        </w:tc>
+        <w:tc>
+          <w:tcPr>
+            <w:tcW w:w="0" w:type="auto"/>
+            <w:vAlign w:val="center"/>
+          </w:tcPr>
+          <w:p>
+            <w:pPr>
+              <w:pStyle w:val="11"/>
+              <w:bidi w:val="0"/>
+              <w:jc w:val="both"/>
+              <w:rPr>
+                <w:rFonts w:hint="default"/>
+                <w:lang w:val="en-US" w:eastAsia="zh-CN"/>
+              </w:rPr>
+            </w:pPr>
+            <w:r>
+              <w:rPr>
+                <w:rFonts w:hint="eastAsia"/>
+                <w:lang w:val="en-US" w:eastAsia="zh-CN"/>
+              </w:rPr>
+              <w:t>可视化</w:t>
+            </w:r>
+          </w:p>
+        </w:tc>
+      </w:tr>
+      <w:tr>
+        <w:tblPrEx>
+          <w:tblBorders>
+            <w:top w:val="single" w:color="auto" w:sz="4" w:space="0"/>
+            <w:left w:val="single" w:color="auto" w:sz="4" w:space="0"/>
+            <w:bottom w:val="single" w:color="auto" w:sz="4" w:space="0"/>
+            <w:right w:val="single" w:color="auto" w:sz="4" w:space="0"/>
+            <w:insideH w:val="single" w:color="auto" w:sz="4" w:space="0"/>
+            <w:insideV w:val="single" w:color="auto" w:sz="4" w:space="0"/>
+          </w:tblBorders>
+          <w:tblCellMar>
+            <w:top w:w="0" w:type="dxa"/>
+            <w:left w:w="108" w:type="dxa"/>
+            <w:bottom w:w="0" w:type="dxa"/>
+            <w:right w:w="108" w:type="dxa"/>
+          </w:tblCellMar>
+        </w:tblPrEx>
+        <w:tc>
+          <w:tcPr>
+            <w:tcW w:w="0" w:type="auto"/>
+            <w:vMerge w:val="continue"/>
+            <w:tcBorders/>
+            <w:vAlign w:val="center"/>
+          </w:tcPr>
+          <w:p>
+            <w:pPr>
+              <w:pStyle w:val="12"/>
+              <w:bidi w:val="0"/>
+              <w:jc w:val="both"/>
+              <w:rPr>
+                <w:rFonts w:hint="eastAsia" w:ascii="华文中宋" w:hAnsi="华文中宋" w:eastAsia="华文中宋" w:cs="华文中宋"/>
+                <w:b/>
+                <w:bCs/>
+                <w:color w:val="ED7D31"/>
+                <w:kern w:val="2"/>
+                <w:sz w:val="21"/>
+                <w:szCs w:val="21"/>
+                <w:lang w:val="en-US" w:eastAsia="zh-CN" w:bidi="ar-SA"/>
+              </w:rPr>
+            </w:pPr>
+          </w:p>
+        </w:tc>
+        <w:tc>
+          <w:tcPr>
+            <w:tcW w:w="0" w:type="auto"/>
+            <w:vAlign w:val="center"/>
+          </w:tcPr>
+          <w:p>
+            <w:pPr>
+              <w:pStyle w:val="12"/>
+              <w:bidi w:val="0"/>
+              <w:jc w:val="both"/>
+              <w:rPr>
+                <w:rFonts w:hint="default"/>
+                <w:lang w:val="en-US" w:eastAsia="zh-CN"/>
+              </w:rPr>
+            </w:pPr>
+            <w:r>
+              <w:rPr>
+                <w:rFonts w:hint="eastAsia"/>
+                <w:lang w:val="en-US" w:eastAsia="zh-CN"/>
+              </w:rPr>
+              <w:t>apply_scale(s)</w:t>
+            </w:r>
+          </w:p>
+        </w:tc>
+        <w:tc>
+          <w:tcPr>
+            <w:tcW w:w="0" w:type="auto"/>
+            <w:vAlign w:val="center"/>
+          </w:tcPr>
+          <w:p>
+            <w:pPr>
+              <w:pStyle w:val="11"/>
+              <w:bidi w:val="0"/>
+              <w:jc w:val="both"/>
+              <w:rPr>
+                <w:rFonts w:hint="default"/>
+                <w:lang w:val="en-US" w:eastAsia="zh-CN"/>
+              </w:rPr>
+            </w:pPr>
+            <w:r>
+              <w:rPr>
+                <w:rFonts w:hint="eastAsia"/>
+                <w:lang w:val="en-US" w:eastAsia="zh-CN"/>
+              </w:rPr>
+              <w:t>缩放</w:t>
+            </w:r>
+          </w:p>
+        </w:tc>
+      </w:tr>
+      <w:tr>
+        <w:tblPrEx>
+          <w:tblBorders>
+            <w:top w:val="single" w:color="auto" w:sz="4" w:space="0"/>
+            <w:left w:val="single" w:color="auto" w:sz="4" w:space="0"/>
+            <w:bottom w:val="single" w:color="auto" w:sz="4" w:space="0"/>
+            <w:right w:val="single" w:color="auto" w:sz="4" w:space="0"/>
+            <w:insideH w:val="single" w:color="auto" w:sz="4" w:space="0"/>
+            <w:insideV w:val="single" w:color="auto" w:sz="4" w:space="0"/>
+          </w:tblBorders>
+          <w:tblCellMar>
+            <w:top w:w="0" w:type="dxa"/>
+            <w:left w:w="108" w:type="dxa"/>
+            <w:bottom w:w="0" w:type="dxa"/>
+            <w:right w:w="108" w:type="dxa"/>
+          </w:tblCellMar>
+        </w:tblPrEx>
+        <w:tc>
+          <w:tcPr>
+            <w:tcW w:w="0" w:type="auto"/>
+            <w:vMerge w:val="continue"/>
+            <w:tcBorders/>
+            <w:vAlign w:val="center"/>
+          </w:tcPr>
+          <w:p>
+            <w:pPr>
+              <w:pStyle w:val="12"/>
+              <w:bidi w:val="0"/>
+              <w:jc w:val="both"/>
+              <w:rPr>
+                <w:rFonts w:hint="eastAsia" w:ascii="华文中宋" w:hAnsi="华文中宋" w:eastAsia="华文中宋" w:cs="华文中宋"/>
+                <w:b/>
+                <w:bCs/>
+                <w:color w:val="ED7D31"/>
+                <w:kern w:val="2"/>
+                <w:sz w:val="21"/>
+                <w:szCs w:val="21"/>
+                <w:lang w:val="en-US" w:eastAsia="zh-CN" w:bidi="ar-SA"/>
+              </w:rPr>
+            </w:pPr>
+          </w:p>
+        </w:tc>
+        <w:tc>
+          <w:tcPr>
+            <w:tcW w:w="0" w:type="auto"/>
+            <w:vAlign w:val="center"/>
+          </w:tcPr>
+          <w:p>
+            <w:pPr>
+              <w:pStyle w:val="12"/>
+              <w:bidi w:val="0"/>
+              <w:jc w:val="both"/>
+              <w:rPr>
+                <w:rFonts w:hint="default"/>
+                <w:lang w:val="en-US" w:eastAsia="zh-CN"/>
+              </w:rPr>
+            </w:pPr>
+            <w:r>
+              <w:rPr>
+                <w:rFonts w:hint="eastAsia"/>
+                <w:lang w:val="en-US" w:eastAsia="zh-CN"/>
+              </w:rPr>
+              <w:t>apply_translation(vec)</w:t>
+            </w:r>
+          </w:p>
+        </w:tc>
+        <w:tc>
+          <w:tcPr>
+            <w:tcW w:w="0" w:type="auto"/>
+            <w:vAlign w:val="center"/>
+          </w:tcPr>
+          <w:p>
+            <w:pPr>
+              <w:pStyle w:val="11"/>
+              <w:bidi w:val="0"/>
+              <w:jc w:val="both"/>
+              <w:rPr>
+                <w:rFonts w:hint="default"/>
+                <w:lang w:val="en-US" w:eastAsia="zh-CN"/>
+              </w:rPr>
+            </w:pPr>
+            <w:r>
+              <w:rPr>
+                <w:rFonts w:hint="eastAsia"/>
+                <w:lang w:val="en-US" w:eastAsia="zh-CN"/>
+              </w:rPr>
+              <w:t>平移</w:t>
+            </w:r>
+          </w:p>
+        </w:tc>
+      </w:tr>
+      <w:tr>
+        <w:tblPrEx>
+          <w:tblBorders>
+            <w:top w:val="single" w:color="auto" w:sz="4" w:space="0"/>
+            <w:left w:val="single" w:color="auto" w:sz="4" w:space="0"/>
+            <w:bottom w:val="single" w:color="auto" w:sz="4" w:space="0"/>
+            <w:right w:val="single" w:color="auto" w:sz="4" w:space="0"/>
+            <w:insideH w:val="single" w:color="auto" w:sz="4" w:space="0"/>
+            <w:insideV w:val="single" w:color="auto" w:sz="4" w:space="0"/>
+          </w:tblBorders>
+          <w:tblCellMar>
+            <w:top w:w="0" w:type="dxa"/>
+            <w:left w:w="108" w:type="dxa"/>
+            <w:bottom w:w="0" w:type="dxa"/>
+            <w:right w:w="108" w:type="dxa"/>
+          </w:tblCellMar>
+        </w:tblPrEx>
+        <w:tc>
+          <w:tcPr>
+            <w:tcW w:w="0" w:type="auto"/>
+            <w:vMerge w:val="continue"/>
+            <w:tcBorders/>
+            <w:vAlign w:val="center"/>
+          </w:tcPr>
+          <w:p>
+            <w:pPr>
+              <w:pStyle w:val="12"/>
+              <w:bidi w:val="0"/>
+              <w:jc w:val="both"/>
+              <w:rPr>
+                <w:rFonts w:hint="eastAsia" w:ascii="华文中宋" w:hAnsi="华文中宋" w:eastAsia="华文中宋" w:cs="华文中宋"/>
+                <w:b/>
+                <w:bCs/>
+                <w:color w:val="ED7D31"/>
+                <w:kern w:val="2"/>
+                <w:sz w:val="21"/>
+                <w:szCs w:val="21"/>
+                <w:lang w:val="en-US" w:eastAsia="zh-CN" w:bidi="ar-SA"/>
+              </w:rPr>
+            </w:pPr>
+          </w:p>
+        </w:tc>
+        <w:tc>
+          <w:tcPr>
+            <w:tcW w:w="0" w:type="auto"/>
+            <w:vAlign w:val="center"/>
+          </w:tcPr>
+          <w:p>
+            <w:pPr>
+              <w:pStyle w:val="12"/>
+              <w:bidi w:val="0"/>
+              <w:jc w:val="both"/>
+              <w:rPr>
+                <w:rFonts w:hint="default"/>
+                <w:lang w:val="en-US" w:eastAsia="zh-CN"/>
+              </w:rPr>
+            </w:pPr>
+            <w:r>
+              <w:rPr>
+                <w:rFonts w:hint="eastAsia"/>
+                <w:lang w:val="en-US" w:eastAsia="zh-CN"/>
+              </w:rPr>
+              <w:t>apply_transform(T)</w:t>
+            </w:r>
+          </w:p>
+        </w:tc>
+        <w:tc>
+          <w:tcPr>
+            <w:tcW w:w="0" w:type="auto"/>
+            <w:vAlign w:val="center"/>
+          </w:tcPr>
+          <w:p>
+            <w:pPr>
+              <w:pStyle w:val="11"/>
+              <w:bidi w:val="0"/>
+              <w:jc w:val="both"/>
+              <w:rPr>
+                <w:rFonts w:hint="default"/>
+                <w:lang w:val="en-US" w:eastAsia="zh-CN"/>
+              </w:rPr>
+            </w:pPr>
+            <w:r>
+              <w:rPr>
+                <w:rFonts w:hint="eastAsia"/>
+                <w:lang w:val="en-US" w:eastAsia="zh-CN"/>
+              </w:rPr>
+              <w:t>齐次变换</w:t>
             </w:r>
           </w:p>
         </w:tc>

</xml_diff>

<commit_message>
update on 2025-10-10 20:26:24.871587
</commit_message>
<xml_diff>
--- a/py 空间几何.docx
+++ b/py 空间几何.docx
@@ -436,7 +436,7 @@
         <w:tc>
           <w:tcPr>
             <w:tcW w:w="0" w:type="auto"/>
-            <w:shd w:val="clear"/>
+            <w:shd w:val="clear" w:color="auto" w:fill="auto"/>
             <w:vAlign w:val="center"/>
           </w:tcPr>
           <w:p>
@@ -467,7 +467,7 @@
         <w:tc>
           <w:tcPr>
             <w:tcW w:w="0" w:type="auto"/>
-            <w:shd w:val="clear"/>
+            <w:shd w:val="clear" w:color="auto" w:fill="auto"/>
             <w:vAlign w:val="center"/>
           </w:tcPr>
           <w:p>
@@ -517,7 +517,6 @@
           <w:tcPr>
             <w:tcW w:w="0" w:type="auto"/>
             <w:vMerge w:val="continue"/>
-            <w:tcBorders/>
             <w:vAlign w:val="center"/>
           </w:tcPr>
           <w:p>
@@ -541,7 +540,7 @@
         <w:tc>
           <w:tcPr>
             <w:tcW w:w="0" w:type="auto"/>
-            <w:shd w:val="clear"/>
+            <w:shd w:val="clear" w:color="auto" w:fill="auto"/>
             <w:vAlign w:val="center"/>
           </w:tcPr>
           <w:p>
@@ -572,7 +571,7 @@
         <w:tc>
           <w:tcPr>
             <w:tcW w:w="0" w:type="auto"/>
-            <w:shd w:val="clear"/>
+            <w:shd w:val="clear" w:color="auto" w:fill="auto"/>
             <w:vAlign w:val="center"/>
           </w:tcPr>
           <w:p>
@@ -597,6 +596,118 @@
                 <w:lang w:val="en-US" w:eastAsia="zh-CN"/>
               </w:rPr>
               <w:t>边界</w:t>
+            </w:r>
+          </w:p>
+        </w:tc>
+      </w:tr>
+      <w:tr>
+        <w:tblPrEx>
+          <w:tblBorders>
+            <w:top w:val="single" w:color="auto" w:sz="4" w:space="0"/>
+            <w:left w:val="single" w:color="auto" w:sz="4" w:space="0"/>
+            <w:bottom w:val="single" w:color="auto" w:sz="4" w:space="0"/>
+            <w:right w:val="single" w:color="auto" w:sz="4" w:space="0"/>
+            <w:insideH w:val="single" w:color="auto" w:sz="4" w:space="0"/>
+            <w:insideV w:val="single" w:color="auto" w:sz="4" w:space="0"/>
+          </w:tblBorders>
+        </w:tblPrEx>
+        <w:tc>
+          <w:tcPr>
+            <w:tcW w:w="0" w:type="auto"/>
+            <w:vMerge w:val="restart"/>
+            <w:vAlign w:val="center"/>
+          </w:tcPr>
+          <w:p>
+            <w:pPr>
+              <w:pStyle w:val="12"/>
+              <w:bidi w:val="0"/>
+              <w:jc w:val="both"/>
+              <w:rPr>
+                <w:rFonts w:hint="eastAsia" w:ascii="华文中宋" w:hAnsi="华文中宋" w:eastAsia="华文中宋" w:cs="华文中宋"/>
+                <w:b/>
+                <w:bCs/>
+                <w:color w:val="ED7D31"/>
+                <w:kern w:val="2"/>
+                <w:sz w:val="21"/>
+                <w:szCs w:val="21"/>
+                <w:lang w:val="en-US" w:eastAsia="zh-CN" w:bidi="ar-SA"/>
+              </w:rPr>
+            </w:pPr>
+            <w:r>
+              <w:rPr>
+                <w:rFonts w:hint="eastAsia" w:ascii="华文中宋" w:hAnsi="华文中宋" w:eastAsia="华文中宋" w:cs="华文中宋"/>
+                <w:b/>
+                <w:bCs/>
+                <w:color w:val="ED7D31"/>
+                <w:kern w:val="2"/>
+                <w:sz w:val="21"/>
+                <w:szCs w:val="21"/>
+                <w:lang w:val="en-US" w:eastAsia="zh-CN" w:bidi="ar-SA"/>
+              </w:rPr>
+              <w:t>实例</w:t>
+            </w:r>
+            <w:r>
+              <w:rPr>
+                <w:rFonts w:hint="eastAsia" w:cs="华文中宋"/>
+                <w:b/>
+                <w:bCs/>
+                <w:color w:val="ED7D31"/>
+                <w:kern w:val="2"/>
+                <w:sz w:val="21"/>
+                <w:szCs w:val="21"/>
+                <w:lang w:val="en-US" w:eastAsia="zh-CN" w:bidi="ar-SA"/>
+              </w:rPr>
+              <w:t>方法</w:t>
+            </w:r>
+          </w:p>
+        </w:tc>
+        <w:tc>
+          <w:tcPr>
+            <w:tcW w:w="0" w:type="auto"/>
+            <w:shd w:val="clear" w:color="auto" w:fill="auto"/>
+            <w:vAlign w:val="center"/>
+          </w:tcPr>
+          <w:p>
+            <w:pPr>
+              <w:pStyle w:val="12"/>
+              <w:bidi w:val="0"/>
+              <w:jc w:val="both"/>
+              <w:rPr>
+                <w:rFonts w:hint="default"/>
+                <w:lang w:val="en-US" w:eastAsia="zh-CN"/>
+              </w:rPr>
+            </w:pPr>
+            <w:r>
+              <w:rPr>
+                <w:rFonts w:hint="eastAsia"/>
+                <w:lang w:val="en-US" w:eastAsia="zh-CN"/>
+              </w:rPr>
+              <w:t>rotate(R)</w:t>
+            </w:r>
+          </w:p>
+        </w:tc>
+        <w:tc>
+          <w:tcPr>
+            <w:tcW w:w="0" w:type="auto"/>
+            <w:shd w:val="clear" w:color="auto" w:fill="auto"/>
+            <w:vAlign w:val="center"/>
+          </w:tcPr>
+          <w:p>
+            <w:pPr>
+              <w:pStyle w:val="11"/>
+              <w:bidi w:val="0"/>
+              <w:jc w:val="both"/>
+              <w:rPr>
+                <w:rFonts w:hint="default"/>
+                <w:lang w:val="en-US" w:eastAsia="zh-CN"/>
+              </w:rPr>
+            </w:pPr>
+            <w:r>
+              <w:rPr>
+                <w:rFonts w:hint="eastAsia"/>
+                <w:lang w:val="en-US" w:eastAsia="zh-CN"/>
+              </w:rPr>
+              <w:t>旋转</w:t>
             </w:r>
           </w:p>
         </w:tc>
@@ -621,7 +732,7 @@
         <w:tc>
           <w:tcPr>
             <w:tcW w:w="0" w:type="auto"/>
-            <w:vMerge w:val="restart"/>
+            <w:vMerge w:val="continue"/>
             <w:vAlign w:val="center"/>
           </w:tcPr>
           <w:p>
@@ -640,63 +751,37 @@
                 <w:lang w:val="en-US" w:eastAsia="zh-CN" w:bidi="ar-SA"/>
               </w:rPr>
             </w:pPr>
-            <w:r>
-              <w:rPr>
-                <w:rFonts w:hint="eastAsia" w:ascii="华文中宋" w:hAnsi="华文中宋" w:eastAsia="华文中宋" w:cs="华文中宋"/>
-                <w:b/>
-                <w:bCs/>
-                <w:color w:val="ED7D31"/>
-                <w:kern w:val="2"/>
-                <w:sz w:val="21"/>
-                <w:szCs w:val="21"/>
-                <w:lang w:val="en-US" w:eastAsia="zh-CN" w:bidi="ar-SA"/>
-              </w:rPr>
-              <w:t>实例</w:t>
-            </w:r>
-            <w:r>
-              <w:rPr>
-                <w:rFonts w:hint="eastAsia" w:cs="华文中宋"/>
-                <w:b/>
-                <w:bCs/>
-                <w:color w:val="ED7D31"/>
-                <w:kern w:val="2"/>
-                <w:sz w:val="21"/>
-                <w:szCs w:val="21"/>
-                <w:lang w:val="en-US" w:eastAsia="zh-CN" w:bidi="ar-SA"/>
-              </w:rPr>
-              <w:t>方法</w:t>
-            </w:r>
-          </w:p>
-        </w:tc>
-        <w:tc>
-          <w:tcPr>
-            <w:tcW w:w="0" w:type="auto"/>
-            <w:shd w:val="clear"/>
-            <w:vAlign w:val="center"/>
-          </w:tcPr>
-          <w:p>
-            <w:pPr>
-              <w:pStyle w:val="12"/>
-              <w:bidi w:val="0"/>
-              <w:jc w:val="both"/>
-              <w:rPr>
-                <w:rFonts w:hint="default"/>
-                <w:lang w:val="en-US" w:eastAsia="zh-CN"/>
-              </w:rPr>
-            </w:pPr>
-            <w:r>
-              <w:rPr>
-                <w:rFonts w:hint="eastAsia"/>
-                <w:lang w:val="en-US" w:eastAsia="zh-CN"/>
-              </w:rPr>
-              <w:t>rotate(R)</w:t>
-            </w:r>
-          </w:p>
-        </w:tc>
-        <w:tc>
-          <w:tcPr>
-            <w:tcW w:w="0" w:type="auto"/>
-            <w:shd w:val="clear"/>
+          </w:p>
+        </w:tc>
+        <w:tc>
+          <w:tcPr>
+            <w:tcW w:w="0" w:type="auto"/>
+            <w:shd w:val="clear" w:color="auto" w:fill="auto"/>
+            <w:vAlign w:val="center"/>
+          </w:tcPr>
+          <w:p>
+            <w:pPr>
+              <w:pStyle w:val="12"/>
+              <w:bidi w:val="0"/>
+              <w:jc w:val="both"/>
+              <w:rPr>
+                <w:rFonts w:hint="default"/>
+                <w:lang w:val="en-US" w:eastAsia="zh-CN"/>
+              </w:rPr>
+            </w:pPr>
+            <w:r>
+              <w:rPr>
+                <w:rFonts w:hint="eastAsia"/>
+                <w:lang w:val="en-US" w:eastAsia="zh-CN"/>
+              </w:rPr>
+              <w:t>scale(s, center)</w:t>
+            </w:r>
+          </w:p>
+        </w:tc>
+        <w:tc>
+          <w:tcPr>
+            <w:tcW w:w="0" w:type="auto"/>
+            <w:shd w:val="clear" w:color="auto" w:fill="auto"/>
             <w:vAlign w:val="center"/>
           </w:tcPr>
           <w:p>
@@ -714,7 +799,7 @@
                 <w:rFonts w:hint="eastAsia"/>
                 <w:lang w:val="en-US" w:eastAsia="zh-CN"/>
               </w:rPr>
-              <w:t>旋转</w:t>
+              <w:t>缩放</w:t>
             </w:r>
           </w:p>
         </w:tc>
@@ -740,7 +825,6 @@
           <w:tcPr>
             <w:tcW w:w="0" w:type="auto"/>
             <w:vMerge w:val="continue"/>
-            <w:tcBorders/>
             <w:vAlign w:val="center"/>
           </w:tcPr>
           <w:p>
@@ -764,32 +848,32 @@
         <w:tc>
           <w:tcPr>
             <w:tcW w:w="0" w:type="auto"/>
-            <w:shd w:val="clear"/>
-            <w:vAlign w:val="center"/>
-          </w:tcPr>
-          <w:p>
-            <w:pPr>
-              <w:pStyle w:val="12"/>
-              <w:bidi w:val="0"/>
-              <w:jc w:val="both"/>
-              <w:rPr>
-                <w:rFonts w:hint="default"/>
-                <w:lang w:val="en-US" w:eastAsia="zh-CN"/>
-              </w:rPr>
-            </w:pPr>
-            <w:r>
-              <w:rPr>
-                <w:rFonts w:hint="eastAsia"/>
-                <w:lang w:val="en-US" w:eastAsia="zh-CN"/>
-              </w:rPr>
-              <w:t>scale(s, center)</w:t>
-            </w:r>
-          </w:p>
-        </w:tc>
-        <w:tc>
-          <w:tcPr>
-            <w:tcW w:w="0" w:type="auto"/>
-            <w:shd w:val="clear"/>
+            <w:shd w:val="clear" w:color="auto" w:fill="auto"/>
+            <w:vAlign w:val="center"/>
+          </w:tcPr>
+          <w:p>
+            <w:pPr>
+              <w:pStyle w:val="12"/>
+              <w:bidi w:val="0"/>
+              <w:jc w:val="both"/>
+              <w:rPr>
+                <w:rFonts w:hint="default"/>
+                <w:lang w:val="en-US" w:eastAsia="zh-CN"/>
+              </w:rPr>
+            </w:pPr>
+            <w:r>
+              <w:rPr>
+                <w:rFonts w:hint="eastAsia"/>
+                <w:lang w:val="en-US" w:eastAsia="zh-CN"/>
+              </w:rPr>
+              <w:t>translate(vec, relative=True)</w:t>
+            </w:r>
+          </w:p>
+        </w:tc>
+        <w:tc>
+          <w:tcPr>
+            <w:tcW w:w="0" w:type="auto"/>
+            <w:shd w:val="clear" w:color="auto" w:fill="auto"/>
             <w:vAlign w:val="center"/>
           </w:tcPr>
           <w:p>
@@ -807,7 +891,7 @@
                 <w:rFonts w:hint="eastAsia"/>
                 <w:lang w:val="en-US" w:eastAsia="zh-CN"/>
               </w:rPr>
-              <w:t>缩放</w:t>
+              <w:t>平移</w:t>
             </w:r>
           </w:p>
         </w:tc>
@@ -833,7 +917,6 @@
           <w:tcPr>
             <w:tcW w:w="0" w:type="auto"/>
             <w:vMerge w:val="continue"/>
-            <w:tcBorders/>
             <w:vAlign w:val="center"/>
           </w:tcPr>
           <w:p>
@@ -857,32 +940,32 @@
         <w:tc>
           <w:tcPr>
             <w:tcW w:w="0" w:type="auto"/>
-            <w:shd w:val="clear"/>
-            <w:vAlign w:val="center"/>
-          </w:tcPr>
-          <w:p>
-            <w:pPr>
-              <w:pStyle w:val="12"/>
-              <w:bidi w:val="0"/>
-              <w:jc w:val="both"/>
-              <w:rPr>
-                <w:rFonts w:hint="default"/>
-                <w:lang w:val="en-US" w:eastAsia="zh-CN"/>
-              </w:rPr>
-            </w:pPr>
-            <w:r>
-              <w:rPr>
-                <w:rFonts w:hint="eastAsia"/>
-                <w:lang w:val="en-US" w:eastAsia="zh-CN"/>
-              </w:rPr>
-              <w:t>translate(vec, relative=True)</w:t>
-            </w:r>
-          </w:p>
-        </w:tc>
-        <w:tc>
-          <w:tcPr>
-            <w:tcW w:w="0" w:type="auto"/>
-            <w:shd w:val="clear"/>
+            <w:shd w:val="clear" w:color="auto" w:fill="auto"/>
+            <w:vAlign w:val="center"/>
+          </w:tcPr>
+          <w:p>
+            <w:pPr>
+              <w:pStyle w:val="12"/>
+              <w:bidi w:val="0"/>
+              <w:jc w:val="both"/>
+              <w:rPr>
+                <w:rFonts w:hint="default"/>
+                <w:lang w:val="en-US" w:eastAsia="zh-CN"/>
+              </w:rPr>
+            </w:pPr>
+            <w:r>
+              <w:rPr>
+                <w:rFonts w:hint="eastAsia"/>
+                <w:lang w:val="en-US" w:eastAsia="zh-CN"/>
+              </w:rPr>
+              <w:t>transform(T)</w:t>
+            </w:r>
+          </w:p>
+        </w:tc>
+        <w:tc>
+          <w:tcPr>
+            <w:tcW w:w="0" w:type="auto"/>
+            <w:shd w:val="clear" w:color="auto" w:fill="auto"/>
             <w:vAlign w:val="center"/>
           </w:tcPr>
           <w:p>
@@ -900,7 +983,7 @@
                 <w:rFonts w:hint="eastAsia"/>
                 <w:lang w:val="en-US" w:eastAsia="zh-CN"/>
               </w:rPr>
-              <w:t>平移</w:t>
+              <w:t>齐次变换</w:t>
             </w:r>
           </w:p>
         </w:tc>
@@ -915,18 +998,11 @@
             <w:insideH w:val="single" w:color="auto" w:sz="4" w:space="0"/>
             <w:insideV w:val="single" w:color="auto" w:sz="4" w:space="0"/>
           </w:tblBorders>
-          <w:tblCellMar>
-            <w:top w:w="0" w:type="dxa"/>
-            <w:left w:w="108" w:type="dxa"/>
-            <w:bottom w:w="0" w:type="dxa"/>
-            <w:right w:w="108" w:type="dxa"/>
-          </w:tblCellMar>
         </w:tblPrEx>
         <w:tc>
           <w:tcPr>
             <w:tcW w:w="0" w:type="auto"/>
             <w:vMerge w:val="continue"/>
-            <w:tcBorders/>
             <w:vAlign w:val="center"/>
           </w:tcPr>
           <w:p>
@@ -950,100 +1026,7 @@
         <w:tc>
           <w:tcPr>
             <w:tcW w:w="0" w:type="auto"/>
-            <w:shd w:val="clear"/>
-            <w:vAlign w:val="center"/>
-          </w:tcPr>
-          <w:p>
-            <w:pPr>
-              <w:pStyle w:val="12"/>
-              <w:bidi w:val="0"/>
-              <w:jc w:val="both"/>
-              <w:rPr>
-                <w:rFonts w:hint="default"/>
-                <w:lang w:val="en-US" w:eastAsia="zh-CN"/>
-              </w:rPr>
-            </w:pPr>
-            <w:r>
-              <w:rPr>
-                <w:rFonts w:hint="eastAsia"/>
-                <w:lang w:val="en-US" w:eastAsia="zh-CN"/>
-              </w:rPr>
-              <w:t>transform(T)</w:t>
-            </w:r>
-          </w:p>
-        </w:tc>
-        <w:tc>
-          <w:tcPr>
-            <w:tcW w:w="0" w:type="auto"/>
-            <w:shd w:val="clear"/>
-            <w:vAlign w:val="center"/>
-          </w:tcPr>
-          <w:p>
-            <w:pPr>
-              <w:pStyle w:val="11"/>
-              <w:bidi w:val="0"/>
-              <w:jc w:val="both"/>
-              <w:rPr>
-                <w:rFonts w:hint="default"/>
-                <w:lang w:val="en-US" w:eastAsia="zh-CN"/>
-              </w:rPr>
-            </w:pPr>
-            <w:r>
-              <w:rPr>
-                <w:rFonts w:hint="eastAsia"/>
-                <w:lang w:val="en-US" w:eastAsia="zh-CN"/>
-              </w:rPr>
-              <w:t>齐次变换</w:t>
-            </w:r>
-          </w:p>
-        </w:tc>
-      </w:tr>
-      <w:tr>
-        <w:tblPrEx>
-          <w:tblBorders>
-            <w:top w:val="single" w:color="auto" w:sz="4" w:space="0"/>
-            <w:left w:val="single" w:color="auto" w:sz="4" w:space="0"/>
-            <w:bottom w:val="single" w:color="auto" w:sz="4" w:space="0"/>
-            <w:right w:val="single" w:color="auto" w:sz="4" w:space="0"/>
-            <w:insideH w:val="single" w:color="auto" w:sz="4" w:space="0"/>
-            <w:insideV w:val="single" w:color="auto" w:sz="4" w:space="0"/>
-          </w:tblBorders>
-          <w:tblCellMar>
-            <w:top w:w="0" w:type="dxa"/>
-            <w:left w:w="108" w:type="dxa"/>
-            <w:bottom w:w="0" w:type="dxa"/>
-            <w:right w:w="108" w:type="dxa"/>
-          </w:tblCellMar>
-        </w:tblPrEx>
-        <w:tc>
-          <w:tcPr>
-            <w:tcW w:w="0" w:type="auto"/>
-            <w:vMerge w:val="continue"/>
-            <w:tcBorders/>
-            <w:vAlign w:val="center"/>
-          </w:tcPr>
-          <w:p>
-            <w:pPr>
-              <w:pStyle w:val="12"/>
-              <w:bidi w:val="0"/>
-              <w:jc w:val="both"/>
-              <w:rPr>
-                <w:rFonts w:hint="eastAsia" w:ascii="华文中宋" w:hAnsi="华文中宋" w:eastAsia="华文中宋" w:cs="华文中宋"/>
-                <w:b/>
-                <w:bCs/>
-                <w:color w:val="ED7D31"/>
-                <w:kern w:val="2"/>
-                <w:sz w:val="21"/>
-                <w:szCs w:val="21"/>
-                <w:lang w:val="en-US" w:eastAsia="zh-CN" w:bidi="ar-SA"/>
-              </w:rPr>
-            </w:pPr>
-          </w:p>
-        </w:tc>
-        <w:tc>
-          <w:tcPr>
-            <w:tcW w:w="0" w:type="auto"/>
-            <w:shd w:val="clear"/>
+            <w:shd w:val="clear" w:color="auto" w:fill="auto"/>
             <w:vAlign w:val="center"/>
           </w:tcPr>
           <w:p>
@@ -1068,7 +1051,7 @@
         <w:tc>
           <w:tcPr>
             <w:tcW w:w="0" w:type="auto"/>
-            <w:shd w:val="clear"/>
+            <w:shd w:val="clear" w:color="auto" w:fill="auto"/>
             <w:vAlign w:val="center"/>
           </w:tcPr>
           <w:p>
@@ -3650,12 +3633,6 @@
             <w:insideH w:val="single" w:color="auto" w:sz="4" w:space="0"/>
             <w:insideV w:val="single" w:color="auto" w:sz="4" w:space="0"/>
           </w:tblBorders>
-          <w:tblCellMar>
-            <w:top w:w="0" w:type="dxa"/>
-            <w:left w:w="108" w:type="dxa"/>
-            <w:bottom w:w="0" w:type="dxa"/>
-            <w:right w:w="108" w:type="dxa"/>
-          </w:tblCellMar>
         </w:tblPrEx>
         <w:tc>
           <w:tcPr>
@@ -4302,12 +4279,6 @@
             <w:insideH w:val="single" w:color="auto" w:sz="4" w:space="0"/>
             <w:insideV w:val="single" w:color="auto" w:sz="4" w:space="0"/>
           </w:tblBorders>
-          <w:tblCellMar>
-            <w:top w:w="0" w:type="dxa"/>
-            <w:left w:w="108" w:type="dxa"/>
-            <w:bottom w:w="0" w:type="dxa"/>
-            <w:right w:w="108" w:type="dxa"/>
-          </w:tblCellMar>
         </w:tblPrEx>
         <w:tc>
           <w:tcPr>
@@ -4652,8 +4623,8 @@
         </w:tblCellMar>
       </w:tblPr>
       <w:tblGrid>
-        <w:gridCol w:w="1080"/>
-        <w:gridCol w:w="637"/>
+        <w:gridCol w:w="3032"/>
+        <w:gridCol w:w="1057"/>
       </w:tblGrid>
       <w:tr>
         <w:tblPrEx>
@@ -4714,6 +4685,70 @@
               </w:rPr>
               <w:t>加载</w:t>
             </w:r>
+          </w:p>
+        </w:tc>
+      </w:tr>
+      <w:tr>
+        <w:tblPrEx>
+          <w:tblBorders>
+            <w:top w:val="single" w:color="auto" w:sz="4" w:space="0"/>
+            <w:left w:val="single" w:color="auto" w:sz="4" w:space="0"/>
+            <w:bottom w:val="single" w:color="auto" w:sz="4" w:space="0"/>
+            <w:right w:val="single" w:color="auto" w:sz="4" w:space="0"/>
+            <w:insideH w:val="single" w:color="auto" w:sz="4" w:space="0"/>
+            <w:insideV w:val="single" w:color="auto" w:sz="4" w:space="0"/>
+          </w:tblBorders>
+          <w:tblCellMar>
+            <w:top w:w="0" w:type="dxa"/>
+            <w:left w:w="108" w:type="dxa"/>
+            <w:bottom w:w="0" w:type="dxa"/>
+            <w:right w:w="108" w:type="dxa"/>
+          </w:tblCellMar>
+        </w:tblPrEx>
+        <w:tc>
+          <w:tcPr>
+            <w:tcW w:w="0" w:type="auto"/>
+          </w:tcPr>
+          <w:p>
+            <w:pPr>
+              <w:pStyle w:val="12"/>
+              <w:bidi w:val="0"/>
+              <w:rPr>
+                <w:rFonts w:hint="default"/>
+                <w:lang w:val="en-US" w:eastAsia="zh-CN"/>
+              </w:rPr>
+            </w:pPr>
+            <w:r>
+              <w:rPr>
+                <w:rFonts w:hint="eastAsia"/>
+                <w:lang w:val="en-US" w:eastAsia="zh-CN"/>
+              </w:rPr>
+              <w:t>util.concatenate(a, b=None)</w:t>
+            </w:r>
+          </w:p>
+        </w:tc>
+        <w:tc>
+          <w:tcPr>
+            <w:tcW w:w="0" w:type="auto"/>
+          </w:tcPr>
+          <w:p>
+            <w:pPr>
+              <w:pStyle w:val="11"/>
+              <w:bidi w:val="0"/>
+              <w:rPr>
+                <w:rFonts w:hint="eastAsia"/>
+                <w:lang w:val="en-US" w:eastAsia="zh-CN"/>
+              </w:rPr>
+            </w:pPr>
+            <w:r>
+              <w:rPr>
+                <w:rFonts w:hint="eastAsia"/>
+                <w:lang w:val="en-US" w:eastAsia="zh-CN"/>
+              </w:rPr>
+              <w:t>合并场景</w:t>
+            </w:r>
+            <w:bookmarkStart w:id="0" w:name="_GoBack"/>
+            <w:bookmarkEnd w:id="0"/>
           </w:p>
         </w:tc>
       </w:tr>
@@ -4957,7 +4992,6 @@
           <w:tcPr>
             <w:tcW w:w="0" w:type="auto"/>
             <w:vMerge w:val="continue"/>
-            <w:tcBorders/>
             <w:vAlign w:val="center"/>
           </w:tcPr>
           <w:p>
@@ -5017,6 +5051,90 @@
                 <w:lang w:val="en-US" w:eastAsia="zh-CN"/>
               </w:rPr>
               <w:t>边界</w:t>
+            </w:r>
+          </w:p>
+        </w:tc>
+      </w:tr>
+      <w:tr>
+        <w:tblPrEx>
+          <w:tblBorders>
+            <w:top w:val="single" w:color="auto" w:sz="4" w:space="0"/>
+            <w:left w:val="single" w:color="auto" w:sz="4" w:space="0"/>
+            <w:bottom w:val="single" w:color="auto" w:sz="4" w:space="0"/>
+            <w:right w:val="single" w:color="auto" w:sz="4" w:space="0"/>
+            <w:insideH w:val="single" w:color="auto" w:sz="4" w:space="0"/>
+            <w:insideV w:val="single" w:color="auto" w:sz="4" w:space="0"/>
+          </w:tblBorders>
+        </w:tblPrEx>
+        <w:tc>
+          <w:tcPr>
+            <w:tcW w:w="0" w:type="auto"/>
+            <w:vMerge w:val="continue"/>
+            <w:vAlign w:val="center"/>
+          </w:tcPr>
+          <w:p>
+            <w:pPr>
+              <w:pStyle w:val="12"/>
+              <w:bidi w:val="0"/>
+              <w:jc w:val="both"/>
+              <w:rPr>
+                <w:rFonts w:hint="eastAsia" w:ascii="华文中宋" w:hAnsi="华文中宋" w:eastAsia="华文中宋" w:cs="华文中宋"/>
+                <w:b/>
+                <w:bCs/>
+                <w:color w:val="ED7D31"/>
+                <w:kern w:val="2"/>
+                <w:sz w:val="21"/>
+                <w:szCs w:val="21"/>
+                <w:lang w:val="en-US" w:eastAsia="zh-CN" w:bidi="ar-SA"/>
+              </w:rPr>
+            </w:pPr>
+          </w:p>
+        </w:tc>
+        <w:tc>
+          <w:tcPr>
+            <w:tcW w:w="0" w:type="auto"/>
+            <w:vAlign w:val="center"/>
+          </w:tcPr>
+          <w:p>
+            <w:pPr>
+              <w:pStyle w:val="12"/>
+              <w:bidi w:val="0"/>
+              <w:jc w:val="both"/>
+              <w:rPr>
+                <w:rFonts w:hint="default"/>
+                <w:lang w:val="en-US" w:eastAsia="zh-CN"/>
+              </w:rPr>
+            </w:pPr>
+            <w:r>
+              <w:rPr>
+                <w:rFonts w:hint="eastAsia"/>
+                <w:lang w:val="en-US" w:eastAsia="zh-CN"/>
+              </w:rPr>
+              <w:t>extents</w:t>
+            </w:r>
+          </w:p>
+        </w:tc>
+        <w:tc>
+          <w:tcPr>
+            <w:tcW w:w="0" w:type="auto"/>
+            <w:vAlign w:val="center"/>
+          </w:tcPr>
+          <w:p>
+            <w:pPr>
+              <w:pStyle w:val="11"/>
+              <w:bidi w:val="0"/>
+              <w:jc w:val="both"/>
+              <w:rPr>
+                <w:rFonts w:hint="default"/>
+                <w:lang w:val="en-US" w:eastAsia="zh-CN"/>
+              </w:rPr>
+            </w:pPr>
+            <w:r>
+              <w:rPr>
+                <w:rFonts w:hint="eastAsia"/>
+                <w:lang w:val="en-US" w:eastAsia="zh-CN"/>
+              </w:rPr>
+              <w:t>尺度</w:t>
             </w:r>
           </w:p>
         </w:tc>
@@ -5041,8 +5159,7 @@
         <w:tc>
           <w:tcPr>
             <w:tcW w:w="0" w:type="auto"/>
-            <w:vMerge w:val="continue"/>
-            <w:tcBorders/>
+            <w:vMerge w:val="restart"/>
             <w:vAlign w:val="center"/>
           </w:tcPr>
           <w:p>
@@ -5061,29 +5178,55 @@
                 <w:lang w:val="en-US" w:eastAsia="zh-CN" w:bidi="ar-SA"/>
               </w:rPr>
             </w:pPr>
-          </w:p>
-        </w:tc>
-        <w:tc>
-          <w:tcPr>
-            <w:tcW w:w="0" w:type="auto"/>
-            <w:vAlign w:val="center"/>
-          </w:tcPr>
-          <w:p>
-            <w:pPr>
-              <w:pStyle w:val="12"/>
-              <w:bidi w:val="0"/>
-              <w:jc w:val="both"/>
-              <w:rPr>
-                <w:rFonts w:hint="default"/>
-                <w:lang w:val="en-US" w:eastAsia="zh-CN"/>
-              </w:rPr>
-            </w:pPr>
-            <w:r>
-              <w:rPr>
-                <w:rFonts w:hint="eastAsia"/>
-                <w:lang w:val="en-US" w:eastAsia="zh-CN"/>
-              </w:rPr>
-              <w:t>extents</w:t>
+            <w:r>
+              <w:rPr>
+                <w:rFonts w:hint="eastAsia" w:ascii="华文中宋" w:hAnsi="华文中宋" w:eastAsia="华文中宋" w:cs="华文中宋"/>
+                <w:b/>
+                <w:bCs/>
+                <w:color w:val="ED7D31"/>
+                <w:kern w:val="2"/>
+                <w:sz w:val="21"/>
+                <w:szCs w:val="21"/>
+                <w:lang w:val="en-US" w:eastAsia="zh-CN" w:bidi="ar-SA"/>
+              </w:rPr>
+              <w:t>实例</w:t>
+            </w:r>
+            <w:r>
+              <w:rPr>
+                <w:rFonts w:hint="eastAsia" w:cs="华文中宋"/>
+                <w:b/>
+                <w:bCs/>
+                <w:color w:val="ED7D31"/>
+                <w:kern w:val="2"/>
+                <w:sz w:val="21"/>
+                <w:szCs w:val="21"/>
+                <w:lang w:val="en-US" w:eastAsia="zh-CN" w:bidi="ar-SA"/>
+              </w:rPr>
+              <w:t>方法</w:t>
+            </w:r>
+          </w:p>
+        </w:tc>
+        <w:tc>
+          <w:tcPr>
+            <w:tcW w:w="0" w:type="auto"/>
+            <w:vAlign w:val="center"/>
+          </w:tcPr>
+          <w:p>
+            <w:pPr>
+              <w:pStyle w:val="12"/>
+              <w:bidi w:val="0"/>
+              <w:jc w:val="both"/>
+              <w:rPr>
+                <w:rFonts w:hint="default"/>
+                <w:lang w:val="en-US" w:eastAsia="zh-CN"/>
+              </w:rPr>
+            </w:pPr>
+            <w:r>
+              <w:rPr>
+                <w:rFonts w:hint="eastAsia"/>
+                <w:lang w:val="en-US" w:eastAsia="zh-CN"/>
+              </w:rPr>
+              <w:t>show(background={RGB})</w:t>
             </w:r>
           </w:p>
         </w:tc>
@@ -5107,7 +5250,7 @@
                 <w:rFonts w:hint="eastAsia"/>
                 <w:lang w:val="en-US" w:eastAsia="zh-CN"/>
               </w:rPr>
-              <w:t>尺度</w:t>
+              <w:t>可视化</w:t>
             </w:r>
           </w:p>
         </w:tc>
@@ -5132,7 +5275,7 @@
         <w:tc>
           <w:tcPr>
             <w:tcW w:w="0" w:type="auto"/>
-            <w:vMerge w:val="restart"/>
+            <w:vMerge w:val="continue"/>
             <w:vAlign w:val="center"/>
           </w:tcPr>
           <w:p>
@@ -5151,64 +5294,29 @@
                 <w:lang w:val="en-US" w:eastAsia="zh-CN" w:bidi="ar-SA"/>
               </w:rPr>
             </w:pPr>
-            <w:r>
-              <w:rPr>
-                <w:rFonts w:hint="eastAsia" w:ascii="华文中宋" w:hAnsi="华文中宋" w:eastAsia="华文中宋" w:cs="华文中宋"/>
-                <w:b/>
-                <w:bCs/>
-                <w:color w:val="ED7D31"/>
-                <w:kern w:val="2"/>
-                <w:sz w:val="21"/>
-                <w:szCs w:val="21"/>
-                <w:lang w:val="en-US" w:eastAsia="zh-CN" w:bidi="ar-SA"/>
-              </w:rPr>
-              <w:t>实例</w:t>
-            </w:r>
-            <w:r>
-              <w:rPr>
-                <w:rFonts w:hint="eastAsia" w:cs="华文中宋"/>
-                <w:b/>
-                <w:bCs/>
-                <w:color w:val="ED7D31"/>
-                <w:kern w:val="2"/>
-                <w:sz w:val="21"/>
-                <w:szCs w:val="21"/>
-                <w:lang w:val="en-US" w:eastAsia="zh-CN" w:bidi="ar-SA"/>
-              </w:rPr>
-              <w:t>方法</w:t>
-            </w:r>
-          </w:p>
-        </w:tc>
-        <w:tc>
-          <w:tcPr>
-            <w:tcW w:w="0" w:type="auto"/>
-            <w:vAlign w:val="center"/>
-          </w:tcPr>
-          <w:p>
-            <w:pPr>
-              <w:pStyle w:val="12"/>
-              <w:bidi w:val="0"/>
-              <w:jc w:val="both"/>
-              <w:rPr>
-                <w:rFonts w:hint="default"/>
-                <w:lang w:val="en-US" w:eastAsia="zh-CN"/>
-              </w:rPr>
-            </w:pPr>
-            <w:r>
-              <w:rPr>
-                <w:rFonts w:hint="eastAsia"/>
-                <w:lang w:val="en-US" w:eastAsia="zh-CN"/>
-              </w:rPr>
-              <w:t>show(background={RGB}</w:t>
-            </w:r>
-            <w:bookmarkStart w:id="0" w:name="_GoBack"/>
-            <w:bookmarkEnd w:id="0"/>
-            <w:r>
-              <w:rPr>
-                <w:rFonts w:hint="eastAsia"/>
-                <w:lang w:val="en-US" w:eastAsia="zh-CN"/>
-              </w:rPr>
-              <w:t>)</w:t>
+          </w:p>
+        </w:tc>
+        <w:tc>
+          <w:tcPr>
+            <w:tcW w:w="0" w:type="auto"/>
+            <w:vAlign w:val="center"/>
+          </w:tcPr>
+          <w:p>
+            <w:pPr>
+              <w:pStyle w:val="12"/>
+              <w:bidi w:val="0"/>
+              <w:jc w:val="both"/>
+              <w:rPr>
+                <w:rFonts w:hint="default"/>
+                <w:lang w:val="en-US" w:eastAsia="zh-CN"/>
+              </w:rPr>
+            </w:pPr>
+            <w:r>
+              <w:rPr>
+                <w:rFonts w:hint="eastAsia"/>
+                <w:lang w:val="en-US" w:eastAsia="zh-CN"/>
+              </w:rPr>
+              <w:t>apply_scale(s)</w:t>
             </w:r>
           </w:p>
         </w:tc>
@@ -5232,7 +5340,7 @@
                 <w:rFonts w:hint="eastAsia"/>
                 <w:lang w:val="en-US" w:eastAsia="zh-CN"/>
               </w:rPr>
-              <w:t>可视化</w:t>
+              <w:t>缩放</w:t>
             </w:r>
           </w:p>
         </w:tc>
@@ -5258,7 +5366,6 @@
           <w:tcPr>
             <w:tcW w:w="0" w:type="auto"/>
             <w:vMerge w:val="continue"/>
-            <w:tcBorders/>
             <w:vAlign w:val="center"/>
           </w:tcPr>
           <w:p>
@@ -5299,7 +5406,7 @@
                 <w:rFonts w:hint="eastAsia"/>
                 <w:lang w:val="en-US" w:eastAsia="zh-CN"/>
               </w:rPr>
-              <w:t>apply_scale(s)</w:t>
+              <w:t>apply_translation(vec)</w:t>
             </w:r>
           </w:p>
         </w:tc>
@@ -5323,7 +5430,7 @@
                 <w:rFonts w:hint="eastAsia"/>
                 <w:lang w:val="en-US" w:eastAsia="zh-CN"/>
               </w:rPr>
-              <w:t>缩放</w:t>
+              <w:t>平移</w:t>
             </w:r>
           </w:p>
         </w:tc>
@@ -5338,109 +5445,11 @@
             <w:insideH w:val="single" w:color="auto" w:sz="4" w:space="0"/>
             <w:insideV w:val="single" w:color="auto" w:sz="4" w:space="0"/>
           </w:tblBorders>
-          <w:tblCellMar>
-            <w:top w:w="0" w:type="dxa"/>
-            <w:left w:w="108" w:type="dxa"/>
-            <w:bottom w:w="0" w:type="dxa"/>
-            <w:right w:w="108" w:type="dxa"/>
-          </w:tblCellMar>
         </w:tblPrEx>
         <w:tc>
           <w:tcPr>
             <w:tcW w:w="0" w:type="auto"/>
             <w:vMerge w:val="continue"/>
-            <w:tcBorders/>
-            <w:vAlign w:val="center"/>
-          </w:tcPr>
-          <w:p>
-            <w:pPr>
-              <w:pStyle w:val="12"/>
-              <w:bidi w:val="0"/>
-              <w:jc w:val="both"/>
-              <w:rPr>
-                <w:rFonts w:hint="eastAsia" w:ascii="华文中宋" w:hAnsi="华文中宋" w:eastAsia="华文中宋" w:cs="华文中宋"/>
-                <w:b/>
-                <w:bCs/>
-                <w:color w:val="ED7D31"/>
-                <w:kern w:val="2"/>
-                <w:sz w:val="21"/>
-                <w:szCs w:val="21"/>
-                <w:lang w:val="en-US" w:eastAsia="zh-CN" w:bidi="ar-SA"/>
-              </w:rPr>
-            </w:pPr>
-          </w:p>
-        </w:tc>
-        <w:tc>
-          <w:tcPr>
-            <w:tcW w:w="0" w:type="auto"/>
-            <w:vAlign w:val="center"/>
-          </w:tcPr>
-          <w:p>
-            <w:pPr>
-              <w:pStyle w:val="12"/>
-              <w:bidi w:val="0"/>
-              <w:jc w:val="both"/>
-              <w:rPr>
-                <w:rFonts w:hint="default"/>
-                <w:lang w:val="en-US" w:eastAsia="zh-CN"/>
-              </w:rPr>
-            </w:pPr>
-            <w:r>
-              <w:rPr>
-                <w:rFonts w:hint="eastAsia"/>
-                <w:lang w:val="en-US" w:eastAsia="zh-CN"/>
-              </w:rPr>
-              <w:t>apply_translation(vec)</w:t>
-            </w:r>
-          </w:p>
-        </w:tc>
-        <w:tc>
-          <w:tcPr>
-            <w:tcW w:w="0" w:type="auto"/>
-            <w:vAlign w:val="center"/>
-          </w:tcPr>
-          <w:p>
-            <w:pPr>
-              <w:pStyle w:val="11"/>
-              <w:bidi w:val="0"/>
-              <w:jc w:val="both"/>
-              <w:rPr>
-                <w:rFonts w:hint="default"/>
-                <w:lang w:val="en-US" w:eastAsia="zh-CN"/>
-              </w:rPr>
-            </w:pPr>
-            <w:r>
-              <w:rPr>
-                <w:rFonts w:hint="eastAsia"/>
-                <w:lang w:val="en-US" w:eastAsia="zh-CN"/>
-              </w:rPr>
-              <w:t>平移</w:t>
-            </w:r>
-          </w:p>
-        </w:tc>
-      </w:tr>
-      <w:tr>
-        <w:tblPrEx>
-          <w:tblBorders>
-            <w:top w:val="single" w:color="auto" w:sz="4" w:space="0"/>
-            <w:left w:val="single" w:color="auto" w:sz="4" w:space="0"/>
-            <w:bottom w:val="single" w:color="auto" w:sz="4" w:space="0"/>
-            <w:right w:val="single" w:color="auto" w:sz="4" w:space="0"/>
-            <w:insideH w:val="single" w:color="auto" w:sz="4" w:space="0"/>
-            <w:insideV w:val="single" w:color="auto" w:sz="4" w:space="0"/>
-          </w:tblBorders>
-          <w:tblCellMar>
-            <w:top w:w="0" w:type="dxa"/>
-            <w:left w:w="108" w:type="dxa"/>
-            <w:bottom w:w="0" w:type="dxa"/>
-            <w:right w:w="108" w:type="dxa"/>
-          </w:tblCellMar>
-        </w:tblPrEx>
-        <w:tc>
-          <w:tcPr>
-            <w:tcW w:w="0" w:type="auto"/>
-            <w:vMerge w:val="continue"/>
-            <w:tcBorders/>
             <w:vAlign w:val="center"/>
           </w:tcPr>
           <w:p>

</xml_diff>

<commit_message>
update on 2025-10-31 14:28:19.334827
</commit_message>
<xml_diff>
--- a/py 空间几何.docx
+++ b/py 空间几何.docx
@@ -38,6 +38,39 @@
           <w:lang w:val="en-US" w:eastAsia="zh-CN" w:bidi="ar-SA"/>
         </w:rPr>
         <w:t>机械臂curobo：</w:t>
+      </w:r>
+    </w:p>
+    <w:p>
+      <w:pPr>
+        <w:outlineLvl w:val="9"/>
+        <w:rPr>
+          <w:rFonts w:hint="eastAsia" w:cs="华文中宋"/>
+          <w:bCs/>
+          <w:color w:val="F79646" w:themeColor="accent6"/>
+          <w:spacing w:val="7"/>
+          <w14:textFill>
+            <w14:solidFill>
+              <w14:schemeClr w14:val="accent6"/>
+            </w14:solidFill>
+          </w14:textFill>
+        </w:rPr>
+      </w:pPr>
+    </w:p>
+    <w:p>
+      <w:pPr>
+        <w:pStyle w:val="3"/>
+        <w:bidi w:val="0"/>
+        <w:rPr>
+          <w:rFonts w:hint="default"/>
+          <w:lang w:val="en-US"/>
+        </w:rPr>
+      </w:pPr>
+      <w:r>
+        <w:rPr>
+          <w:rFonts w:hint="eastAsia"/>
+          <w:lang w:val="en-US" w:eastAsia="zh-CN"/>
+        </w:rPr>
+        <w:t>模型cuda_robot_model：</w:t>
       </w:r>
     </w:p>
     <w:tbl>
@@ -109,7 +142,7 @@
                 <w:rFonts w:hint="eastAsia"/>
                 <w:lang w:val="en-US" w:eastAsia="zh-CN"/>
               </w:rPr>
-              <w:t>cuda_robot_model.cuda_robot_model：</w:t>
+              <w:t>cuda_robot_model：</w:t>
             </w:r>
           </w:p>
         </w:tc>
@@ -416,6 +449,46 @@
           </w14:textFill>
         </w:rPr>
       </w:pPr>
+    </w:p>
+    <w:p>
+      <w:pPr>
+        <w:outlineLvl w:val="9"/>
+        <w:rPr>
+          <w:rFonts w:hint="eastAsia" w:cs="华文中宋"/>
+          <w:bCs/>
+          <w:color w:val="F79646" w:themeColor="accent6"/>
+          <w:spacing w:val="7"/>
+          <w14:textFill>
+            <w14:solidFill>
+              <w14:schemeClr w14:val="accent6"/>
+            </w14:solidFill>
+          </w14:textFill>
+        </w:rPr>
+      </w:pPr>
+    </w:p>
+    <w:p>
+      <w:pPr>
+        <w:pStyle w:val="3"/>
+        <w:bidi w:val="0"/>
+        <w:rPr>
+          <w:rFonts w:hint="default"/>
+          <w:lang w:val="en-US" w:eastAsia="zh-CN"/>
+        </w:rPr>
+      </w:pPr>
+      <w:r>
+        <w:rPr>
+          <w:rFonts w:hint="eastAsia"/>
+          <w:lang w:eastAsia="zh-CN"/>
+        </w:rPr>
+        <w:t>几何</w:t>
+      </w:r>
+      <w:r>
+        <w:rPr>
+          <w:rFonts w:hint="eastAsia"/>
+          <w:lang w:val="en-US" w:eastAsia="zh-CN"/>
+        </w:rPr>
+        <w:t>geom：</w:t>
+      </w:r>
     </w:p>
     <w:tbl>
       <w:tblPr>
@@ -486,7 +559,7 @@
                 <w:rFonts w:hint="eastAsia"/>
                 <w:lang w:val="en-US" w:eastAsia="zh-CN"/>
               </w:rPr>
-              <w:t>geom.types：</w:t>
+              <w:t>types：</w:t>
             </w:r>
           </w:p>
         </w:tc>
@@ -1379,6 +1452,148 @@
           <w:bCs/>
           <w:color w:val="FF0000"/>
           <w:spacing w:val="7"/>
+          <w:lang w:val="en-US" w:eastAsia="zh-CN"/>
+        </w:rPr>
+      </w:pPr>
+    </w:p>
+    <w:p>
+      <w:pPr>
+        <w:rPr>
+          <w:rFonts w:hint="eastAsia" w:cs="华文中宋"/>
+          <w:bCs/>
+          <w:color w:val="FF0000"/>
+          <w:spacing w:val="7"/>
+          <w:lang w:val="en-US" w:eastAsia="zh-CN"/>
+        </w:rPr>
+      </w:pPr>
+    </w:p>
+    <w:p>
+      <w:pPr>
+        <w:pStyle w:val="3"/>
+        <w:bidi w:val="0"/>
+        <w:rPr>
+          <w:rFonts w:hint="eastAsia"/>
+          <w:lang w:val="en-US" w:eastAsia="zh-CN"/>
+        </w:rPr>
+      </w:pPr>
+      <w:r>
+        <w:rPr>
+          <w:rFonts w:hint="eastAsia"/>
+          <w:lang w:val="en-US" w:eastAsia="zh-CN"/>
+        </w:rPr>
+        <w:t>类型types：</w:t>
+      </w:r>
+    </w:p>
+    <w:tbl>
+      <w:tblPr>
+        <w:tblStyle w:val="8"/>
+        <w:tblW w:w="0" w:type="auto"/>
+        <w:tblInd w:w="0" w:type="dxa"/>
+        <w:tblBorders>
+          <w:top w:val="single" w:color="auto" w:sz="4" w:space="0"/>
+          <w:left w:val="single" w:color="auto" w:sz="4" w:space="0"/>
+          <w:bottom w:val="single" w:color="auto" w:sz="4" w:space="0"/>
+          <w:right w:val="single" w:color="auto" w:sz="4" w:space="0"/>
+          <w:insideH w:val="single" w:color="auto" w:sz="4" w:space="0"/>
+          <w:insideV w:val="single" w:color="auto" w:sz="4" w:space="0"/>
+        </w:tblBorders>
+        <w:tblLayout w:type="autofit"/>
+        <w:tblCellMar>
+          <w:top w:w="0" w:type="dxa"/>
+          <w:left w:w="108" w:type="dxa"/>
+          <w:bottom w:w="0" w:type="dxa"/>
+          <w:right w:w="108" w:type="dxa"/>
+        </w:tblCellMar>
+      </w:tblPr>
+      <w:tblGrid>
+        <w:gridCol w:w="2376"/>
+        <w:gridCol w:w="1057"/>
+      </w:tblGrid>
+      <w:tr>
+        <w:tblPrEx>
+          <w:tblBorders>
+            <w:top w:val="single" w:color="auto" w:sz="4" w:space="0"/>
+            <w:left w:val="single" w:color="auto" w:sz="4" w:space="0"/>
+            <w:bottom w:val="single" w:color="auto" w:sz="4" w:space="0"/>
+            <w:right w:val="single" w:color="auto" w:sz="4" w:space="0"/>
+            <w:insideH w:val="single" w:color="auto" w:sz="4" w:space="0"/>
+            <w:insideV w:val="single" w:color="auto" w:sz="4" w:space="0"/>
+          </w:tblBorders>
+          <w:tblCellMar>
+            <w:top w:w="0" w:type="dxa"/>
+            <w:left w:w="108" w:type="dxa"/>
+            <w:bottom w:w="0" w:type="dxa"/>
+            <w:right w:w="108" w:type="dxa"/>
+          </w:tblCellMar>
+        </w:tblPrEx>
+        <w:trPr>
+          <w:trHeight w:val="90" w:hRule="atLeast"/>
+        </w:trPr>
+        <w:tc>
+          <w:tcPr>
+            <w:tcW w:w="0" w:type="auto"/>
+            <w:vAlign w:val="center"/>
+          </w:tcPr>
+          <w:p>
+            <w:pPr>
+              <w:rPr>
+                <w:rFonts w:hint="default" w:eastAsia="华文中宋" w:cs="华文中宋"/>
+                <w:bCs/>
+                <w:color w:val="FF0000"/>
+                <w:spacing w:val="7"/>
+                <w:lang w:val="en-US" w:eastAsia="zh-CN"/>
+              </w:rPr>
+            </w:pPr>
+            <w:r>
+              <w:rPr>
+                <w:rFonts w:hint="eastAsia" w:cs="华文中宋"/>
+                <w:bCs/>
+                <w:color w:val="FF0000"/>
+                <w:spacing w:val="7"/>
+                <w:lang w:val="en-US" w:eastAsia="zh-CN"/>
+              </w:rPr>
+              <w:t>CameraObservation</w:t>
+            </w:r>
+          </w:p>
+        </w:tc>
+        <w:tc>
+          <w:tcPr>
+            <w:tcW w:w="0" w:type="auto"/>
+            <w:vAlign w:val="center"/>
+          </w:tcPr>
+          <w:p>
+            <w:pPr>
+              <w:rPr>
+                <w:rFonts w:hint="default" w:eastAsia="华文中宋" w:cs="华文中宋"/>
+                <w:bCs/>
+                <w:color w:val="C0504D" w:themeColor="accent2"/>
+                <w:spacing w:val="7"/>
+                <w:lang w:val="en-US" w:eastAsia="zh-CN"/>
+                <w14:textFill>
+                  <w14:solidFill>
+                    <w14:schemeClr w14:val="accent2"/>
+                  </w14:solidFill>
+                </w14:textFill>
+              </w:rPr>
+            </w:pPr>
+            <w:r>
+              <w:rPr>
+                <w:rFonts w:hint="eastAsia" w:cs="华文中宋"/>
+                <w:bCs/>
+                <w:color w:val="EA82F1"/>
+                <w:szCs w:val="24"/>
+                <w:lang w:val="en-US" w:eastAsia="zh-CN"/>
+              </w:rPr>
+              <w:t>相机观测</w:t>
+            </w:r>
+          </w:p>
+        </w:tc>
+      </w:tr>
+    </w:tbl>
+    <w:p>
+      <w:pPr>
+        <w:rPr>
+          <w:rFonts w:hint="default"/>
           <w:lang w:val="en-US" w:eastAsia="zh-CN"/>
         </w:rPr>
       </w:pPr>
@@ -1452,7 +1667,7 @@
                 <w:rFonts w:hint="eastAsia"/>
                 <w:lang w:val="en-US" w:eastAsia="zh-CN"/>
               </w:rPr>
-              <w:t>types.math：</w:t>
+              <w:t>math：</w:t>
             </w:r>
           </w:p>
         </w:tc>
@@ -1648,6 +1863,59 @@
           <w:lang w:val="en-US" w:eastAsia="zh-CN"/>
         </w:rPr>
       </w:pPr>
+    </w:p>
+    <w:p>
+      <w:pPr>
+        <w:rPr>
+          <w:rFonts w:hint="eastAsia" w:cs="华文中宋"/>
+          <w:bCs/>
+          <w:color w:val="FF0000"/>
+          <w:spacing w:val="7"/>
+          <w:lang w:val="en-US" w:eastAsia="zh-CN"/>
+        </w:rPr>
+      </w:pPr>
+    </w:p>
+    <w:p>
+      <w:pPr>
+        <w:pStyle w:val="3"/>
+        <w:bidi w:val="0"/>
+        <w:rPr>
+          <w:rFonts w:hint="eastAsia"/>
+          <w:lang w:val="en-US" w:eastAsia="zh-CN"/>
+        </w:rPr>
+      </w:pPr>
+      <w:r>
+        <w:rPr>
+          <w:rFonts w:hint="eastAsia"/>
+          <w:lang w:val="en-US" w:eastAsia="zh-CN"/>
+        </w:rPr>
+        <w:t>功能wrap：</w:t>
+      </w:r>
+    </w:p>
+    <w:p>
+      <w:pPr>
+        <w:rPr>
+          <w:rFonts w:hint="eastAsia"/>
+          <w:lang w:val="en-US" w:eastAsia="zh-CN"/>
+        </w:rPr>
+      </w:pPr>
+    </w:p>
+    <w:p>
+      <w:pPr>
+        <w:pStyle w:val="4"/>
+        <w:bidi w:val="0"/>
+        <w:rPr>
+          <w:rFonts w:hint="default"/>
+          <w:lang w:val="en-US" w:eastAsia="zh-CN"/>
+        </w:rPr>
+      </w:pPr>
+      <w:r>
+        <w:rPr>
+          <w:rFonts w:hint="eastAsia"/>
+          <w:lang w:val="en-US" w:eastAsia="zh-CN"/>
+        </w:rPr>
+        <w:t>抵达reacher：</w:t>
+      </w:r>
     </w:p>
     <w:tbl>
       <w:tblPr>
@@ -1671,9 +1939,9 @@
         </w:tblCellMar>
       </w:tblPr>
       <w:tblGrid>
-        <w:gridCol w:w="1069"/>
-        <w:gridCol w:w="4003"/>
-        <w:gridCol w:w="1506"/>
+        <w:gridCol w:w="1057"/>
+        <w:gridCol w:w="6200"/>
+        <w:gridCol w:w="1577"/>
       </w:tblGrid>
       <w:tr>
         <w:tblPrEx>
@@ -1718,7 +1986,7 @@
                 <w:rFonts w:hint="eastAsia"/>
                 <w:lang w:val="en-US" w:eastAsia="zh-CN"/>
               </w:rPr>
-              <w:t>wrap.reacher.motion_gen：</w:t>
+              <w:t>motion_gen：</w:t>
             </w:r>
           </w:p>
         </w:tc>
@@ -1745,7 +2013,7 @@
         </w:trPr>
         <w:tc>
           <w:tcPr>
-            <w:tcW w:w="5072" w:type="dxa"/>
+            <w:tcW w:w="0" w:type="auto"/>
             <w:gridSpan w:val="2"/>
             <w:vAlign w:val="center"/>
           </w:tcPr>
@@ -1773,7 +2041,7 @@
         </w:tc>
         <w:tc>
           <w:tcPr>
-            <w:tcW w:w="1506" w:type="dxa"/>
+            <w:tcW w:w="0" w:type="auto"/>
             <w:vAlign w:val="center"/>
           </w:tcPr>
           <w:p>
@@ -1831,6 +2099,7 @@
         <w:tc>
           <w:tcPr>
             <w:tcW w:w="0" w:type="auto"/>
+            <w:vMerge w:val="restart"/>
             <w:vAlign w:val="center"/>
           </w:tcPr>
           <w:p>
@@ -1854,13 +2123,13 @@
         </w:tc>
         <w:tc>
           <w:tcPr>
-            <w:tcW w:w="3959" w:type="dxa"/>
-            <w:vAlign w:val="center"/>
-          </w:tcPr>
-          <w:p>
-            <w:pPr>
-              <w:rPr>
-                <w:rFonts w:hint="default" w:eastAsia="华文中宋" w:cs="华文中宋"/>
+            <w:tcW w:w="0" w:type="auto"/>
+            <w:vAlign w:val="center"/>
+          </w:tcPr>
+          <w:p>
+            <w:pPr>
+              <w:rPr>
+                <w:rFonts w:hint="default" w:cs="华文中宋"/>
                 <w:bCs/>
                 <w:color w:val="FF0000"/>
                 <w:spacing w:val="7"/>
@@ -1875,39 +2144,51 @@
                 <w:spacing w:val="7"/>
                 <w:lang w:val="en-US" w:eastAsia="zh-CN"/>
               </w:rPr>
-              <w:t>plan_single(start_state, goal_pose)</w:t>
-            </w:r>
-          </w:p>
-        </w:tc>
-        <w:tc>
-          <w:tcPr>
-            <w:tcW w:w="1506" w:type="dxa"/>
-            <w:vAlign w:val="center"/>
-          </w:tcPr>
-          <w:p>
-            <w:pPr>
-              <w:rPr>
-                <w:rFonts w:hint="default" w:eastAsia="华文中宋" w:cs="华文中宋"/>
-                <w:bCs/>
-                <w:color w:val="C0504D" w:themeColor="accent2"/>
+              <w:t>add_camera_frame(</w:t>
+            </w:r>
+            <w:r>
+              <w:rPr>
+                <w:rFonts w:hint="eastAsia"/>
+                <w:lang w:val="en-US" w:eastAsia="zh-CN"/>
+              </w:rPr>
+              <w:t>CameraObservation</w:t>
+            </w:r>
+            <w:r>
+              <w:rPr>
+                <w:rFonts w:hint="eastAsia" w:cs="华文中宋"/>
+                <w:bCs/>
+                <w:color w:val="FF0000"/>
                 <w:spacing w:val="7"/>
                 <w:lang w:val="en-US" w:eastAsia="zh-CN"/>
-                <w14:textFill>
-                  <w14:solidFill>
-                    <w14:schemeClr w14:val="accent2"/>
-                  </w14:solidFill>
-                </w14:textFill>
-              </w:rPr>
-            </w:pPr>
-            <w:r>
-              <w:rPr>
-                <w:rFonts w:hint="eastAsia" w:cs="华文中宋"/>
+              </w:rPr>
+              <w:t>, obstacle_name)</w:t>
+            </w:r>
+          </w:p>
+        </w:tc>
+        <w:tc>
+          <w:tcPr>
+            <w:tcW w:w="0" w:type="auto"/>
+            <w:vAlign w:val="center"/>
+          </w:tcPr>
+          <w:p>
+            <w:pPr>
+              <w:rPr>
+                <w:rFonts w:hint="default" w:cs="华文中宋"/>
                 <w:bCs/>
                 <w:color w:val="EA82F1"/>
                 <w:szCs w:val="24"/>
                 <w:lang w:val="en-US" w:eastAsia="zh-CN"/>
               </w:rPr>
-              <w:t>运动规划</w:t>
+            </w:pPr>
+            <w:r>
+              <w:rPr>
+                <w:rFonts w:hint="eastAsia" w:cs="华文中宋"/>
+                <w:bCs/>
+                <w:color w:val="EA82F1"/>
+                <w:szCs w:val="24"/>
+                <w:lang w:val="en-US" w:eastAsia="zh-CN"/>
+              </w:rPr>
+              <w:t>添加到nvblox</w:t>
             </w:r>
           </w:p>
         </w:tc>
@@ -1932,11 +2213,70 @@
         <w:tc>
           <w:tcPr>
             <w:tcW w:w="0" w:type="auto"/>
-            <w:gridSpan w:val="3"/>
-            <w:vAlign w:val="center"/>
-          </w:tcPr>
-          <w:p>
-            <w:pPr>
+            <w:vMerge w:val="continue"/>
+            <w:tcBorders/>
+            <w:vAlign w:val="center"/>
+          </w:tcPr>
+          <w:p>
+            <w:pPr>
+              <w:rPr>
+                <w:rFonts w:hint="default" w:eastAsia="华文中宋" w:cs="华文中宋"/>
+                <w:bCs/>
+                <w:color w:val="FF0000"/>
+                <w:spacing w:val="7"/>
+                <w:lang w:val="en-US" w:eastAsia="zh-CN"/>
+              </w:rPr>
+            </w:pPr>
+          </w:p>
+        </w:tc>
+        <w:tc>
+          <w:tcPr>
+            <w:tcW w:w="0" w:type="auto"/>
+            <w:vAlign w:val="center"/>
+          </w:tcPr>
+          <w:p>
+            <w:pPr>
+              <w:rPr>
+                <w:rFonts w:hint="default" w:eastAsia="华文中宋" w:cs="华文中宋"/>
+                <w:bCs/>
+                <w:color w:val="FF0000"/>
+                <w:spacing w:val="7"/>
+                <w:lang w:val="en-US" w:eastAsia="zh-CN"/>
+              </w:rPr>
+            </w:pPr>
+            <w:r>
+              <w:rPr>
+                <w:rFonts w:hint="eastAsia" w:cs="华文中宋"/>
+                <w:bCs/>
+                <w:color w:val="FF0000"/>
+                <w:spacing w:val="7"/>
+                <w:lang w:val="en-US" w:eastAsia="zh-CN"/>
+              </w:rPr>
+              <w:t>plan_single(start_state, goal_pose)</w:t>
+            </w:r>
+          </w:p>
+        </w:tc>
+        <w:tc>
+          <w:tcPr>
+            <w:tcW w:w="0" w:type="auto"/>
+            <w:vAlign w:val="center"/>
+          </w:tcPr>
+          <w:p>
+            <w:pPr>
+              <w:rPr>
+                <w:rFonts w:hint="default" w:eastAsia="华文中宋" w:cs="华文中宋"/>
+                <w:bCs/>
+                <w:color w:val="C0504D" w:themeColor="accent2"/>
+                <w:spacing w:val="7"/>
+                <w:lang w:val="en-US" w:eastAsia="zh-CN"/>
+                <w14:textFill>
+                  <w14:solidFill>
+                    <w14:schemeClr w14:val="accent2"/>
+                  </w14:solidFill>
+                </w14:textFill>
+              </w:rPr>
+            </w:pPr>
+            <w:r>
               <w:rPr>
                 <w:rFonts w:hint="eastAsia" w:cs="华文中宋"/>
                 <w:bCs/>
@@ -1944,7 +2284,8 @@
                 <w:szCs w:val="24"/>
                 <w:lang w:val="en-US" w:eastAsia="zh-CN"/>
               </w:rPr>
-            </w:pPr>
+              <w:t>运动规划</w:t>
+            </w:r>
           </w:p>
         </w:tc>
       </w:tr>
@@ -1967,23 +2308,33 @@
         </w:tblPrEx>
         <w:tc>
           <w:tcPr>
-            <w:tcW w:w="5072" w:type="dxa"/>
-            <w:gridSpan w:val="2"/>
-            <w:shd w:val="clear" w:color="auto" w:fill="auto"/>
-            <w:vAlign w:val="center"/>
-          </w:tcPr>
-          <w:p>
-            <w:pPr>
-              <w:rPr>
-                <w:rFonts w:hint="eastAsia" w:ascii="华文中宋" w:hAnsi="华文中宋" w:eastAsia="华文中宋" w:cs="华文中宋"/>
-                <w:b/>
+            <w:tcW w:w="0" w:type="auto"/>
+            <w:vMerge w:val="continue"/>
+            <w:tcBorders/>
+            <w:vAlign w:val="center"/>
+          </w:tcPr>
+          <w:p>
+            <w:pPr>
+              <w:rPr>
+                <w:rFonts w:hint="eastAsia"/>
+                <w:lang w:val="en-US" w:eastAsia="zh-CN"/>
+              </w:rPr>
+            </w:pPr>
+          </w:p>
+        </w:tc>
+        <w:tc>
+          <w:tcPr>
+            <w:tcW w:w="0" w:type="auto"/>
+            <w:vAlign w:val="center"/>
+          </w:tcPr>
+          <w:p>
+            <w:pPr>
+              <w:rPr>
+                <w:rFonts w:hint="default" w:cs="华文中宋"/>
                 <w:bCs/>
                 <w:color w:val="FF0000"/>
                 <w:spacing w:val="7"/>
-                <w:kern w:val="2"/>
-                <w:sz w:val="21"/>
-                <w:szCs w:val="21"/>
-                <w:lang w:val="en-US" w:eastAsia="zh-CN" w:bidi="ar-SA"/>
+                <w:lang w:val="en-US" w:eastAsia="zh-CN"/>
               </w:rPr>
             </w:pPr>
             <w:r>
@@ -1994,36 +2345,17 @@
                 <w:spacing w:val="7"/>
                 <w:lang w:val="en-US" w:eastAsia="zh-CN"/>
               </w:rPr>
-              <w:t>MotionGenResult</w:t>
-            </w:r>
-          </w:p>
-        </w:tc>
-        <w:tc>
-          <w:tcPr>
-            <w:tcW w:w="1506" w:type="dxa"/>
-            <w:shd w:val="clear" w:color="auto" w:fill="auto"/>
-            <w:vAlign w:val="center"/>
-          </w:tcPr>
-          <w:p>
-            <w:pPr>
-              <w:rPr>
-                <w:rFonts w:hint="eastAsia" w:ascii="华文中宋" w:hAnsi="华文中宋" w:eastAsia="华文中宋" w:cs="华文中宋"/>
-                <w:b/>
-                <w:bCs/>
-                <w:color w:val="C0504D" w:themeColor="accent2"/>
-                <w:spacing w:val="7"/>
-                <w:kern w:val="2"/>
-                <w:sz w:val="21"/>
-                <w:szCs w:val="21"/>
-                <w:lang w:val="en-US" w:eastAsia="zh-CN" w:bidi="ar-SA"/>
-                <w14:textFill>
-                  <w14:solidFill>
-                    <w14:schemeClr w14:val="accent2"/>
-                  </w14:solidFill>
-                </w14:textFill>
-              </w:rPr>
-            </w:pPr>
-            <w:r>
+              <w:t>plan_grasp(start_state, grasp_poses)</w:t>
+            </w:r>
+          </w:p>
+        </w:tc>
+        <w:tc>
+          <w:tcPr>
+            <w:tcW w:w="0" w:type="auto"/>
+            <w:vAlign w:val="center"/>
+          </w:tcPr>
+          <w:p>
+            <w:pPr>
               <w:rPr>
                 <w:rFonts w:hint="eastAsia" w:cs="华文中宋"/>
                 <w:bCs/>
@@ -2031,14 +2363,16 @@
                 <w:szCs w:val="24"/>
                 <w:lang w:val="en-US" w:eastAsia="zh-CN"/>
               </w:rPr>
-              <w:t>运动生成</w:t>
-            </w:r>
-            <w:r>
-              <w:rPr>
-                <w:rFonts w:hint="eastAsia"/>
-                <w:lang w:val="en-US" w:eastAsia="zh-CN"/>
-              </w:rPr>
-              <w:t>结果</w:t>
+            </w:pPr>
+            <w:r>
+              <w:rPr>
+                <w:rFonts w:hint="eastAsia" w:cs="华文中宋"/>
+                <w:bCs/>
+                <w:color w:val="EA82F1"/>
+                <w:szCs w:val="24"/>
+                <w:lang w:val="en-US" w:eastAsia="zh-CN"/>
+              </w:rPr>
+              <w:t>抓取规划</w:t>
             </w:r>
           </w:p>
         </w:tc>
@@ -2063,6 +2397,43 @@
         <w:tc>
           <w:tcPr>
             <w:tcW w:w="0" w:type="auto"/>
+            <w:gridSpan w:val="3"/>
+            <w:vAlign w:val="center"/>
+          </w:tcPr>
+          <w:p>
+            <w:pPr>
+              <w:rPr>
+                <w:rFonts w:hint="eastAsia" w:cs="华文中宋"/>
+                <w:bCs/>
+                <w:color w:val="EA82F1"/>
+                <w:szCs w:val="24"/>
+                <w:lang w:val="en-US" w:eastAsia="zh-CN"/>
+              </w:rPr>
+            </w:pPr>
+          </w:p>
+        </w:tc>
+      </w:tr>
+      <w:tr>
+        <w:tblPrEx>
+          <w:tblBorders>
+            <w:top w:val="single" w:color="auto" w:sz="4" w:space="0"/>
+            <w:left w:val="single" w:color="auto" w:sz="4" w:space="0"/>
+            <w:bottom w:val="single" w:color="auto" w:sz="4" w:space="0"/>
+            <w:right w:val="single" w:color="auto" w:sz="4" w:space="0"/>
+            <w:insideH w:val="single" w:color="auto" w:sz="4" w:space="0"/>
+            <w:insideV w:val="single" w:color="auto" w:sz="4" w:space="0"/>
+          </w:tblBorders>
+          <w:tblCellMar>
+            <w:top w:w="0" w:type="dxa"/>
+            <w:left w:w="108" w:type="dxa"/>
+            <w:bottom w:w="0" w:type="dxa"/>
+            <w:right w:w="108" w:type="dxa"/>
+          </w:tblCellMar>
+        </w:tblPrEx>
+        <w:tc>
+          <w:tcPr>
+            <w:tcW w:w="0" w:type="auto"/>
+            <w:gridSpan w:val="2"/>
             <w:shd w:val="clear" w:color="auto" w:fill="auto"/>
             <w:vAlign w:val="center"/>
           </w:tcPr>
@@ -2082,23 +2453,88 @@
             </w:pPr>
             <w:r>
               <w:rPr>
-                <w:rFonts w:hint="eastAsia"/>
-                <w:lang w:val="en-US" w:eastAsia="zh-CN"/>
-              </w:rPr>
-              <w:t>实例方法</w:t>
-            </w:r>
-          </w:p>
-        </w:tc>
-        <w:tc>
-          <w:tcPr>
-            <w:tcW w:w="3959" w:type="dxa"/>
+                <w:rFonts w:hint="eastAsia" w:cs="华文中宋"/>
+                <w:bCs/>
+                <w:color w:val="FF0000"/>
+                <w:spacing w:val="7"/>
+                <w:lang w:val="en-US" w:eastAsia="zh-CN"/>
+              </w:rPr>
+              <w:t>MotionGenResult</w:t>
+            </w:r>
+          </w:p>
+        </w:tc>
+        <w:tc>
+          <w:tcPr>
+            <w:tcW w:w="0" w:type="auto"/>
             <w:shd w:val="clear" w:color="auto" w:fill="auto"/>
             <w:vAlign w:val="center"/>
           </w:tcPr>
           <w:p>
             <w:pPr>
               <w:rPr>
-                <w:rFonts w:hint="default" w:ascii="华文中宋" w:hAnsi="华文中宋" w:eastAsia="华文中宋" w:cs="华文中宋"/>
+                <w:rFonts w:hint="eastAsia" w:ascii="华文中宋" w:hAnsi="华文中宋" w:eastAsia="华文中宋" w:cs="华文中宋"/>
+                <w:b/>
+                <w:bCs/>
+                <w:color w:val="C0504D" w:themeColor="accent2"/>
+                <w:spacing w:val="7"/>
+                <w:kern w:val="2"/>
+                <w:sz w:val="21"/>
+                <w:szCs w:val="21"/>
+                <w:lang w:val="en-US" w:eastAsia="zh-CN" w:bidi="ar-SA"/>
+                <w14:textFill>
+                  <w14:solidFill>
+                    <w14:schemeClr w14:val="accent2"/>
+                  </w14:solidFill>
+                </w14:textFill>
+              </w:rPr>
+            </w:pPr>
+            <w:r>
+              <w:rPr>
+                <w:rFonts w:hint="eastAsia" w:cs="华文中宋"/>
+                <w:bCs/>
+                <w:color w:val="EA82F1"/>
+                <w:szCs w:val="24"/>
+                <w:lang w:val="en-US" w:eastAsia="zh-CN"/>
+              </w:rPr>
+              <w:t>运动生成</w:t>
+            </w:r>
+            <w:r>
+              <w:rPr>
+                <w:rFonts w:hint="eastAsia"/>
+                <w:lang w:val="en-US" w:eastAsia="zh-CN"/>
+              </w:rPr>
+              <w:t>结果</w:t>
+            </w:r>
+          </w:p>
+        </w:tc>
+      </w:tr>
+      <w:tr>
+        <w:tblPrEx>
+          <w:tblBorders>
+            <w:top w:val="single" w:color="auto" w:sz="4" w:space="0"/>
+            <w:left w:val="single" w:color="auto" w:sz="4" w:space="0"/>
+            <w:bottom w:val="single" w:color="auto" w:sz="4" w:space="0"/>
+            <w:right w:val="single" w:color="auto" w:sz="4" w:space="0"/>
+            <w:insideH w:val="single" w:color="auto" w:sz="4" w:space="0"/>
+            <w:insideV w:val="single" w:color="auto" w:sz="4" w:space="0"/>
+          </w:tblBorders>
+          <w:tblCellMar>
+            <w:top w:w="0" w:type="dxa"/>
+            <w:left w:w="108" w:type="dxa"/>
+            <w:bottom w:w="0" w:type="dxa"/>
+            <w:right w:w="108" w:type="dxa"/>
+          </w:tblCellMar>
+        </w:tblPrEx>
+        <w:tc>
+          <w:tcPr>
+            <w:tcW w:w="0" w:type="auto"/>
+            <w:shd w:val="clear" w:color="auto" w:fill="auto"/>
+            <w:vAlign w:val="center"/>
+          </w:tcPr>
+          <w:p>
+            <w:pPr>
+              <w:rPr>
+                <w:rFonts w:hint="eastAsia" w:ascii="华文中宋" w:hAnsi="华文中宋" w:eastAsia="华文中宋" w:cs="华文中宋"/>
                 <w:b/>
                 <w:bCs/>
                 <w:color w:val="FF0000"/>
@@ -2111,7 +2547,23 @@
             </w:pPr>
             <w:r>
               <w:rPr>
-                <w:rFonts w:hint="eastAsia" w:cs="华文中宋"/>
+                <w:rFonts w:hint="eastAsia"/>
+                <w:lang w:val="en-US" w:eastAsia="zh-CN"/>
+              </w:rPr>
+              <w:t>实例方法</w:t>
+            </w:r>
+          </w:p>
+        </w:tc>
+        <w:tc>
+          <w:tcPr>
+            <w:tcW w:w="0" w:type="auto"/>
+            <w:shd w:val="clear" w:color="auto" w:fill="auto"/>
+            <w:vAlign w:val="center"/>
+          </w:tcPr>
+          <w:p>
+            <w:pPr>
+              <w:rPr>
+                <w:rFonts w:hint="default" w:ascii="华文中宋" w:hAnsi="华文中宋" w:eastAsia="华文中宋" w:cs="华文中宋"/>
                 <w:b/>
                 <w:bCs/>
                 <w:color w:val="FF0000"/>
@@ -2121,13 +2573,26 @@
                 <w:szCs w:val="21"/>
                 <w:lang w:val="en-US" w:eastAsia="zh-CN" w:bidi="ar-SA"/>
               </w:rPr>
+            </w:pPr>
+            <w:r>
+              <w:rPr>
+                <w:rFonts w:hint="eastAsia" w:cs="华文中宋"/>
+                <w:b/>
+                <w:bCs/>
+                <w:color w:val="FF0000"/>
+                <w:spacing w:val="7"/>
+                <w:kern w:val="2"/>
+                <w:sz w:val="21"/>
+                <w:szCs w:val="21"/>
+                <w:lang w:val="en-US" w:eastAsia="zh-CN" w:bidi="ar-SA"/>
+              </w:rPr>
               <w:t>get_interpolated_plan()</w:t>
             </w:r>
           </w:p>
         </w:tc>
         <w:tc>
           <w:tcPr>
-            <w:tcW w:w="1506" w:type="dxa"/>
+            <w:tcW w:w="0" w:type="auto"/>
             <w:shd w:val="clear" w:color="auto" w:fill="auto"/>
             <w:vAlign w:val="center"/>
           </w:tcPr>
@@ -2244,7 +2709,7 @@
                 <w:rFonts w:hint="eastAsia"/>
                 <w:lang w:val="en-US" w:eastAsia="zh-CN"/>
               </w:rPr>
-              <w:t>wrap.reacher.ik_solver：</w:t>
+              <w:t>ik_solver：</w:t>
             </w:r>
           </w:p>
         </w:tc>
@@ -2801,6 +3266,972 @@
         </w:tc>
       </w:tr>
     </w:tbl>
+    <w:p>
+      <w:pPr>
+        <w:bidi w:val="0"/>
+        <w:outlineLvl w:val="9"/>
+        <w:rPr>
+          <w:rFonts w:hint="eastAsia"/>
+          <w:lang w:val="en-US" w:eastAsia="zh-CN"/>
+        </w:rPr>
+      </w:pPr>
+    </w:p>
+    <w:p>
+      <w:pPr>
+        <w:bidi w:val="0"/>
+        <w:outlineLvl w:val="9"/>
+        <w:rPr>
+          <w:rFonts w:hint="eastAsia"/>
+          <w:lang w:val="en-US" w:eastAsia="zh-CN"/>
+        </w:rPr>
+      </w:pPr>
+    </w:p>
+    <w:p>
+      <w:pPr>
+        <w:pStyle w:val="3"/>
+        <w:bidi w:val="0"/>
+        <w:rPr>
+          <w:rFonts w:hint="eastAsia"/>
+          <w:lang w:val="en-US" w:eastAsia="zh-CN"/>
+        </w:rPr>
+      </w:pPr>
+      <w:r>
+        <w:rPr>
+          <w:rFonts w:hint="eastAsia"/>
+          <w:lang w:val="en-US" w:eastAsia="zh-CN"/>
+        </w:rPr>
+        <w:t>拓展rollout：</w:t>
+      </w:r>
+    </w:p>
+    <w:p>
+      <w:pPr>
+        <w:rPr>
+          <w:rFonts w:hint="eastAsia"/>
+          <w:lang w:val="en-US" w:eastAsia="zh-CN"/>
+        </w:rPr>
+      </w:pPr>
+    </w:p>
+    <w:p>
+      <w:pPr>
+        <w:pStyle w:val="4"/>
+        <w:bidi w:val="0"/>
+        <w:rPr>
+          <w:rFonts w:hint="eastAsia"/>
+          <w:lang w:val="en-US" w:eastAsia="zh-CN"/>
+        </w:rPr>
+      </w:pPr>
+      <w:r>
+        <w:rPr>
+          <w:rFonts w:hint="eastAsia"/>
+          <w:lang w:val="en-US" w:eastAsia="zh-CN"/>
+        </w:rPr>
+        <w:t>代价cost：</w:t>
+      </w:r>
+    </w:p>
+    <w:tbl>
+      <w:tblPr>
+        <w:tblStyle w:val="8"/>
+        <w:tblW w:w="0" w:type="auto"/>
+        <w:tblInd w:w="0" w:type="dxa"/>
+        <w:tblBorders>
+          <w:top w:val="single" w:color="auto" w:sz="4" w:space="0"/>
+          <w:left w:val="single" w:color="auto" w:sz="4" w:space="0"/>
+          <w:bottom w:val="single" w:color="auto" w:sz="4" w:space="0"/>
+          <w:right w:val="single" w:color="auto" w:sz="4" w:space="0"/>
+          <w:insideH w:val="single" w:color="auto" w:sz="4" w:space="0"/>
+          <w:insideV w:val="single" w:color="auto" w:sz="4" w:space="0"/>
+        </w:tblBorders>
+        <w:tblLayout w:type="autofit"/>
+        <w:tblCellMar>
+          <w:top w:w="0" w:type="dxa"/>
+          <w:left w:w="108" w:type="dxa"/>
+          <w:bottom w:w="0" w:type="dxa"/>
+          <w:right w:w="108" w:type="dxa"/>
+        </w:tblCellMar>
+      </w:tblPr>
+      <w:tblGrid>
+        <w:gridCol w:w="1134"/>
+        <w:gridCol w:w="2021"/>
+        <w:gridCol w:w="1057"/>
+      </w:tblGrid>
+      <w:tr>
+        <w:tblPrEx>
+          <w:tblBorders>
+            <w:top w:val="single" w:color="auto" w:sz="4" w:space="0"/>
+            <w:left w:val="single" w:color="auto" w:sz="4" w:space="0"/>
+            <w:bottom w:val="single" w:color="auto" w:sz="4" w:space="0"/>
+            <w:right w:val="single" w:color="auto" w:sz="4" w:space="0"/>
+            <w:insideH w:val="single" w:color="auto" w:sz="4" w:space="0"/>
+            <w:insideV w:val="single" w:color="auto" w:sz="4" w:space="0"/>
+          </w:tblBorders>
+          <w:tblCellMar>
+            <w:top w:w="0" w:type="dxa"/>
+            <w:left w:w="108" w:type="dxa"/>
+            <w:bottom w:w="0" w:type="dxa"/>
+            <w:right w:w="108" w:type="dxa"/>
+          </w:tblCellMar>
+        </w:tblPrEx>
+        <w:tc>
+          <w:tcPr>
+            <w:tcW w:w="0" w:type="auto"/>
+            <w:gridSpan w:val="2"/>
+            <w:shd w:val="clear" w:color="auto" w:fill="auto"/>
+            <w:vAlign w:val="center"/>
+          </w:tcPr>
+          <w:p>
+            <w:pPr>
+              <w:rPr>
+                <w:rFonts w:hint="default" w:ascii="华文中宋" w:hAnsi="华文中宋" w:eastAsia="华文中宋" w:cs="华文中宋"/>
+                <w:b/>
+                <w:bCs/>
+                <w:color w:val="FF0000"/>
+                <w:spacing w:val="7"/>
+                <w:kern w:val="2"/>
+                <w:sz w:val="21"/>
+                <w:szCs w:val="21"/>
+                <w:lang w:val="en-US" w:eastAsia="zh-CN" w:bidi="ar-SA"/>
+              </w:rPr>
+            </w:pPr>
+            <w:r>
+              <w:rPr>
+                <w:rFonts w:hint="eastAsia" w:cs="华文中宋"/>
+                <w:b/>
+                <w:bCs/>
+                <w:color w:val="FF0000"/>
+                <w:spacing w:val="7"/>
+                <w:kern w:val="2"/>
+                <w:sz w:val="21"/>
+                <w:szCs w:val="21"/>
+                <w:lang w:val="en-US" w:eastAsia="zh-CN" w:bidi="ar-SA"/>
+              </w:rPr>
+              <w:t>cost_base.CostBase(config)</w:t>
+            </w:r>
+          </w:p>
+        </w:tc>
+        <w:tc>
+          <w:tcPr>
+            <w:tcW w:w="0" w:type="auto"/>
+            <w:shd w:val="clear" w:color="auto" w:fill="auto"/>
+            <w:vAlign w:val="center"/>
+          </w:tcPr>
+          <w:p>
+            <w:pPr>
+              <w:rPr>
+                <w:rFonts w:hint="default" w:ascii="华文中宋" w:hAnsi="华文中宋" w:eastAsia="华文中宋" w:cs="华文中宋"/>
+                <w:b/>
+                <w:bCs/>
+                <w:color w:val="C0504D" w:themeColor="accent2"/>
+                <w:spacing w:val="7"/>
+                <w:kern w:val="2"/>
+                <w:sz w:val="21"/>
+                <w:szCs w:val="21"/>
+                <w:lang w:val="en-US" w:eastAsia="zh-CN" w:bidi="ar-SA"/>
+                <w14:textFill>
+                  <w14:solidFill>
+                    <w14:schemeClr w14:val="accent2"/>
+                  </w14:solidFill>
+                </w14:textFill>
+              </w:rPr>
+            </w:pPr>
+            <w:r>
+              <w:rPr>
+                <w:rFonts w:hint="eastAsia" w:cs="华文中宋"/>
+                <w:bCs/>
+                <w:color w:val="EA82F1"/>
+                <w:szCs w:val="24"/>
+                <w:lang w:val="en-US" w:eastAsia="zh-CN"/>
+              </w:rPr>
+              <w:t>代价基类</w:t>
+            </w:r>
+          </w:p>
+        </w:tc>
+      </w:tr>
+      <w:tr>
+        <w:tblPrEx>
+          <w:tblBorders>
+            <w:top w:val="single" w:color="auto" w:sz="4" w:space="0"/>
+            <w:left w:val="single" w:color="auto" w:sz="4" w:space="0"/>
+            <w:bottom w:val="single" w:color="auto" w:sz="4" w:space="0"/>
+            <w:right w:val="single" w:color="auto" w:sz="4" w:space="0"/>
+            <w:insideH w:val="single" w:color="auto" w:sz="4" w:space="0"/>
+            <w:insideV w:val="single" w:color="auto" w:sz="4" w:space="0"/>
+          </w:tblBorders>
+          <w:tblCellMar>
+            <w:top w:w="0" w:type="dxa"/>
+            <w:left w:w="108" w:type="dxa"/>
+            <w:bottom w:w="0" w:type="dxa"/>
+            <w:right w:w="108" w:type="dxa"/>
+          </w:tblCellMar>
+        </w:tblPrEx>
+        <w:tc>
+          <w:tcPr>
+            <w:tcW w:w="0" w:type="auto"/>
+            <w:shd w:val="clear" w:color="auto" w:fill="auto"/>
+            <w:vAlign w:val="center"/>
+          </w:tcPr>
+          <w:p>
+            <w:pPr>
+              <w:rPr>
+                <w:rFonts w:hint="eastAsia" w:ascii="华文中宋" w:hAnsi="华文中宋" w:eastAsia="华文中宋" w:cs="华文中宋"/>
+                <w:b/>
+                <w:bCs/>
+                <w:color w:val="FF0000"/>
+                <w:spacing w:val="7"/>
+                <w:kern w:val="2"/>
+                <w:sz w:val="21"/>
+                <w:szCs w:val="21"/>
+                <w:lang w:val="en-US" w:eastAsia="zh-CN" w:bidi="ar-SA"/>
+              </w:rPr>
+            </w:pPr>
+            <w:r>
+              <w:rPr>
+                <w:rFonts w:hint="eastAsia"/>
+                <w:lang w:val="en-US" w:eastAsia="zh-CN"/>
+              </w:rPr>
+              <w:t>实例方法</w:t>
+            </w:r>
+          </w:p>
+        </w:tc>
+        <w:tc>
+          <w:tcPr>
+            <w:tcW w:w="0" w:type="auto"/>
+            <w:shd w:val="clear" w:color="auto" w:fill="auto"/>
+            <w:vAlign w:val="center"/>
+          </w:tcPr>
+          <w:p>
+            <w:pPr>
+              <w:rPr>
+                <w:rFonts w:hint="default" w:ascii="华文中宋" w:hAnsi="华文中宋" w:eastAsia="华文中宋" w:cs="华文中宋"/>
+                <w:b/>
+                <w:bCs/>
+                <w:color w:val="FF0000"/>
+                <w:spacing w:val="7"/>
+                <w:kern w:val="2"/>
+                <w:sz w:val="21"/>
+                <w:szCs w:val="21"/>
+                <w:lang w:val="en-US" w:eastAsia="zh-CN" w:bidi="ar-SA"/>
+              </w:rPr>
+            </w:pPr>
+            <w:r>
+              <w:rPr>
+                <w:rFonts w:hint="eastAsia" w:cs="华文中宋"/>
+                <w:b/>
+                <w:bCs/>
+                <w:color w:val="FF0000"/>
+                <w:spacing w:val="7"/>
+                <w:kern w:val="2"/>
+                <w:sz w:val="21"/>
+                <w:szCs w:val="21"/>
+                <w:lang w:val="en-US" w:eastAsia="zh-CN" w:bidi="ar-SA"/>
+              </w:rPr>
+              <w:t>forward(q)</w:t>
+            </w:r>
+          </w:p>
+        </w:tc>
+        <w:tc>
+          <w:tcPr>
+            <w:tcW w:w="0" w:type="auto"/>
+            <w:shd w:val="clear" w:color="auto" w:fill="auto"/>
+            <w:vAlign w:val="center"/>
+          </w:tcPr>
+          <w:p>
+            <w:pPr>
+              <w:rPr>
+                <w:rFonts w:hint="eastAsia" w:ascii="华文中宋" w:hAnsi="华文中宋" w:eastAsia="华文中宋" w:cs="华文中宋"/>
+                <w:b/>
+                <w:bCs/>
+                <w:color w:val="C0504D" w:themeColor="accent2"/>
+                <w:spacing w:val="7"/>
+                <w:kern w:val="2"/>
+                <w:sz w:val="21"/>
+                <w:szCs w:val="21"/>
+                <w:lang w:val="en-US" w:eastAsia="zh-CN" w:bidi="ar-SA"/>
+                <w14:textFill>
+                  <w14:solidFill>
+                    <w14:schemeClr w14:val="accent2"/>
+                  </w14:solidFill>
+                </w14:textFill>
+              </w:rPr>
+            </w:pPr>
+          </w:p>
+        </w:tc>
+      </w:tr>
+    </w:tbl>
+    <w:p>
+      <w:pPr>
+        <w:rPr>
+          <w:rFonts w:hint="eastAsia"/>
+          <w:lang w:val="en-US" w:eastAsia="zh-CN"/>
+        </w:rPr>
+      </w:pPr>
+    </w:p>
+    <w:tbl>
+      <w:tblPr>
+        <w:tblStyle w:val="8"/>
+        <w:tblW w:w="0" w:type="auto"/>
+        <w:tblInd w:w="0" w:type="dxa"/>
+        <w:tblBorders>
+          <w:top w:val="single" w:color="auto" w:sz="4" w:space="0"/>
+          <w:left w:val="single" w:color="auto" w:sz="4" w:space="0"/>
+          <w:bottom w:val="single" w:color="auto" w:sz="4" w:space="0"/>
+          <w:right w:val="single" w:color="auto" w:sz="4" w:space="0"/>
+          <w:insideH w:val="single" w:color="auto" w:sz="4" w:space="0"/>
+          <w:insideV w:val="single" w:color="auto" w:sz="4" w:space="0"/>
+        </w:tblBorders>
+        <w:tblLayout w:type="autofit"/>
+        <w:tblCellMar>
+          <w:top w:w="0" w:type="dxa"/>
+          <w:left w:w="108" w:type="dxa"/>
+          <w:bottom w:w="0" w:type="dxa"/>
+          <w:right w:w="108" w:type="dxa"/>
+        </w:tblCellMar>
+      </w:tblPr>
+      <w:tblGrid>
+        <w:gridCol w:w="1057"/>
+        <w:gridCol w:w="2116"/>
+        <w:gridCol w:w="1057"/>
+      </w:tblGrid>
+      <w:tr>
+        <w:tblPrEx>
+          <w:tblBorders>
+            <w:top w:val="single" w:color="auto" w:sz="4" w:space="0"/>
+            <w:left w:val="single" w:color="auto" w:sz="4" w:space="0"/>
+            <w:bottom w:val="single" w:color="auto" w:sz="4" w:space="0"/>
+            <w:right w:val="single" w:color="auto" w:sz="4" w:space="0"/>
+            <w:insideH w:val="single" w:color="auto" w:sz="4" w:space="0"/>
+            <w:insideV w:val="single" w:color="auto" w:sz="4" w:space="0"/>
+          </w:tblBorders>
+          <w:tblCellMar>
+            <w:top w:w="0" w:type="dxa"/>
+            <w:left w:w="108" w:type="dxa"/>
+            <w:bottom w:w="0" w:type="dxa"/>
+            <w:right w:w="108" w:type="dxa"/>
+          </w:tblCellMar>
+        </w:tblPrEx>
+        <w:tc>
+          <w:tcPr>
+            <w:tcW w:w="0" w:type="auto"/>
+            <w:gridSpan w:val="2"/>
+            <w:shd w:val="clear" w:color="auto" w:fill="auto"/>
+            <w:vAlign w:val="center"/>
+          </w:tcPr>
+          <w:p>
+            <w:pPr>
+              <w:rPr>
+                <w:rFonts w:hint="default" w:ascii="华文中宋" w:hAnsi="华文中宋" w:eastAsia="华文中宋" w:cs="华文中宋"/>
+                <w:b/>
+                <w:bCs/>
+                <w:color w:val="FF0000"/>
+                <w:spacing w:val="7"/>
+                <w:kern w:val="2"/>
+                <w:sz w:val="21"/>
+                <w:szCs w:val="21"/>
+                <w:lang w:val="en-US" w:eastAsia="zh-CN" w:bidi="ar-SA"/>
+              </w:rPr>
+            </w:pPr>
+            <w:r>
+              <w:rPr>
+                <w:rFonts w:hint="eastAsia" w:cs="华文中宋"/>
+                <w:b/>
+                <w:bCs/>
+                <w:color w:val="FF0000"/>
+                <w:spacing w:val="7"/>
+                <w:kern w:val="2"/>
+                <w:sz w:val="21"/>
+                <w:szCs w:val="21"/>
+                <w:lang w:val="en-US" w:eastAsia="zh-CN" w:bidi="ar-SA"/>
+              </w:rPr>
+              <w:t>dist_cost.DistCost(config)</w:t>
+            </w:r>
+          </w:p>
+        </w:tc>
+        <w:tc>
+          <w:tcPr>
+            <w:tcW w:w="0" w:type="auto"/>
+            <w:shd w:val="clear" w:color="auto" w:fill="auto"/>
+            <w:vAlign w:val="center"/>
+          </w:tcPr>
+          <w:p>
+            <w:pPr>
+              <w:rPr>
+                <w:rFonts w:hint="eastAsia" w:ascii="华文中宋" w:hAnsi="华文中宋" w:eastAsia="华文中宋" w:cs="华文中宋"/>
+                <w:b/>
+                <w:bCs/>
+                <w:color w:val="C0504D" w:themeColor="accent2"/>
+                <w:spacing w:val="7"/>
+                <w:kern w:val="2"/>
+                <w:sz w:val="21"/>
+                <w:szCs w:val="21"/>
+                <w:lang w:val="en-US" w:eastAsia="zh-CN" w:bidi="ar-SA"/>
+                <w14:textFill>
+                  <w14:solidFill>
+                    <w14:schemeClr w14:val="accent2"/>
+                  </w14:solidFill>
+                </w14:textFill>
+              </w:rPr>
+            </w:pPr>
+          </w:p>
+        </w:tc>
+      </w:tr>
+      <w:tr>
+        <w:tblPrEx>
+          <w:tblBorders>
+            <w:top w:val="single" w:color="auto" w:sz="4" w:space="0"/>
+            <w:left w:val="single" w:color="auto" w:sz="4" w:space="0"/>
+            <w:bottom w:val="single" w:color="auto" w:sz="4" w:space="0"/>
+            <w:right w:val="single" w:color="auto" w:sz="4" w:space="0"/>
+            <w:insideH w:val="single" w:color="auto" w:sz="4" w:space="0"/>
+            <w:insideV w:val="single" w:color="auto" w:sz="4" w:space="0"/>
+          </w:tblBorders>
+          <w:tblCellMar>
+            <w:top w:w="0" w:type="dxa"/>
+            <w:left w:w="108" w:type="dxa"/>
+            <w:bottom w:w="0" w:type="dxa"/>
+            <w:right w:w="108" w:type="dxa"/>
+          </w:tblCellMar>
+        </w:tblPrEx>
+        <w:tc>
+          <w:tcPr>
+            <w:tcW w:w="0" w:type="auto"/>
+            <w:shd w:val="clear" w:color="auto" w:fill="auto"/>
+            <w:vAlign w:val="center"/>
+          </w:tcPr>
+          <w:p>
+            <w:pPr>
+              <w:rPr>
+                <w:rFonts w:hint="eastAsia" w:ascii="华文中宋" w:hAnsi="华文中宋" w:eastAsia="华文中宋" w:cs="华文中宋"/>
+                <w:b/>
+                <w:bCs/>
+                <w:color w:val="FF0000"/>
+                <w:spacing w:val="7"/>
+                <w:kern w:val="2"/>
+                <w:sz w:val="21"/>
+                <w:szCs w:val="21"/>
+                <w:lang w:val="en-US" w:eastAsia="zh-CN" w:bidi="ar-SA"/>
+              </w:rPr>
+            </w:pPr>
+            <w:r>
+              <w:rPr>
+                <w:rFonts w:hint="eastAsia"/>
+                <w:lang w:val="en-US" w:eastAsia="zh-CN"/>
+              </w:rPr>
+              <w:t>实例方法</w:t>
+            </w:r>
+          </w:p>
+        </w:tc>
+        <w:tc>
+          <w:tcPr>
+            <w:tcW w:w="0" w:type="auto"/>
+            <w:shd w:val="clear" w:color="auto" w:fill="auto"/>
+            <w:vAlign w:val="center"/>
+          </w:tcPr>
+          <w:p>
+            <w:pPr>
+              <w:rPr>
+                <w:rFonts w:hint="default" w:ascii="华文中宋" w:hAnsi="华文中宋" w:eastAsia="华文中宋" w:cs="华文中宋"/>
+                <w:b/>
+                <w:bCs/>
+                <w:color w:val="FF0000"/>
+                <w:spacing w:val="7"/>
+                <w:kern w:val="2"/>
+                <w:sz w:val="21"/>
+                <w:szCs w:val="21"/>
+                <w:lang w:val="en-US" w:eastAsia="zh-CN" w:bidi="ar-SA"/>
+              </w:rPr>
+            </w:pPr>
+            <w:r>
+              <w:rPr>
+                <w:rFonts w:hint="eastAsia" w:cs="华文中宋"/>
+                <w:b/>
+                <w:bCs/>
+                <w:color w:val="FF0000"/>
+                <w:spacing w:val="7"/>
+                <w:kern w:val="2"/>
+                <w:sz w:val="21"/>
+                <w:szCs w:val="21"/>
+                <w:lang w:val="en-US" w:eastAsia="zh-CN" w:bidi="ar-SA"/>
+              </w:rPr>
+              <w:t>forward(disp_vec)</w:t>
+            </w:r>
+          </w:p>
+        </w:tc>
+        <w:tc>
+          <w:tcPr>
+            <w:tcW w:w="0" w:type="auto"/>
+            <w:shd w:val="clear" w:color="auto" w:fill="auto"/>
+            <w:vAlign w:val="center"/>
+          </w:tcPr>
+          <w:p>
+            <w:pPr>
+              <w:rPr>
+                <w:rFonts w:hint="eastAsia" w:ascii="华文中宋" w:hAnsi="华文中宋" w:eastAsia="华文中宋" w:cs="华文中宋"/>
+                <w:b/>
+                <w:bCs/>
+                <w:color w:val="C0504D" w:themeColor="accent2"/>
+                <w:spacing w:val="7"/>
+                <w:kern w:val="2"/>
+                <w:sz w:val="21"/>
+                <w:szCs w:val="21"/>
+                <w:lang w:val="en-US" w:eastAsia="zh-CN" w:bidi="ar-SA"/>
+                <w14:textFill>
+                  <w14:solidFill>
+                    <w14:schemeClr w14:val="accent2"/>
+                  </w14:solidFill>
+                </w14:textFill>
+              </w:rPr>
+            </w:pPr>
+            <w:r>
+              <w:rPr>
+                <w:rFonts w:hint="eastAsia" w:cs="华文中宋"/>
+                <w:bCs/>
+                <w:color w:val="EA82F1"/>
+                <w:szCs w:val="24"/>
+                <w:lang w:val="en-US" w:eastAsia="zh-CN"/>
+              </w:rPr>
+              <w:t>向量长度</w:t>
+            </w:r>
+          </w:p>
+        </w:tc>
+      </w:tr>
+    </w:tbl>
+    <w:p>
+      <w:pPr>
+        <w:bidi w:val="0"/>
+        <w:outlineLvl w:val="9"/>
+        <w:rPr>
+          <w:rFonts w:hint="eastAsia"/>
+          <w:lang w:val="en-US" w:eastAsia="zh-CN"/>
+        </w:rPr>
+      </w:pPr>
+    </w:p>
+    <w:tbl>
+      <w:tblPr>
+        <w:tblStyle w:val="8"/>
+        <w:tblW w:w="0" w:type="auto"/>
+        <w:tblInd w:w="0" w:type="dxa"/>
+        <w:tblBorders>
+          <w:top w:val="single" w:color="auto" w:sz="4" w:space="0"/>
+          <w:left w:val="single" w:color="auto" w:sz="4" w:space="0"/>
+          <w:bottom w:val="single" w:color="auto" w:sz="4" w:space="0"/>
+          <w:right w:val="single" w:color="auto" w:sz="4" w:space="0"/>
+          <w:insideH w:val="single" w:color="auto" w:sz="4" w:space="0"/>
+          <w:insideV w:val="single" w:color="auto" w:sz="4" w:space="0"/>
+        </w:tblBorders>
+        <w:tblLayout w:type="autofit"/>
+        <w:tblCellMar>
+          <w:top w:w="0" w:type="dxa"/>
+          <w:left w:w="108" w:type="dxa"/>
+          <w:bottom w:w="0" w:type="dxa"/>
+          <w:right w:w="108" w:type="dxa"/>
+        </w:tblCellMar>
+      </w:tblPr>
+      <w:tblGrid>
+        <w:gridCol w:w="1057"/>
+        <w:gridCol w:w="3316"/>
+        <w:gridCol w:w="1057"/>
+      </w:tblGrid>
+      <w:tr>
+        <w:tblPrEx>
+          <w:tblBorders>
+            <w:top w:val="single" w:color="auto" w:sz="4" w:space="0"/>
+            <w:left w:val="single" w:color="auto" w:sz="4" w:space="0"/>
+            <w:bottom w:val="single" w:color="auto" w:sz="4" w:space="0"/>
+            <w:right w:val="single" w:color="auto" w:sz="4" w:space="0"/>
+            <w:insideH w:val="single" w:color="auto" w:sz="4" w:space="0"/>
+            <w:insideV w:val="single" w:color="auto" w:sz="4" w:space="0"/>
+          </w:tblBorders>
+          <w:tblCellMar>
+            <w:top w:w="0" w:type="dxa"/>
+            <w:left w:w="108" w:type="dxa"/>
+            <w:bottom w:w="0" w:type="dxa"/>
+            <w:right w:w="108" w:type="dxa"/>
+          </w:tblCellMar>
+        </w:tblPrEx>
+        <w:trPr>
+          <w:trHeight w:val="90" w:hRule="atLeast"/>
+        </w:trPr>
+        <w:tc>
+          <w:tcPr>
+            <w:tcW w:w="0" w:type="auto"/>
+            <w:gridSpan w:val="2"/>
+            <w:vAlign w:val="center"/>
+          </w:tcPr>
+          <w:p>
+            <w:pPr>
+              <w:rPr>
+                <w:rFonts w:hint="default" w:eastAsia="华文中宋" w:cs="华文中宋"/>
+                <w:bCs/>
+                <w:color w:val="FF0000"/>
+                <w:spacing w:val="7"/>
+                <w:lang w:val="en-US" w:eastAsia="zh-CN"/>
+              </w:rPr>
+            </w:pPr>
+            <w:r>
+              <w:rPr>
+                <w:rFonts w:hint="eastAsia" w:cs="华文中宋"/>
+                <w:bCs/>
+                <w:color w:val="FF0000"/>
+                <w:spacing w:val="7"/>
+                <w:lang w:val="en-US" w:eastAsia="zh-CN"/>
+              </w:rPr>
+              <w:t>pose_cost.PoseCost(config)</w:t>
+            </w:r>
+          </w:p>
+        </w:tc>
+        <w:tc>
+          <w:tcPr>
+            <w:tcW w:w="0" w:type="auto"/>
+            <w:vAlign w:val="center"/>
+          </w:tcPr>
+          <w:p>
+            <w:pPr>
+              <w:rPr>
+                <w:rFonts w:hint="eastAsia" w:eastAsia="华文中宋" w:cs="华文中宋"/>
+                <w:bCs/>
+                <w:color w:val="C0504D" w:themeColor="accent2"/>
+                <w:spacing w:val="7"/>
+                <w:lang w:eastAsia="zh-CN"/>
+                <w14:textFill>
+                  <w14:solidFill>
+                    <w14:schemeClr w14:val="accent2"/>
+                  </w14:solidFill>
+                </w14:textFill>
+              </w:rPr>
+            </w:pPr>
+          </w:p>
+        </w:tc>
+      </w:tr>
+      <w:tr>
+        <w:tblPrEx>
+          <w:tblBorders>
+            <w:top w:val="single" w:color="auto" w:sz="4" w:space="0"/>
+            <w:left w:val="single" w:color="auto" w:sz="4" w:space="0"/>
+            <w:bottom w:val="single" w:color="auto" w:sz="4" w:space="0"/>
+            <w:right w:val="single" w:color="auto" w:sz="4" w:space="0"/>
+            <w:insideH w:val="single" w:color="auto" w:sz="4" w:space="0"/>
+            <w:insideV w:val="single" w:color="auto" w:sz="4" w:space="0"/>
+          </w:tblBorders>
+          <w:tblCellMar>
+            <w:top w:w="0" w:type="dxa"/>
+            <w:left w:w="108" w:type="dxa"/>
+            <w:bottom w:w="0" w:type="dxa"/>
+            <w:right w:w="108" w:type="dxa"/>
+          </w:tblCellMar>
+        </w:tblPrEx>
+        <w:tc>
+          <w:tcPr>
+            <w:tcW w:w="0" w:type="auto"/>
+            <w:vAlign w:val="center"/>
+          </w:tcPr>
+          <w:p>
+            <w:pPr>
+              <w:rPr>
+                <w:rFonts w:hint="default" w:eastAsia="华文中宋" w:cs="华文中宋"/>
+                <w:bCs/>
+                <w:color w:val="FF0000"/>
+                <w:spacing w:val="7"/>
+                <w:lang w:val="en-US" w:eastAsia="zh-CN"/>
+              </w:rPr>
+            </w:pPr>
+            <w:r>
+              <w:rPr>
+                <w:rFonts w:hint="eastAsia"/>
+                <w:lang w:val="en-US" w:eastAsia="zh-CN"/>
+              </w:rPr>
+              <w:t>实例方法</w:t>
+            </w:r>
+          </w:p>
+        </w:tc>
+        <w:tc>
+          <w:tcPr>
+            <w:tcW w:w="0" w:type="auto"/>
+            <w:vAlign w:val="center"/>
+          </w:tcPr>
+          <w:p>
+            <w:pPr>
+              <w:rPr>
+                <w:rFonts w:hint="default" w:eastAsia="华文中宋" w:cs="华文中宋"/>
+                <w:bCs/>
+                <w:color w:val="FF0000"/>
+                <w:spacing w:val="7"/>
+                <w:lang w:val="en-US" w:eastAsia="zh-CN"/>
+              </w:rPr>
+            </w:pPr>
+            <w:r>
+              <w:rPr>
+                <w:rFonts w:hint="eastAsia" w:cs="华文中宋"/>
+                <w:bCs/>
+                <w:color w:val="FF0000"/>
+                <w:spacing w:val="7"/>
+                <w:lang w:val="en-US" w:eastAsia="zh-CN"/>
+              </w:rPr>
+              <w:t>forward(ee_pos, ee_rot, goal)</w:t>
+            </w:r>
+          </w:p>
+        </w:tc>
+        <w:tc>
+          <w:tcPr>
+            <w:tcW w:w="0" w:type="auto"/>
+            <w:vAlign w:val="center"/>
+          </w:tcPr>
+          <w:p>
+            <w:pPr>
+              <w:rPr>
+                <w:rFonts w:hint="default" w:eastAsia="华文中宋" w:cs="华文中宋"/>
+                <w:bCs/>
+                <w:color w:val="C0504D" w:themeColor="accent2"/>
+                <w:spacing w:val="7"/>
+                <w:lang w:val="en-US" w:eastAsia="zh-CN"/>
+                <w14:textFill>
+                  <w14:solidFill>
+                    <w14:schemeClr w14:val="accent2"/>
+                  </w14:solidFill>
+                </w14:textFill>
+              </w:rPr>
+            </w:pPr>
+            <w:r>
+              <w:rPr>
+                <w:rFonts w:hint="eastAsia" w:cs="华文中宋"/>
+                <w:bCs/>
+                <w:color w:val="EA82F1"/>
+                <w:szCs w:val="24"/>
+                <w:lang w:eastAsia="zh-CN"/>
+              </w:rPr>
+              <w:t>位姿</w:t>
+            </w:r>
+            <w:r>
+              <w:rPr>
+                <w:rFonts w:hint="eastAsia" w:cs="华文中宋"/>
+                <w:bCs/>
+                <w:color w:val="EA82F1"/>
+                <w:szCs w:val="24"/>
+                <w:lang w:val="en-US" w:eastAsia="zh-CN"/>
+              </w:rPr>
+              <w:t>误差</w:t>
+            </w:r>
+          </w:p>
+        </w:tc>
+      </w:tr>
+    </w:tbl>
+    <w:p>
+      <w:pPr>
+        <w:bidi w:val="0"/>
+        <w:outlineLvl w:val="9"/>
+        <w:rPr>
+          <w:rFonts w:hint="eastAsia"/>
+          <w:lang w:val="en-US" w:eastAsia="zh-CN"/>
+        </w:rPr>
+      </w:pPr>
+    </w:p>
+    <w:tbl>
+      <w:tblPr>
+        <w:tblStyle w:val="8"/>
+        <w:tblW w:w="0" w:type="auto"/>
+        <w:tblInd w:w="0" w:type="dxa"/>
+        <w:tblBorders>
+          <w:top w:val="single" w:color="auto" w:sz="4" w:space="0"/>
+          <w:left w:val="single" w:color="auto" w:sz="4" w:space="0"/>
+          <w:bottom w:val="single" w:color="auto" w:sz="4" w:space="0"/>
+          <w:right w:val="single" w:color="auto" w:sz="4" w:space="0"/>
+          <w:insideH w:val="single" w:color="auto" w:sz="4" w:space="0"/>
+          <w:insideV w:val="single" w:color="auto" w:sz="4" w:space="0"/>
+        </w:tblBorders>
+        <w:tblLayout w:type="autofit"/>
+        <w:tblCellMar>
+          <w:top w:w="0" w:type="dxa"/>
+          <w:left w:w="108" w:type="dxa"/>
+          <w:bottom w:w="0" w:type="dxa"/>
+          <w:right w:w="108" w:type="dxa"/>
+        </w:tblCellMar>
+      </w:tblPr>
+      <w:tblGrid>
+        <w:gridCol w:w="1057"/>
+        <w:gridCol w:w="6384"/>
+        <w:gridCol w:w="1057"/>
+      </w:tblGrid>
+      <w:tr>
+        <w:tblPrEx>
+          <w:tblBorders>
+            <w:top w:val="single" w:color="auto" w:sz="4" w:space="0"/>
+            <w:left w:val="single" w:color="auto" w:sz="4" w:space="0"/>
+            <w:bottom w:val="single" w:color="auto" w:sz="4" w:space="0"/>
+            <w:right w:val="single" w:color="auto" w:sz="4" w:space="0"/>
+            <w:insideH w:val="single" w:color="auto" w:sz="4" w:space="0"/>
+            <w:insideV w:val="single" w:color="auto" w:sz="4" w:space="0"/>
+          </w:tblBorders>
+          <w:tblCellMar>
+            <w:top w:w="0" w:type="dxa"/>
+            <w:left w:w="108" w:type="dxa"/>
+            <w:bottom w:w="0" w:type="dxa"/>
+            <w:right w:w="108" w:type="dxa"/>
+          </w:tblCellMar>
+        </w:tblPrEx>
+        <w:trPr>
+          <w:trHeight w:val="90" w:hRule="atLeast"/>
+        </w:trPr>
+        <w:tc>
+          <w:tcPr>
+            <w:tcW w:w="0" w:type="auto"/>
+            <w:gridSpan w:val="2"/>
+            <w:vAlign w:val="center"/>
+          </w:tcPr>
+          <w:p>
+            <w:pPr>
+              <w:rPr>
+                <w:rFonts w:hint="default" w:eastAsia="华文中宋" w:cs="华文中宋"/>
+                <w:bCs/>
+                <w:color w:val="FF0000"/>
+                <w:spacing w:val="7"/>
+                <w:lang w:val="en-US" w:eastAsia="zh-CN"/>
+              </w:rPr>
+            </w:pPr>
+            <w:r>
+              <w:rPr>
+                <w:rFonts w:hint="eastAsia" w:cs="华文中宋"/>
+                <w:bCs/>
+                <w:color w:val="FF0000"/>
+                <w:spacing w:val="7"/>
+                <w:lang w:val="en-US" w:eastAsia="zh-CN"/>
+              </w:rPr>
+              <w:t>primitive_collision_cost.PrimitiveCollisionCost(config)</w:t>
+            </w:r>
+          </w:p>
+        </w:tc>
+        <w:tc>
+          <w:tcPr>
+            <w:tcW w:w="0" w:type="auto"/>
+            <w:vAlign w:val="center"/>
+          </w:tcPr>
+          <w:p>
+            <w:pPr>
+              <w:rPr>
+                <w:rFonts w:hint="eastAsia" w:eastAsia="华文中宋" w:cs="华文中宋"/>
+                <w:bCs/>
+                <w:color w:val="C0504D" w:themeColor="accent2"/>
+                <w:spacing w:val="7"/>
+                <w:lang w:eastAsia="zh-CN"/>
+                <w14:textFill>
+                  <w14:solidFill>
+                    <w14:schemeClr w14:val="accent2"/>
+                  </w14:solidFill>
+                </w14:textFill>
+              </w:rPr>
+            </w:pPr>
+          </w:p>
+        </w:tc>
+      </w:tr>
+      <w:tr>
+        <w:tblPrEx>
+          <w:tblBorders>
+            <w:top w:val="single" w:color="auto" w:sz="4" w:space="0"/>
+            <w:left w:val="single" w:color="auto" w:sz="4" w:space="0"/>
+            <w:bottom w:val="single" w:color="auto" w:sz="4" w:space="0"/>
+            <w:right w:val="single" w:color="auto" w:sz="4" w:space="0"/>
+            <w:insideH w:val="single" w:color="auto" w:sz="4" w:space="0"/>
+            <w:insideV w:val="single" w:color="auto" w:sz="4" w:space="0"/>
+          </w:tblBorders>
+          <w:tblCellMar>
+            <w:top w:w="0" w:type="dxa"/>
+            <w:left w:w="108" w:type="dxa"/>
+            <w:bottom w:w="0" w:type="dxa"/>
+            <w:right w:w="108" w:type="dxa"/>
+          </w:tblCellMar>
+        </w:tblPrEx>
+        <w:tc>
+          <w:tcPr>
+            <w:tcW w:w="0" w:type="auto"/>
+            <w:vAlign w:val="center"/>
+          </w:tcPr>
+          <w:p>
+            <w:pPr>
+              <w:rPr>
+                <w:rFonts w:hint="default" w:eastAsia="华文中宋" w:cs="华文中宋"/>
+                <w:bCs/>
+                <w:color w:val="FF0000"/>
+                <w:spacing w:val="7"/>
+                <w:lang w:val="en-US" w:eastAsia="zh-CN"/>
+              </w:rPr>
+            </w:pPr>
+            <w:r>
+              <w:rPr>
+                <w:rFonts w:hint="eastAsia"/>
+                <w:lang w:val="en-US" w:eastAsia="zh-CN"/>
+              </w:rPr>
+              <w:t>实例方法</w:t>
+            </w:r>
+          </w:p>
+        </w:tc>
+        <w:tc>
+          <w:tcPr>
+            <w:tcW w:w="0" w:type="auto"/>
+            <w:vAlign w:val="center"/>
+          </w:tcPr>
+          <w:p>
+            <w:pPr>
+              <w:rPr>
+                <w:rFonts w:hint="default" w:eastAsia="华文中宋" w:cs="华文中宋"/>
+                <w:bCs/>
+                <w:color w:val="FF0000"/>
+                <w:spacing w:val="7"/>
+                <w:lang w:val="en-US" w:eastAsia="zh-CN"/>
+              </w:rPr>
+            </w:pPr>
+            <w:r>
+              <w:rPr>
+                <w:rFonts w:hint="eastAsia" w:cs="华文中宋"/>
+                <w:bCs/>
+                <w:color w:val="FF0000"/>
+                <w:spacing w:val="7"/>
+                <w:lang w:val="en-US" w:eastAsia="zh-CN"/>
+              </w:rPr>
+              <w:t>sweep_fn / discrete_fn(robot_spheres_in, env_query_idx)</w:t>
+            </w:r>
+          </w:p>
+        </w:tc>
+        <w:tc>
+          <w:tcPr>
+            <w:tcW w:w="0" w:type="auto"/>
+            <w:vAlign w:val="center"/>
+          </w:tcPr>
+          <w:p>
+            <w:pPr>
+              <w:rPr>
+                <w:rFonts w:hint="default" w:eastAsia="华文中宋" w:cs="华文中宋"/>
+                <w:bCs/>
+                <w:color w:val="C0504D" w:themeColor="accent2"/>
+                <w:spacing w:val="7"/>
+                <w:lang w:val="en-US" w:eastAsia="zh-CN"/>
+                <w14:textFill>
+                  <w14:solidFill>
+                    <w14:schemeClr w14:val="accent2"/>
+                  </w14:solidFill>
+                </w14:textFill>
+              </w:rPr>
+            </w:pPr>
+            <w:r>
+              <w:rPr>
+                <w:rFonts w:hint="eastAsia" w:cs="华文中宋"/>
+                <w:bCs/>
+                <w:color w:val="EA82F1"/>
+                <w:szCs w:val="24"/>
+                <w:lang w:eastAsia="zh-CN"/>
+              </w:rPr>
+              <w:t>碰撞距离</w:t>
+            </w:r>
+          </w:p>
+        </w:tc>
+      </w:tr>
+    </w:tbl>
+    <w:p>
+      <w:pPr>
+        <w:bidi w:val="0"/>
+        <w:outlineLvl w:val="9"/>
+        <w:rPr>
+          <w:rFonts w:hint="eastAsia"/>
+          <w:lang w:val="en-US" w:eastAsia="zh-CN"/>
+        </w:rPr>
+      </w:pPr>
+    </w:p>
     <w:p>
       <w:pPr>
         <w:bidi w:val="0"/>
@@ -6884,14 +8315,6 @@
       </w:tr>
       <w:tr>
         <w:tblPrEx>
-          <w:tblBorders>
-            <w:top w:val="single" w:color="auto" w:sz="4" w:space="0"/>
-            <w:left w:val="single" w:color="auto" w:sz="4" w:space="0"/>
-            <w:bottom w:val="single" w:color="auto" w:sz="4" w:space="0"/>
-            <w:right w:val="single" w:color="auto" w:sz="4" w:space="0"/>
-            <w:insideH w:val="single" w:color="auto" w:sz="4" w:space="0"/>
-            <w:insideV w:val="single" w:color="auto" w:sz="4" w:space="0"/>
-          </w:tblBorders>
           <w:tblCellMar>
             <w:top w:w="0" w:type="dxa"/>
             <w:left w:w="108" w:type="dxa"/>
@@ -7356,7 +8779,6 @@
           <w:tcPr>
             <w:tcW w:w="0" w:type="auto"/>
             <w:vMerge w:val="continue"/>
-            <w:tcBorders/>
             <w:shd w:val="clear" w:color="auto" w:fill="auto"/>
             <w:vAlign w:val="center"/>
           </w:tcPr>
@@ -7457,7 +8879,6 @@
           <w:tcPr>
             <w:tcW w:w="0" w:type="auto"/>
             <w:vMerge w:val="continue"/>
-            <w:tcBorders/>
             <w:shd w:val="clear" w:color="auto" w:fill="auto"/>
             <w:vAlign w:val="center"/>
           </w:tcPr>
@@ -7558,7 +8979,6 @@
           <w:tcPr>
             <w:tcW w:w="0" w:type="auto"/>
             <w:vMerge w:val="continue"/>
-            <w:tcBorders/>
             <w:shd w:val="clear" w:color="auto" w:fill="auto"/>
             <w:vAlign w:val="center"/>
           </w:tcPr>
@@ -7645,7 +9065,6 @@
           <w:tcPr>
             <w:tcW w:w="0" w:type="auto"/>
             <w:vMerge w:val="continue"/>
-            <w:tcBorders/>
             <w:shd w:val="clear" w:color="auto" w:fill="auto"/>
             <w:vAlign w:val="center"/>
           </w:tcPr>
@@ -7728,7 +9147,6 @@
           <w:tcPr>
             <w:tcW w:w="0" w:type="auto"/>
             <w:vMerge w:val="continue"/>
-            <w:tcBorders/>
             <w:shd w:val="clear" w:color="auto" w:fill="auto"/>
             <w:vAlign w:val="center"/>
           </w:tcPr>
@@ -8105,16 +9523,7 @@
                 <w:rFonts w:hint="eastAsia"/>
                 <w:lang w:val="en-US" w:eastAsia="zh-CN"/>
               </w:rPr>
-              <w:t>add_geometry(name, geometry, material</w:t>
-            </w:r>
-            <w:bookmarkStart w:id="0" w:name="_GoBack"/>
-            <w:bookmarkEnd w:id="0"/>
-            <w:r>
-              <w:rPr>
-                <w:rFonts w:hint="eastAsia"/>
-                <w:lang w:val="en-US" w:eastAsia="zh-CN"/>
-              </w:rPr>
-              <w:t>) / remove_geometry(name)</w:t>
+              <w:t>add_geometry(name, geometry, material) / remove_geometry(name)</w:t>
             </w:r>
           </w:p>
         </w:tc>
@@ -8147,6 +9556,113 @@
                 <w:lang w:val="en-US" w:eastAsia="zh-CN"/>
               </w:rPr>
               <w:t>添加 / 移除</w:t>
+            </w:r>
+            <w:r>
+              <w:rPr>
+                <w:rFonts w:hint="eastAsia" w:cs="华文中宋"/>
+                <w:b/>
+                <w:bCs/>
+                <w:color w:val="ED7D31"/>
+                <w:kern w:val="2"/>
+                <w:sz w:val="21"/>
+                <w:szCs w:val="21"/>
+                <w:vertAlign w:val="baseline"/>
+                <w:lang w:val="en-US" w:eastAsia="zh-CN" w:bidi="ar-SA"/>
+              </w:rPr>
+              <w:t>几何</w:t>
+            </w:r>
+          </w:p>
+        </w:tc>
+      </w:tr>
+      <w:tr>
+        <w:tblPrEx>
+          <w:tblBorders>
+            <w:top w:val="single" w:color="auto" w:sz="4" w:space="0"/>
+            <w:left w:val="single" w:color="auto" w:sz="4" w:space="0"/>
+            <w:bottom w:val="single" w:color="auto" w:sz="4" w:space="0"/>
+            <w:right w:val="single" w:color="auto" w:sz="4" w:space="0"/>
+            <w:insideH w:val="single" w:color="auto" w:sz="4" w:space="0"/>
+            <w:insideV w:val="single" w:color="auto" w:sz="4" w:space="0"/>
+          </w:tblBorders>
+        </w:tblPrEx>
+        <w:tc>
+          <w:tcPr>
+            <w:tcW w:w="0" w:type="auto"/>
+            <w:vMerge w:val="continue"/>
+            <w:shd w:val="clear" w:color="auto" w:fill="auto"/>
+            <w:vAlign w:val="center"/>
+          </w:tcPr>
+          <w:p>
+            <w:pPr>
+              <w:bidi w:val="0"/>
+              <w:jc w:val="both"/>
+              <w:rPr>
+                <w:rFonts w:hint="eastAsia" w:ascii="华文中宋" w:hAnsi="华文中宋" w:eastAsia="华文中宋" w:cs="华文中宋"/>
+                <w:b/>
+                <w:bCs/>
+                <w:color w:val="ED7D31"/>
+                <w:kern w:val="2"/>
+                <w:sz w:val="21"/>
+                <w:szCs w:val="21"/>
+                <w:lang w:val="en-US" w:eastAsia="zh-CN" w:bidi="ar-SA"/>
+              </w:rPr>
+            </w:pPr>
+          </w:p>
+        </w:tc>
+        <w:tc>
+          <w:tcPr>
+            <w:tcW w:w="0" w:type="auto"/>
+            <w:shd w:val="clear" w:color="auto" w:fill="auto"/>
+            <w:vAlign w:val="center"/>
+          </w:tcPr>
+          <w:p>
+            <w:pPr>
+              <w:pStyle w:val="12"/>
+              <w:bidi w:val="0"/>
+              <w:jc w:val="both"/>
+              <w:rPr>
+                <w:rFonts w:hint="default"/>
+                <w:lang w:val="en-US" w:eastAsia="zh-CN"/>
+              </w:rPr>
+            </w:pPr>
+            <w:r>
+              <w:rPr>
+                <w:rFonts w:hint="eastAsia"/>
+                <w:lang w:val="en-US" w:eastAsia="zh-CN"/>
+              </w:rPr>
+              <w:t>clear_gemotry()</w:t>
+            </w:r>
+          </w:p>
+        </w:tc>
+        <w:tc>
+          <w:tcPr>
+            <w:tcW w:w="0" w:type="auto"/>
+            <w:shd w:val="clear" w:color="auto" w:fill="auto"/>
+            <w:vAlign w:val="center"/>
+          </w:tcPr>
+          <w:p>
+            <w:pPr>
+              <w:pStyle w:val="11"/>
+              <w:bidi w:val="0"/>
+              <w:jc w:val="both"/>
+              <w:rPr>
+                <w:rFonts w:hint="default" w:ascii="华文中宋" w:hAnsi="华文中宋" w:eastAsia="华文中宋" w:cs="华文中宋"/>
+                <w:b/>
+                <w:bCs/>
+                <w:color w:val="ED7D31"/>
+                <w:kern w:val="2"/>
+                <w:sz w:val="21"/>
+                <w:szCs w:val="21"/>
+                <w:vertAlign w:val="baseline"/>
+                <w:lang w:val="en-US" w:eastAsia="zh-CN" w:bidi="ar-SA"/>
+              </w:rPr>
+            </w:pPr>
+            <w:r>
+              <w:rPr>
+                <w:rFonts w:hint="eastAsia"/>
+                <w:lang w:val="en-US" w:eastAsia="zh-CN"/>
+              </w:rPr>
+              <w:t>清空</w:t>
             </w:r>
             <w:r>
               <w:rPr>
@@ -8186,7 +9702,6 @@
           <w:tcPr>
             <w:tcW w:w="0" w:type="auto"/>
             <w:vMerge w:val="continue"/>
-            <w:tcBorders/>
             <w:shd w:val="clear" w:color="auto" w:fill="auto"/>
             <w:vAlign w:val="center"/>
           </w:tcPr>
@@ -8228,7 +9743,7 @@
                 <w:rFonts w:hint="eastAsia"/>
                 <w:lang w:val="en-US" w:eastAsia="zh-CN"/>
               </w:rPr>
-              <w:t>clear_gemotry()</w:t>
+              <w:t>geometry_is_visible(name)</w:t>
             </w:r>
           </w:p>
         </w:tc>
@@ -8244,7 +9759,13 @@
               <w:bidi w:val="0"/>
               <w:jc w:val="both"/>
               <w:rPr>
-                <w:rFonts w:hint="default" w:ascii="华文中宋" w:hAnsi="华文中宋" w:eastAsia="华文中宋" w:cs="华文中宋"/>
+                <w:rFonts w:hint="eastAsia"/>
+                <w:lang w:val="en-US" w:eastAsia="zh-CN"/>
+              </w:rPr>
+            </w:pPr>
+            <w:r>
+              <w:rPr>
+                <w:rFonts w:hint="eastAsia" w:cs="华文中宋"/>
                 <w:b/>
                 <w:bCs/>
                 <w:color w:val="ED7D31"/>
@@ -8254,27 +9775,14 @@
                 <w:vertAlign w:val="baseline"/>
                 <w:lang w:val="en-US" w:eastAsia="zh-CN" w:bidi="ar-SA"/>
               </w:rPr>
-            </w:pPr>
-            <w:r>
-              <w:rPr>
-                <w:rFonts w:hint="eastAsia"/>
-                <w:lang w:val="en-US" w:eastAsia="zh-CN"/>
-              </w:rPr>
-              <w:t>清空</w:t>
-            </w:r>
-            <w:r>
-              <w:rPr>
-                <w:rFonts w:hint="eastAsia" w:cs="华文中宋"/>
-                <w:b/>
-                <w:bCs/>
-                <w:color w:val="ED7D31"/>
-                <w:kern w:val="2"/>
-                <w:sz w:val="21"/>
-                <w:szCs w:val="21"/>
-                <w:vertAlign w:val="baseline"/>
-                <w:lang w:val="en-US" w:eastAsia="zh-CN" w:bidi="ar-SA"/>
-              </w:rPr>
               <w:t>几何</w:t>
+            </w:r>
+            <w:r>
+              <w:rPr>
+                <w:rFonts w:hint="eastAsia"/>
+                <w:lang w:val="en-US" w:eastAsia="zh-CN"/>
+              </w:rPr>
+              <w:t>能见度</w:t>
             </w:r>
           </w:p>
         </w:tc>
@@ -8300,114 +9808,6 @@
           <w:tcPr>
             <w:tcW w:w="0" w:type="auto"/>
             <w:vMerge w:val="continue"/>
-            <w:tcBorders/>
-            <w:shd w:val="clear" w:color="auto" w:fill="auto"/>
-            <w:vAlign w:val="center"/>
-          </w:tcPr>
-          <w:p>
-            <w:pPr>
-              <w:bidi w:val="0"/>
-              <w:jc w:val="both"/>
-              <w:rPr>
-                <w:rFonts w:hint="eastAsia" w:ascii="华文中宋" w:hAnsi="华文中宋" w:eastAsia="华文中宋" w:cs="华文中宋"/>
-                <w:b/>
-                <w:bCs/>
-                <w:color w:val="ED7D31"/>
-                <w:kern w:val="2"/>
-                <w:sz w:val="21"/>
-                <w:szCs w:val="21"/>
-                <w:lang w:val="en-US" w:eastAsia="zh-CN" w:bidi="ar-SA"/>
-              </w:rPr>
-            </w:pPr>
-          </w:p>
-        </w:tc>
-        <w:tc>
-          <w:tcPr>
-            <w:tcW w:w="0" w:type="auto"/>
-            <w:shd w:val="clear" w:color="auto" w:fill="auto"/>
-            <w:vAlign w:val="center"/>
-          </w:tcPr>
-          <w:p>
-            <w:pPr>
-              <w:pStyle w:val="12"/>
-              <w:bidi w:val="0"/>
-              <w:jc w:val="both"/>
-              <w:rPr>
-                <w:rFonts w:hint="default"/>
-                <w:lang w:val="en-US" w:eastAsia="zh-CN"/>
-              </w:rPr>
-            </w:pPr>
-            <w:r>
-              <w:rPr>
-                <w:rFonts w:hint="eastAsia"/>
-                <w:lang w:val="en-US" w:eastAsia="zh-CN"/>
-              </w:rPr>
-              <w:t>geometry_is_visible(name)</w:t>
-            </w:r>
-          </w:p>
-        </w:tc>
-        <w:tc>
-          <w:tcPr>
-            <w:tcW w:w="0" w:type="auto"/>
-            <w:shd w:val="clear" w:color="auto" w:fill="auto"/>
-            <w:vAlign w:val="center"/>
-          </w:tcPr>
-          <w:p>
-            <w:pPr>
-              <w:pStyle w:val="11"/>
-              <w:bidi w:val="0"/>
-              <w:jc w:val="both"/>
-              <w:rPr>
-                <w:rFonts w:hint="eastAsia"/>
-                <w:lang w:val="en-US" w:eastAsia="zh-CN"/>
-              </w:rPr>
-            </w:pPr>
-            <w:r>
-              <w:rPr>
-                <w:rFonts w:hint="eastAsia" w:cs="华文中宋"/>
-                <w:b/>
-                <w:bCs/>
-                <w:color w:val="ED7D31"/>
-                <w:kern w:val="2"/>
-                <w:sz w:val="21"/>
-                <w:szCs w:val="21"/>
-                <w:vertAlign w:val="baseline"/>
-                <w:lang w:val="en-US" w:eastAsia="zh-CN" w:bidi="ar-SA"/>
-              </w:rPr>
-              <w:t>几何</w:t>
-            </w:r>
-            <w:r>
-              <w:rPr>
-                <w:rFonts w:hint="eastAsia"/>
-                <w:lang w:val="en-US" w:eastAsia="zh-CN"/>
-              </w:rPr>
-              <w:t>能见度</w:t>
-            </w:r>
-          </w:p>
-        </w:tc>
-      </w:tr>
-      <w:tr>
-        <w:tblPrEx>
-          <w:tblBorders>
-            <w:top w:val="single" w:color="auto" w:sz="4" w:space="0"/>
-            <w:left w:val="single" w:color="auto" w:sz="4" w:space="0"/>
-            <w:bottom w:val="single" w:color="auto" w:sz="4" w:space="0"/>
-            <w:right w:val="single" w:color="auto" w:sz="4" w:space="0"/>
-            <w:insideH w:val="single" w:color="auto" w:sz="4" w:space="0"/>
-            <w:insideV w:val="single" w:color="auto" w:sz="4" w:space="0"/>
-          </w:tblBorders>
-          <w:tblCellMar>
-            <w:top w:w="0" w:type="dxa"/>
-            <w:left w:w="108" w:type="dxa"/>
-            <w:bottom w:w="0" w:type="dxa"/>
-            <w:right w:w="108" w:type="dxa"/>
-          </w:tblCellMar>
-        </w:tblPrEx>
-        <w:tc>
-          <w:tcPr>
-            <w:tcW w:w="0" w:type="auto"/>
-            <w:vMerge w:val="continue"/>
-            <w:tcBorders/>
             <w:shd w:val="clear" w:color="auto" w:fill="auto"/>
             <w:vAlign w:val="center"/>
           </w:tcPr>

</xml_diff>

<commit_message>
update on 2025-11-07 23:45:24.350857
</commit_message>
<xml_diff>
--- a/py 空间几何.docx
+++ b/py 空间几何.docx
@@ -2214,7 +2214,6 @@
           <w:tcPr>
             <w:tcW w:w="0" w:type="auto"/>
             <w:vMerge w:val="continue"/>
-            <w:tcBorders/>
             <w:vAlign w:val="center"/>
           </w:tcPr>
           <w:p>
@@ -2310,7 +2309,6 @@
           <w:tcPr>
             <w:tcW w:w="0" w:type="auto"/>
             <w:vMerge w:val="continue"/>
-            <w:tcBorders/>
             <w:vAlign w:val="center"/>
           </w:tcPr>
           <w:p>
@@ -8315,6 +8313,14 @@
       </w:tr>
       <w:tr>
         <w:tblPrEx>
+          <w:tblBorders>
+            <w:top w:val="single" w:color="auto" w:sz="4" w:space="0"/>
+            <w:left w:val="single" w:color="auto" w:sz="4" w:space="0"/>
+            <w:bottom w:val="single" w:color="auto" w:sz="4" w:space="0"/>
+            <w:right w:val="single" w:color="auto" w:sz="4" w:space="0"/>
+            <w:insideH w:val="single" w:color="auto" w:sz="4" w:space="0"/>
+            <w:insideV w:val="single" w:color="auto" w:sz="4" w:space="0"/>
+          </w:tblBorders>
           <w:tblCellMar>
             <w:top w:w="0" w:type="dxa"/>
             <w:left w:w="108" w:type="dxa"/>
@@ -10350,6 +10356,73 @@
         </w:tc>
       </w:tr>
     </w:tbl>
+    <w:p>
+      <w:pPr>
+        <w:rPr>
+          <w:rFonts w:hint="default" w:ascii="华文中宋" w:hAnsi="华文中宋" w:eastAsia="华文中宋" w:cs="华文中宋"/>
+          <w:b/>
+          <w:bCs/>
+          <w:color w:val="FF0000"/>
+          <w:kern w:val="2"/>
+          <w:sz w:val="21"/>
+          <w:szCs w:val="21"/>
+          <w:lang w:val="en-US" w:eastAsia="zh-CN" w:bidi="ar-SA"/>
+        </w:rPr>
+      </w:pPr>
+    </w:p>
+    <w:p>
+      <w:pPr>
+        <w:rPr>
+          <w:rFonts w:hint="default" w:ascii="华文中宋" w:hAnsi="华文中宋" w:eastAsia="华文中宋" w:cs="华文中宋"/>
+          <w:b/>
+          <w:bCs/>
+          <w:color w:val="FF0000"/>
+          <w:kern w:val="2"/>
+          <w:sz w:val="21"/>
+          <w:szCs w:val="21"/>
+          <w:lang w:val="en-US" w:eastAsia="zh-CN" w:bidi="ar-SA"/>
+        </w:rPr>
+      </w:pPr>
+    </w:p>
+    <w:p>
+      <w:pPr>
+        <w:rPr>
+          <w:rFonts w:hint="default" w:ascii="华文中宋" w:hAnsi="华文中宋" w:eastAsia="华文中宋" w:cs="华文中宋"/>
+          <w:b/>
+          <w:bCs/>
+          <w:color w:val="FF0000"/>
+          <w:kern w:val="2"/>
+          <w:sz w:val="21"/>
+          <w:szCs w:val="21"/>
+          <w:lang w:val="en-US" w:eastAsia="zh-CN" w:bidi="ar-SA"/>
+        </w:rPr>
+      </w:pPr>
+    </w:p>
+    <w:p>
+      <w:pPr>
+        <w:pStyle w:val="2"/>
+        <w:bidi w:val="0"/>
+        <w:rPr>
+          <w:rFonts w:hint="default" w:ascii="华文中宋" w:hAnsi="华文中宋" w:eastAsia="华文中宋" w:cs="华文中宋"/>
+          <w:b/>
+          <w:bCs/>
+          <w:color w:val="FF0000"/>
+          <w:kern w:val="2"/>
+          <w:sz w:val="21"/>
+          <w:szCs w:val="21"/>
+          <w:lang w:val="en-US" w:eastAsia="zh-CN" w:bidi="ar-SA"/>
+        </w:rPr>
+      </w:pPr>
+      <w:r>
+        <w:rPr>
+          <w:rFonts w:hint="eastAsia"/>
+          <w:lang w:val="en-US" w:eastAsia="zh-CN"/>
+        </w:rPr>
+        <w:t>仿真pybullet：</w:t>
+      </w:r>
+      <w:bookmarkStart w:id="0" w:name="_GoBack"/>
+      <w:bookmarkEnd w:id="0"/>
+    </w:p>
     <w:p>
       <w:pPr>
         <w:rPr>

</xml_diff>